<commit_message>
Word proposal: justified + Hebrew RTL
Co-Authored-By: Claude Opus 4.8 <noreply@anthropic.com>
</commit_message>
<xml_diff>
--- a/JouleFlex-proposal-2026-09-06.docx
+++ b/JouleFlex-proposal-2026-09-06.docx
@@ -29,7 +29,7 @@
       <w:pPr>
         <w:pStyle w:val="FirstParagraph"/>
         <w:bidi/>
-        <w:jc w:val="right"/>
+        <w:jc w:val="both"/>
       </w:pPr>
       <w:r>
         <w:rPr>
@@ -52,7 +52,7 @@
       <w:pPr>
         <w:pStyle w:val="FirstParagraph"/>
         <w:bidi/>
-        <w:jc w:val="right"/>
+        <w:jc w:val="both"/>
       </w:pPr>
       <w:r>
         <w:rPr>
@@ -65,7 +65,7 @@
       <w:pPr>
         <w:pStyle w:val="BodyText"/>
         <w:bidi/>
-        <w:jc w:val="right"/>
+        <w:jc w:val="both"/>
       </w:pPr>
       <w:r>
         <w:rPr>
@@ -141,6 +141,7 @@
     <w:p>
       <w:pPr>
         <w:pStyle w:val="FirstParagraph"/>
+        <w:jc w:val="both"/>
       </w:pPr>
       <w:r>
         <w:t xml:space="preserve">In July 2026 Israel's Electricity Authority froze new data-center connection requests after the queue reached 27,000 megawatts. Under electricity limits, data centers switch GPUs (AI processors) off or cap their power, deciding in watts (the momentary draw), not joules (the energy consumed). A capped GPU computes slower and pays its fixed power floor longer, so energy per unit of useful work can rise even as the meter shows fewer watts: less AI per kilowatt-hour. A similar challenge exists in aviation, where it is solved: fuel flow rises far faster than speed, yet slow flight burns fuel longer, so airlines cruise at the speed minimizing fuel per kilometer.</w:t>
@@ -149,6 +150,7 @@
     <w:p>
       <w:pPr>
         <w:pStyle w:val="BodyText"/>
+        <w:jc w:val="both"/>
       </w:pPr>
       <w:r>
         <w:t xml:space="preserve">The PI's recent study [1] measured the time-power tradeoff for AI workloads (5,500 measurements, 20 models, four GPUs). Energy per task is U-shaped in the power cap. On the large GPUs its minimum, the Joule Point (JP), sits at 43 to 46 percent of rated power; holding a card there cut energy per task 29 to 31 percent while running 1.2 times slower. Even under a strict deadline, capping saved 28 percent of energy while keeping 95 percent of workload value. A fleet simulation on the measured curves (only scheduling simulated) served equal work with 18 to 45 percent less energy.</w:t>
@@ -157,6 +159,7 @@
     <w:p>
       <w:pPr>
         <w:pStyle w:val="BodyText"/>
+        <w:jc w:val="both"/>
       </w:pPr>
       <w:r>
         <w:t xml:space="preserve">These insights change how AI data centers are planned, managed, and priced, raising decisions no current tool supports: how to design a flexible-connection-ready fleet whose cards run near their JP; how to measure and predict the JP for new cards and jobs; and how to price service to motivate customers toward efficiency, not per-hour billing rewarding the energy-worst point.</w:t>
@@ -187,7 +190,7 @@
       <w:pPr>
         <w:pStyle w:val="FirstParagraph"/>
         <w:bidi/>
-        <w:jc w:val="right"/>
+        <w:jc w:val="both"/>
       </w:pPr>
       <w:r>
         <w:rPr>
@@ -200,7 +203,7 @@
       <w:pPr>
         <w:pStyle w:val="BodyText"/>
         <w:bidi/>
-        <w:jc w:val="right"/>
+        <w:jc w:val="both"/>
       </w:pPr>
       <w:r>
         <w:rPr>
@@ -213,7 +216,7 @@
       <w:pPr>
         <w:pStyle w:val="BodyText"/>
         <w:bidi/>
-        <w:jc w:val="right"/>
+        <w:jc w:val="both"/>
       </w:pPr>
       <w:r>
         <w:rPr>
@@ -252,7 +255,7 @@
           <w:p>
             <w:pPr>
               <w:pStyle w:val="Compact"/>
-              <w:jc w:val="left"/>
+              <w:jc w:val="both"/>
             </w:pPr>
             <w:r>
               <w:t xml:space="preserve">Term</w:t>
@@ -264,7 +267,7 @@
           <w:p>
             <w:pPr>
               <w:pStyle w:val="Compact"/>
-              <w:jc w:val="left"/>
+              <w:jc w:val="both"/>
             </w:pPr>
             <w:r>
               <w:t xml:space="preserve">Meaning</w:t>
@@ -278,7 +281,7 @@
           <w:p>
             <w:pPr>
               <w:pStyle w:val="Compact"/>
-              <w:jc w:val="left"/>
+              <w:jc w:val="both"/>
             </w:pPr>
             <w:r>
               <w:t xml:space="preserve">Power</w:t>
@@ -290,7 +293,7 @@
           <w:p>
             <w:pPr>
               <w:pStyle w:val="Compact"/>
-              <w:jc w:val="left"/>
+              <w:jc w:val="both"/>
             </w:pPr>
             <w:r>
               <w:t xml:space="preserve">How fast electricity is drawn at a given moment; watts (W) or megawatts (MW). The grid connection is sized by peak power.</w:t>
@@ -304,7 +307,7 @@
           <w:p>
             <w:pPr>
               <w:pStyle w:val="Compact"/>
-              <w:jc w:val="left"/>
+              <w:jc w:val="both"/>
             </w:pPr>
             <w:r>
               <w:t xml:space="preserve">Energy</w:t>
@@ -316,7 +319,7 @@
           <w:p>
             <w:pPr>
               <w:pStyle w:val="Compact"/>
-              <w:jc w:val="left"/>
+              <w:jc w:val="both"/>
             </w:pPr>
             <w:r>
               <w:t xml:space="preserve">The total electricity consumed: power × time; joules or kilowatt-hours. The bill and the carbon footprint are set by energy.</w:t>
@@ -330,7 +333,7 @@
           <w:p>
             <w:pPr>
               <w:pStyle w:val="Compact"/>
-              <w:jc w:val="left"/>
+              <w:jc w:val="both"/>
             </w:pPr>
             <w:r>
               <w:t xml:space="preserve">Power cap</w:t>
@@ -342,7 +345,7 @@
           <w:p>
             <w:pPr>
               <w:pStyle w:val="Compact"/>
-              <w:jc w:val="left"/>
+              <w:jc w:val="both"/>
             </w:pPr>
             <w:r>
               <w:t xml:space="preserve">A software limit on a GPU's power draw. Set with one command; takes effect in ~0.2 seconds. The control knob of this project.</w:t>
@@ -356,7 +359,7 @@
           <w:p>
             <w:pPr>
               <w:pStyle w:val="Compact"/>
-              <w:jc w:val="left"/>
+              <w:jc w:val="both"/>
             </w:pPr>
             <w:r>
               <w:t xml:space="preserve">TDP</w:t>
@@ -368,7 +371,7 @@
           <w:p>
             <w:pPr>
               <w:pStyle w:val="Compact"/>
-              <w:jc w:val="left"/>
+              <w:jc w:val="both"/>
             </w:pPr>
             <w:r>
               <w:t xml:space="preserve">A GPU's full rated power. Running at TDP is today's default.</w:t>
@@ -382,7 +385,7 @@
           <w:p>
             <w:pPr>
               <w:pStyle w:val="Compact"/>
-              <w:jc w:val="left"/>
+              <w:jc w:val="both"/>
             </w:pPr>
             <w:r>
               <w:t xml:space="preserve">Joule Point (JP)</w:t>
@@ -394,7 +397,7 @@
           <w:p>
             <w:pPr>
               <w:pStyle w:val="Compact"/>
-              <w:jc w:val="left"/>
+              <w:jc w:val="both"/>
             </w:pPr>
             <w:r>
               <w:t xml:space="preserve">The power cap at which energy per task is lowest for a given card; measured at 43–46% of TDP on large GPUs.</w:t>
@@ -408,7 +411,7 @@
           <w:p>
             <w:pPr>
               <w:pStyle w:val="Compact"/>
-              <w:jc w:val="left"/>
+              <w:jc w:val="both"/>
             </w:pPr>
             <w:r>
               <w:t xml:space="preserve">Operating point</w:t>
@@ -420,7 +423,7 @@
           <w:p>
             <w:pPr>
               <w:pStyle w:val="Compact"/>
-              <w:jc w:val="left"/>
+              <w:jc w:val="both"/>
             </w:pPr>
             <w:r>
               <w:t xml:space="preserve">The pair (GPU, power cap) a job runs at.</w:t>
@@ -434,7 +437,7 @@
           <w:p>
             <w:pPr>
               <w:pStyle w:val="Compact"/>
-              <w:jc w:val="left"/>
+              <w:jc w:val="both"/>
             </w:pPr>
             <w:r>
               <w:t xml:space="preserve">Power envelope</w:t>
@@ -446,7 +449,7 @@
           <w:p>
             <w:pPr>
               <w:pStyle w:val="Compact"/>
-              <w:jc w:val="left"/>
+              <w:jc w:val="both"/>
             </w:pPr>
             <w:r>
               <w:t xml:space="preserve">A limit on a facility's total power draw that can change over time, set by a budget, a price or carbon signal, or a grid instruction.</w:t>
@@ -460,7 +463,7 @@
           <w:p>
             <w:pPr>
               <w:pStyle w:val="Compact"/>
-              <w:jc w:val="left"/>
+              <w:jc w:val="both"/>
             </w:pPr>
             <w:r>
               <w:t xml:space="preserve">Power shaping</w:t>
@@ -472,7 +475,7 @@
           <w:p>
             <w:pPr>
               <w:pStyle w:val="Compact"/>
-              <w:jc w:val="left"/>
+              <w:jc w:val="both"/>
             </w:pPr>
             <w:r>
               <w:t xml:space="preserve">Keeping a fleet inside a power envelope by capping jobs, like traffic shaping in networks.</w:t>
@@ -486,7 +489,7 @@
           <w:p>
             <w:pPr>
               <w:pStyle w:val="Compact"/>
-              <w:jc w:val="left"/>
+              <w:jc w:val="both"/>
             </w:pPr>
             <w:r>
               <w:t xml:space="preserve">ELF</w:t>
@@ -498,7 +501,7 @@
           <w:p>
             <w:pPr>
               <w:pStyle w:val="Compact"/>
-              <w:jc w:val="left"/>
+              <w:jc w:val="both"/>
             </w:pPr>
             <w:r>
               <w:t xml:space="preserve">Our released dataset: dense power-cap sweeps of 20 AI models on 4 GPUs, ~5,500 measured rows.</w:t>
@@ -512,7 +515,7 @@
           <w:p>
             <w:pPr>
               <w:pStyle w:val="Compact"/>
-              <w:jc w:val="left"/>
+              <w:jc w:val="both"/>
             </w:pPr>
             <w:r>
               <w:t xml:space="preserve">SLO</w:t>
@@ -524,7 +527,7 @@
           <w:p>
             <w:pPr>
               <w:pStyle w:val="Compact"/>
-              <w:jc w:val="left"/>
+              <w:jc w:val="both"/>
             </w:pPr>
             <w:r>
               <w:t xml:space="preserve">Service level objective: the deadline or latency a job must meet.</w:t>
@@ -538,7 +541,7 @@
           <w:p>
             <w:pPr>
               <w:pStyle w:val="Compact"/>
-              <w:jc w:val="left"/>
+              <w:jc w:val="both"/>
             </w:pPr>
             <w:r>
               <w:t xml:space="preserve">Firm / flexible capacity</w:t>
@@ -550,7 +553,7 @@
           <w:p>
             <w:pPr>
               <w:pStyle w:val="Compact"/>
-              <w:jc w:val="left"/>
+              <w:jc w:val="both"/>
             </w:pPr>
             <w:r>
               <w:t xml:space="preserve">Grid connection capacity guaranteed at all times, versus capacity given on condition that the facility reduces power when instructed.</w:t>
@@ -564,7 +567,7 @@
           <w:p>
             <w:pPr>
               <w:pStyle w:val="Compact"/>
-              <w:jc w:val="left"/>
+              <w:jc w:val="both"/>
             </w:pPr>
             <w:r>
               <w:t xml:space="preserve">Card multiplier</w:t>
@@ -576,7 +579,7 @@
           <w:p>
             <w:pPr>
               <w:pStyle w:val="Compact"/>
-              <w:jc w:val="left"/>
+              <w:jc w:val="both"/>
             </w:pPr>
             <w:r>
               <w:t xml:space="preserve">The extra cards needed to keep total throughput when capping. It equals the latency ratio (~1.2×).</w:t>
@@ -607,6 +610,7 @@
     <w:p>
       <w:pPr>
         <w:pStyle w:val="FirstParagraph"/>
+        <w:jc w:val="both"/>
       </w:pPr>
       <w:r>
         <w:t xml:space="preserve">The objective is to construct</w:t>
@@ -704,6 +708,7 @@
     <w:p>
       <w:pPr>
         <w:pStyle w:val="FirstParagraph"/>
+        <w:jc w:val="both"/>
       </w:pPr>
       <w:r>
         <w:t xml:space="preserve">Can AI data centers operate as controllable electrical loads, each GPU near its energy-optimal cap and the facility</w:t>
@@ -724,6 +729,7 @@
     <w:p>
       <w:pPr>
         <w:pStyle w:val="BodyText"/>
+        <w:jc w:val="both"/>
       </w:pPr>
       <w:r>
         <w:t xml:space="preserve">Six sub-questions structure the work plan:</w:t>
@@ -736,6 +742,7 @@
           <w:ilvl w:val="0"/>
           <w:numId w:val="1001"/>
         </w:numPr>
+        <w:jc w:val="both"/>
       </w:pPr>
       <w:r>
         <w:rPr>
@@ -758,6 +765,7 @@
           <w:ilvl w:val="0"/>
           <w:numId w:val="1001"/>
         </w:numPr>
+        <w:jc w:val="both"/>
       </w:pPr>
       <w:r>
         <w:rPr>
@@ -780,6 +788,7 @@
           <w:ilvl w:val="0"/>
           <w:numId w:val="1001"/>
         </w:numPr>
+        <w:jc w:val="both"/>
       </w:pPr>
       <w:r>
         <w:rPr>
@@ -802,6 +811,7 @@
           <w:ilvl w:val="0"/>
           <w:numId w:val="1001"/>
         </w:numPr>
+        <w:jc w:val="both"/>
       </w:pPr>
       <w:r>
         <w:rPr>
@@ -824,6 +834,7 @@
           <w:ilvl w:val="0"/>
           <w:numId w:val="1001"/>
         </w:numPr>
+        <w:jc w:val="both"/>
       </w:pPr>
       <w:r>
         <w:rPr>
@@ -846,6 +857,7 @@
           <w:ilvl w:val="0"/>
           <w:numId w:val="1001"/>
         </w:numPr>
+        <w:jc w:val="both"/>
       </w:pPr>
       <w:r>
         <w:rPr>
@@ -884,6 +896,7 @@
     <w:p>
       <w:pPr>
         <w:pStyle w:val="FirstParagraph"/>
+        <w:jc w:val="both"/>
       </w:pPr>
       <w:r>
         <w:rPr>
@@ -914,6 +927,7 @@
     <w:p>
       <w:pPr>
         <w:pStyle w:val="BodyText"/>
+        <w:jc w:val="both"/>
       </w:pPr>
       <w:r>
         <w:rPr>
@@ -932,6 +946,7 @@
     <w:p>
       <w:pPr>
         <w:pStyle w:val="BodyText"/>
+        <w:jc w:val="both"/>
       </w:pPr>
       <w:r>
         <w:rPr>
@@ -962,6 +977,7 @@
     <w:p>
       <w:pPr>
         <w:pStyle w:val="BodyText"/>
+        <w:jc w:val="both"/>
       </w:pPr>
       <w:r>
         <w:t xml:space="preserve">P(θ) = P₀ + a·θ^β,   median R² = 0.99,</w:t>
@@ -970,6 +986,7 @@
     <w:p>
       <w:pPr>
         <w:pStyle w:val="BodyText"/>
+        <w:jc w:val="both"/>
       </w:pPr>
       <w:r>
         <w:t xml:space="preserve">a fixed floor P₀ plus a superlinear term. Energy per task, E = P/θ, is therefore U-shaped in the cap; its minimum, the</w:t>
@@ -1007,6 +1024,7 @@
     <w:p>
       <w:pPr>
         <w:pStyle w:val="FirstParagraph"/>
+        <w:jc w:val="both"/>
       </w:pPr>
       <w:r>
         <w:t xml:space="preserve">Four research lines meet here.</w:t>
@@ -1135,6 +1153,7 @@
           <w:ilvl w:val="0"/>
           <w:numId w:val="1002"/>
         </w:numPr>
+        <w:jc w:val="both"/>
       </w:pPr>
       <w:r>
         <w:rPr>
@@ -1157,6 +1176,7 @@
           <w:ilvl w:val="0"/>
           <w:numId w:val="1002"/>
         </w:numPr>
+        <w:jc w:val="both"/>
       </w:pPr>
       <w:r>
         <w:rPr>
@@ -1179,6 +1199,7 @@
           <w:ilvl w:val="0"/>
           <w:numId w:val="1002"/>
         </w:numPr>
+        <w:jc w:val="both"/>
       </w:pPr>
       <w:r>
         <w:rPr>
@@ -1201,6 +1222,7 @@
           <w:ilvl w:val="0"/>
           <w:numId w:val="1002"/>
         </w:numPr>
+        <w:jc w:val="both"/>
       </w:pPr>
       <w:r>
         <w:rPr>
@@ -1223,6 +1245,7 @@
           <w:ilvl w:val="0"/>
           <w:numId w:val="1002"/>
         </w:numPr>
+        <w:jc w:val="both"/>
       </w:pPr>
       <w:r>
         <w:rPr>
@@ -1245,6 +1268,7 @@
           <w:ilvl w:val="0"/>
           <w:numId w:val="1002"/>
         </w:numPr>
+        <w:jc w:val="both"/>
       </w:pPr>
       <w:r>
         <w:rPr>
@@ -1273,6 +1297,7 @@
     <w:p>
       <w:pPr>
         <w:pStyle w:val="FirstParagraph"/>
+        <w:jc w:val="both"/>
       </w:pPr>
       <w:r>
         <w:t xml:space="preserve">JouleFlex builds one measured foundation and three tools on it: first work out the energy-optimal way to run each job on each card, then control power to achieve it.</w:t>
@@ -1347,7 +1372,7 @@
           <w:p>
             <w:pPr>
               <w:pStyle w:val="Compact"/>
-              <w:jc w:val="left"/>
+              <w:jc w:val="both"/>
             </w:pPr>
             <w:r>
               <w:t xml:space="preserve">WP</w:t>
@@ -1359,7 +1384,7 @@
           <w:p>
             <w:pPr>
               <w:pStyle w:val="Compact"/>
-              <w:jc w:val="left"/>
+              <w:jc w:val="both"/>
             </w:pPr>
             <w:r>
               <w:t xml:space="preserve">Objective</w:t>
@@ -1371,7 +1396,7 @@
           <w:p>
             <w:pPr>
               <w:pStyle w:val="Compact"/>
-              <w:jc w:val="left"/>
+              <w:jc w:val="both"/>
             </w:pPr>
             <w:r>
               <w:t xml:space="preserve">Approach and output</w:t>
@@ -1385,7 +1410,7 @@
           <w:p>
             <w:pPr>
               <w:pStyle w:val="Compact"/>
-              <w:jc w:val="left"/>
+              <w:jc w:val="both"/>
             </w:pPr>
             <w:r>
               <w:rPr>
@@ -1401,7 +1426,7 @@
           <w:p>
             <w:pPr>
               <w:pStyle w:val="Compact"/>
-              <w:jc w:val="left"/>
+              <w:jc w:val="both"/>
             </w:pPr>
             <w:r>
               <w:t xml:space="preserve">Extend the energy-versus-power measurements to current GPUs, production software, and whole-server power.</w:t>
@@ -1413,7 +1438,7 @@
           <w:p>
             <w:pPr>
               <w:pStyle w:val="Compact"/>
-              <w:jc w:val="left"/>
+              <w:jc w:val="both"/>
             </w:pPr>
             <w:r>
               <w:t xml:space="preserve">Re-run the study's measurement sweep on new GPUs (H100/L40S class) and production serving engines (vLLM [16], TensorRT-LLM), reading power at three rented tiers: the GPU board (NVML), the host CPU domain (RAPL), and the server's power-supply input, the wall tier (BMC, read out-of-band via IPMI/Redfish). Accuracy is taken from vendor specifications and cross-checked across tiers; the JP is where the slope of P(θ) is zero, so a constant meter bias cancels in its location: the JP and per-card savings are calibration-robust, while absolute board-to-wall and megawatt figures carry that caveat.</w:t>
@@ -1443,7 +1468,7 @@
           <w:p>
             <w:pPr>
               <w:pStyle w:val="Compact"/>
-              <w:jc w:val="left"/>
+              <w:jc w:val="both"/>
             </w:pPr>
             <w:r>
               <w:rPr>
@@ -1459,7 +1484,7 @@
           <w:p>
             <w:pPr>
               <w:pStyle w:val="Compact"/>
-              <w:jc w:val="left"/>
+              <w:jc w:val="both"/>
             </w:pPr>
             <w:r>
               <w:t xml:space="preserve">Predict any new card's or job's efficient operating point without a full measurement sweep.</w:t>
@@ -1471,7 +1496,7 @@
           <w:p>
             <w:pPr>
               <w:pStyle w:val="Compact"/>
-              <w:jc w:val="left"/>
+              <w:jc w:val="both"/>
             </w:pPr>
             <w:r>
               <w:t xml:space="preserve">A job model predicts a job's best power cap from its features; a transfer model predicts a new card's curve from its published specifications plus one short test. Both report error bars and a stated range of validity, and a short proof bounds the small penalty of using one cap per card; the transfer model is a calibrated-prior predictor anchored by one test per card, its error bars reflecting the small card count.</w:t>
@@ -1501,7 +1526,7 @@
           <w:p>
             <w:pPr>
               <w:pStyle w:val="Compact"/>
-              <w:jc w:val="left"/>
+              <w:jc w:val="both"/>
             </w:pPr>
             <w:r>
               <w:rPr>
@@ -1517,7 +1542,7 @@
           <w:p>
             <w:pPr>
               <w:pStyle w:val="Compact"/>
-              <w:jc w:val="left"/>
+              <w:jc w:val="both"/>
             </w:pPr>
             <w:r>
               <w:t xml:space="preserve">Decide, in real time, which job runs on which card and at what power cap, to do the most useful work within a changing power limit.</w:t>
@@ -1529,7 +1554,7 @@
           <w:p>
             <w:pPr>
               <w:pStyle w:val="Compact"/>
-              <w:jc w:val="left"/>
+              <w:jc w:val="both"/>
             </w:pPr>
             <w:r>
               <w:t xml:space="preserve">A controller that makes both choices together, since moving a job changes the power left for the others, tested in a digital twin that replays the measured curves against exact baselines. When power is too tight it defers or rejects low-priority work and reports the cost. The joint problem is NP-hard; the per-card capping step is solved exactly.</w:t>
@@ -1559,7 +1584,7 @@
           <w:p>
             <w:pPr>
               <w:pStyle w:val="Compact"/>
-              <w:jc w:val="left"/>
+              <w:jc w:val="both"/>
             </w:pPr>
             <w:r>
               <w:rPr>
@@ -1575,7 +1600,7 @@
           <w:p>
             <w:pPr>
               <w:pStyle w:val="Compact"/>
-              <w:jc w:val="left"/>
+              <w:jc w:val="both"/>
             </w:pPr>
             <w:r>
               <w:t xml:space="preserve">Define what flexibility a controlled facility can offer the grid, and measure it.</w:t>
@@ -1587,7 +1612,7 @@
           <w:p>
             <w:pPr>
               <w:pStyle w:val="Compact"/>
-              <w:jc w:val="left"/>
+              <w:jc w:val="both"/>
             </w:pPr>
             <w:r>
               <w:t xml:space="preserve">Specify the contractable quantities, a committed power envelope, a flexibility offer, and an auditable delivery record, with ramp and recovery metrics; demonstrate them on a rented metered server and at fleet scale in the twin, under an Israeli firm-plus-flexible scenario.</w:t>
@@ -1617,7 +1642,7 @@
           <w:p>
             <w:pPr>
               <w:pStyle w:val="Compact"/>
-              <w:jc w:val="left"/>
+              <w:jc w:val="both"/>
             </w:pPr>
             <w:r>
               <w:rPr>
@@ -1633,7 +1658,7 @@
           <w:p>
             <w:pPr>
               <w:pStyle w:val="Compact"/>
-              <w:jc w:val="left"/>
+              <w:jc w:val="both"/>
             </w:pPr>
             <w:r>
               <w:t xml:space="preserve">Find pricing and connection rules that reward efficient operation, and release everything openly.</w:t>
@@ -1645,7 +1670,7 @@
           <w:p>
             <w:pPr>
               <w:pStyle w:val="Compact"/>
-              <w:jc w:val="left"/>
+              <w:jc w:val="both"/>
             </w:pPr>
             <w:r>
               <w:t xml:space="preserve">An incentive model showing why per-hour billing rewards the energy-worst point and what changes fix it; a valuation of the flexible-connection option from public Noga and Electricity Authority data; each rule tested in the WP3 twin.</w:t>
@@ -1673,6 +1698,7 @@
     <w:p>
       <w:pPr>
         <w:pStyle w:val="BodyText"/>
+        <w:jc w:val="both"/>
       </w:pPr>
       <w:r>
         <w:t xml:space="preserve">Success metrics are pre-registered per work package; the stage table in 2.5.7.1 states each threshold.</w:t>
@@ -1691,6 +1717,7 @@
     <w:p>
       <w:pPr>
         <w:pStyle w:val="FirstParagraph"/>
+        <w:jc w:val="both"/>
       </w:pPr>
       <w:r>
         <w:t xml:space="preserve">The measured law and the JP are established preliminary results [1]; the project’s novelty is the frontier built on them:</w:t>
@@ -1703,6 +1730,7 @@
           <w:ilvl w:val="0"/>
           <w:numId w:val="1003"/>
         </w:numPr>
+        <w:jc w:val="both"/>
       </w:pPr>
       <w:r>
         <w:rPr>
@@ -1725,6 +1753,7 @@
           <w:ilvl w:val="0"/>
           <w:numId w:val="1003"/>
         </w:numPr>
+        <w:jc w:val="both"/>
       </w:pPr>
       <w:r>
         <w:rPr>
@@ -1747,6 +1776,7 @@
           <w:ilvl w:val="0"/>
           <w:numId w:val="1003"/>
         </w:numPr>
+        <w:jc w:val="both"/>
       </w:pPr>
       <w:r>
         <w:rPr>
@@ -1769,6 +1799,7 @@
           <w:ilvl w:val="0"/>
           <w:numId w:val="1003"/>
         </w:numPr>
+        <w:jc w:val="both"/>
       </w:pPr>
       <w:r>
         <w:rPr>
@@ -1791,6 +1822,7 @@
           <w:ilvl w:val="0"/>
           <w:numId w:val="1003"/>
         </w:numPr>
+        <w:jc w:val="both"/>
       </w:pPr>
       <w:r>
         <w:rPr>
@@ -1813,6 +1845,7 @@
           <w:ilvl w:val="0"/>
           <w:numId w:val="1003"/>
         </w:numPr>
+        <w:jc w:val="both"/>
       </w:pPr>
       <w:r>
         <w:rPr>
@@ -1841,6 +1874,7 @@
     <w:p>
       <w:pPr>
         <w:pStyle w:val="FirstParagraph"/>
+        <w:jc w:val="both"/>
       </w:pPr>
       <w:r>
         <w:t xml:space="preserve">The roles divide cleanly: operators run the hardware, the Ministry sets the rules. Just as a regulator sets fuel-economy standards without driving the cars, JouleFlex gives the Ministry the measured basis for connection terms, planning coefficients and efficiency standards, without operating any facility itself. The proposal addresses the Ministry's 2026 R&amp;D policy [17] under call 34/2026 [18],</w:t>
@@ -1871,7 +1905,7 @@
           <w:p>
             <w:pPr>
               <w:pStyle w:val="Compact"/>
-              <w:jc w:val="left"/>
+              <w:jc w:val="both"/>
             </w:pPr>
             <w:r>
               <w:t xml:space="preserve">Clause</w:t>
@@ -1883,7 +1917,7 @@
           <w:p>
             <w:pPr>
               <w:pStyle w:val="Compact"/>
-              <w:jc w:val="left"/>
+              <w:jc w:val="both"/>
             </w:pPr>
             <w:r>
               <w:t xml:space="preserve">How the project addresses it</w:t>
@@ -1898,7 +1932,7 @@
             <w:pPr>
               <w:pStyle w:val="Compact"/>
               <w:bidi/>
-              <w:jc w:val="right"/>
+              <w:jc w:val="both"/>
             </w:pPr>
             <w:r>
               <w:rPr>
@@ -1927,7 +1961,7 @@
           <w:p>
             <w:pPr>
               <w:pStyle w:val="Compact"/>
-              <w:jc w:val="left"/>
+              <w:jc w:val="both"/>
             </w:pPr>
             <w:r>
               <w:t xml:space="preserve">The core deliverable: power shaping manages a server farm's energy supply in real time; the flexibility framework tells planners how much a farm needs.</w:t>
@@ -1942,7 +1976,7 @@
             <w:pPr>
               <w:pStyle w:val="Compact"/>
               <w:bidi/>
-              <w:jc w:val="right"/>
+              <w:jc w:val="both"/>
             </w:pPr>
             <w:r>
               <w:rPr>
@@ -1971,7 +2005,7 @@
           <w:p>
             <w:pPr>
               <w:pStyle w:val="Compact"/>
-              <w:jc w:val="left"/>
+              <w:jc w:val="both"/>
             </w:pPr>
             <w:r>
               <w:t xml:space="preserve">A facility following a power envelope on instruction, at ~0.2-second actuation, is a demand-response resource of grid-relevant size.</w:t>
@@ -1986,7 +2020,7 @@
             <w:pPr>
               <w:pStyle w:val="Compact"/>
               <w:bidi/>
-              <w:jc w:val="right"/>
+              <w:jc w:val="both"/>
             </w:pPr>
             <w:r>
               <w:rPr>
@@ -2027,7 +2061,7 @@
           <w:p>
             <w:pPr>
               <w:pStyle w:val="Compact"/>
-              <w:jc w:val="left"/>
+              <w:jc w:val="both"/>
             </w:pPr>
             <w:r>
               <w:t xml:space="preserve">29–31 percent less energy per AI task at the card, 18–45 percent less per served job at the fleet, in software on installed hardware.</w:t>
@@ -2042,7 +2076,7 @@
             <w:pPr>
               <w:pStyle w:val="Compact"/>
               <w:bidi/>
-              <w:jc w:val="right"/>
+              <w:jc w:val="both"/>
             </w:pPr>
             <w:r>
               <w:rPr>
@@ -2083,7 +2117,7 @@
           <w:p>
             <w:pPr>
               <w:pStyle w:val="Compact"/>
-              <w:jc w:val="left"/>
+              <w:jc w:val="both"/>
             </w:pPr>
             <w:r>
               <w:t xml:space="preserve">AI compute is the subject, learned models and control the instruments, an energy-system tool the deliverable.</w:t>
@@ -2098,7 +2132,7 @@
             <w:pPr>
               <w:pStyle w:val="Compact"/>
               <w:bidi/>
-              <w:jc w:val="right"/>
+              <w:jc w:val="both"/>
             </w:pPr>
             <w:r>
               <w:rPr>
@@ -2127,7 +2161,7 @@
           <w:p>
             <w:pPr>
               <w:pStyle w:val="Compact"/>
-              <w:jc w:val="left"/>
+              <w:jc w:val="both"/>
             </w:pPr>
             <w:r>
               <w:t xml:space="preserve">Flexibility products, compliance metrics and the regulator-facing report are decision-support instruments for connection policy.</w:t>
@@ -2149,6 +2183,7 @@
     <w:p>
       <w:pPr>
         <w:pStyle w:val="FirstParagraph"/>
+        <w:jc w:val="both"/>
       </w:pPr>
       <w:r>
         <w:t xml:space="preserve">The preliminary results are the applicant's study</w:t>
@@ -2253,6 +2288,7 @@
     <w:p>
       <w:pPr>
         <w:pStyle w:val="FirstParagraph"/>
+        <w:jc w:val="both"/>
       </w:pPr>
       <w:r>
         <w:t xml:space="preserve">The project delivers five artifacts: the ELF-2 open dataset, the characterization kit, the control engine, the digital twin, and the grid interfaces and policy report. Appendix Table A1 states what each is and who uses it. Each artifact is released openly on delivery, every release crediting the Ministry’s R&amp;D program under call 34/2026 [18].</w:t>
@@ -2271,6 +2307,7 @@
     <w:p>
       <w:pPr>
         <w:pStyle w:val="FirstParagraph"/>
+        <w:jc w:val="both"/>
       </w:pPr>
       <w:r>
         <w:rPr>
@@ -2289,6 +2326,7 @@
     <w:p>
       <w:pPr>
         <w:pStyle w:val="BodyText"/>
+        <w:jc w:val="both"/>
       </w:pPr>
       <w:r>
         <w:rPr>
@@ -2307,6 +2345,7 @@
     <w:p>
       <w:pPr>
         <w:pStyle w:val="BodyText"/>
+        <w:jc w:val="both"/>
       </w:pPr>
       <w:r>
         <w:rPr>
@@ -2363,7 +2402,7 @@
           <w:p>
             <w:pPr>
               <w:pStyle w:val="Compact"/>
-              <w:jc w:val="left"/>
+              <w:jc w:val="both"/>
             </w:pPr>
             <w:r>
               <w:t xml:space="preserve">Months</w:t>
@@ -2375,7 +2414,7 @@
           <w:p>
             <w:pPr>
               <w:pStyle w:val="Compact"/>
-              <w:jc w:val="left"/>
+              <w:jc w:val="both"/>
             </w:pPr>
             <w:r>
               <w:t xml:space="preserve">Stage</w:t>
@@ -2387,7 +2426,7 @@
           <w:p>
             <w:pPr>
               <w:pStyle w:val="Compact"/>
-              <w:jc w:val="left"/>
+              <w:jc w:val="both"/>
             </w:pPr>
             <w:r>
               <w:t xml:space="preserve">Deliverable</w:t>
@@ -2399,7 +2438,7 @@
           <w:p>
             <w:pPr>
               <w:pStyle w:val="Compact"/>
-              <w:jc w:val="left"/>
+              <w:jc w:val="both"/>
             </w:pPr>
             <w:r>
               <w:t xml:space="preserve">Success metric</w:t>
@@ -2413,7 +2452,7 @@
           <w:p>
             <w:pPr>
               <w:pStyle w:val="Compact"/>
-              <w:jc w:val="left"/>
+              <w:jc w:val="both"/>
             </w:pPr>
             <w:r>
               <w:t xml:space="preserve">M1–M6</w:t>
@@ -2425,7 +2464,7 @@
           <w:p>
             <w:pPr>
               <w:pStyle w:val="Compact"/>
-              <w:jc w:val="left"/>
+              <w:jc w:val="both"/>
             </w:pPr>
             <w:r>
               <w:t xml:space="preserve">WP1: harness; new-generation and production-engine (vLLM) sweeps; board and node instrumentation</w:t>
@@ -2437,7 +2476,7 @@
           <w:p>
             <w:pPr>
               <w:pStyle w:val="Compact"/>
-              <w:jc w:val="left"/>
+              <w:jc w:val="both"/>
             </w:pPr>
             <w:r>
               <w:t xml:space="preserve">D1: ELF-2 v1</w:t>
@@ -2449,7 +2488,7 @@
           <w:p>
             <w:pPr>
               <w:pStyle w:val="Compact"/>
-              <w:jc w:val="left"/>
+              <w:jc w:val="both"/>
             </w:pPr>
             <w:r>
               <w:t xml:space="preserve">Law fit R² ≥ 0.95 per sweep, below the measured 0.99 median [1], or deviation documented; JP located (or absence documented) per platform at board and node power</w:t>
@@ -2463,7 +2502,7 @@
           <w:p>
             <w:pPr>
               <w:pStyle w:val="Compact"/>
-              <w:jc w:val="left"/>
+              <w:jc w:val="both"/>
             </w:pPr>
             <w:r>
               <w:t xml:space="preserve">M5–M8</w:t>
@@ -2475,7 +2514,7 @@
           <w:p>
             <w:pPr>
               <w:pStyle w:val="Compact"/>
-              <w:jc w:val="left"/>
+              <w:jc w:val="both"/>
             </w:pPr>
             <w:r>
               <w:t xml:space="preserve">WP1: shared GPUs, LLM phases, fine-tuning; sweeps where the constant should break</w:t>
@@ -2487,7 +2526,7 @@
           <w:p>
             <w:pPr>
               <w:pStyle w:val="Compact"/>
-              <w:jc w:val="left"/>
+              <w:jc w:val="both"/>
             </w:pPr>
             <w:r>
               <w:t xml:space="preserve">MS1: regime map</w:t>
@@ -2499,7 +2538,7 @@
           <w:p>
             <w:pPr>
               <w:pStyle w:val="Compact"/>
-              <w:jc w:val="left"/>
+              <w:jc w:val="both"/>
             </w:pPr>
             <w:r>
               <w:t xml:space="preserve">Server-input (BMC) wall tier validated; validity domain documented, including the pre-registered JP shift (percentage points of TDP) at which the per-card constant breaks; an M8 technical brief to the chief scientist unit</w:t>
@@ -2513,7 +2552,7 @@
           <w:p>
             <w:pPr>
               <w:pStyle w:val="Compact"/>
-              <w:jc w:val="left"/>
+              <w:jc w:val="both"/>
             </w:pPr>
             <w:r>
               <w:t xml:space="preserve">M7–M12</w:t>
@@ -2525,7 +2564,7 @@
           <w:p>
             <w:pPr>
               <w:pStyle w:val="Compact"/>
-              <w:jc w:val="left"/>
+              <w:jc w:val="both"/>
             </w:pPr>
             <w:r>
               <w:t xml:space="preserve">WP2: job model; transfer model; one-test characterization protocol</w:t>
@@ -2537,7 +2576,7 @@
           <w:p>
             <w:pPr>
               <w:pStyle w:val="Compact"/>
-              <w:jc w:val="left"/>
+              <w:jc w:val="both"/>
             </w:pPr>
             <w:r>
               <w:t xml:space="preserve">MS2: models result</w:t>
@@ -2549,7 +2588,7 @@
           <w:p>
             <w:pPr>
               <w:pStyle w:val="Compact"/>
-              <w:jc w:val="left"/>
+              <w:jc w:val="both"/>
             </w:pPr>
             <w:r>
               <w:t xml:space="preserve">Job-model placement within 5 percentage points of TDP where the constant breaks; transfer-model placement within 5 percentage points of TDP on held-out cards; protocol cost ≤ 8 hours and ≤ ₪1,500 per card model</w:t>
@@ -2563,7 +2602,7 @@
           <w:p>
             <w:pPr>
               <w:pStyle w:val="Compact"/>
-              <w:jc w:val="left"/>
+              <w:jc w:val="both"/>
             </w:pPr>
             <w:r>
               <w:t xml:space="preserve">M9–M16</w:t>
@@ -2575,7 +2614,7 @@
           <w:p>
             <w:pPr>
               <w:pStyle w:val="Compact"/>
-              <w:jc w:val="left"/>
+              <w:jc w:val="both"/>
             </w:pPr>
             <w:r>
               <w:t xml:space="preserve">WP3: twin; joint controller under fixed, price, carbon and curtailment envelopes</w:t>
@@ -2587,7 +2626,7 @@
           <w:p>
             <w:pPr>
               <w:pStyle w:val="Compact"/>
-              <w:jc w:val="left"/>
+              <w:jc w:val="both"/>
             </w:pPr>
             <w:r>
               <w:t xml:space="preserve">MS3: controller result</w:t>
@@ -2599,7 +2638,7 @@
           <w:p>
             <w:pPr>
               <w:pStyle w:val="Compact"/>
-              <w:jc w:val="left"/>
+              <w:jc w:val="both"/>
             </w:pPr>
             <w:r>
               <w:t xml:space="preserve">Energy per served job and SLO compliance versus uncapped, static-cap and cap-only baselines; a pre-registered floor of at least 10 percent below cap-only at equal compliance (the incremental gain over an already-capped fleet on held-out traces, not the saving over full power); zero exceedance beyond the WP1 noise band in committed windows, with overshoot and transient violations (under 1 percent of epochs) reported</w:t>
@@ -2613,7 +2652,7 @@
           <w:p>
             <w:pPr>
               <w:pStyle w:val="Compact"/>
-              <w:jc w:val="left"/>
+              <w:jc w:val="both"/>
             </w:pPr>
             <w:r>
               <w:t xml:space="preserve">M14–M20</w:t>
@@ -2625,7 +2664,7 @@
           <w:p>
             <w:pPr>
               <w:pStyle w:val="Compact"/>
-              <w:jc w:val="left"/>
+              <w:jc w:val="both"/>
             </w:pPr>
             <w:r>
               <w:t xml:space="preserve">WP4: flexibility products and metrics; demonstration on rented BMC-metered servers; Israel scenario</w:t>
@@ -2637,7 +2676,7 @@
           <w:p>
             <w:pPr>
               <w:pStyle w:val="Compact"/>
-              <w:jc w:val="left"/>
+              <w:jc w:val="both"/>
             </w:pPr>
             <w:r>
               <w:t xml:space="preserve">MS4: flexibility demonstration</w:t>
@@ -2649,7 +2688,7 @@
           <w:p>
             <w:pPr>
               <w:pStyle w:val="Compact"/>
-              <w:jc w:val="left"/>
+              <w:jc w:val="both"/>
             </w:pPr>
             <w:r>
               <w:t xml:space="preserve">Sheddable power as a fraction of the committed envelope (pre-registered floor: at least 15 percent within the ramp deadline at bounded SLO loss), measured on a BMC-metered server, projected to fleet scale in the twin (projection error versus the metered runs reported); ramp within 60 seconds and recovery within 5 minutes, within a grid flexibility product's response window [19]; delivery-record compliance and curtailment service cost</w:t>
@@ -2663,7 +2702,7 @@
           <w:p>
             <w:pPr>
               <w:pStyle w:val="Compact"/>
-              <w:jc w:val="left"/>
+              <w:jc w:val="both"/>
             </w:pPr>
             <w:r>
               <w:t xml:space="preserve">M16–M21</w:t>
@@ -2675,7 +2714,7 @@
           <w:p>
             <w:pPr>
               <w:pStyle w:val="Compact"/>
-              <w:jc w:val="left"/>
+              <w:jc w:val="both"/>
             </w:pPr>
             <w:r>
               <w:t xml:space="preserve">WP5: incentive model; connection valuation on published Israeli data; twin evaluation</w:t>
@@ -2687,7 +2726,7 @@
           <w:p>
             <w:pPr>
               <w:pStyle w:val="Compact"/>
-              <w:jc w:val="left"/>
+              <w:jc w:val="both"/>
             </w:pPr>
             <w:r>
               <w:t xml:space="preserve">MS5: policy report draft</w:t>
@@ -2699,7 +2738,7 @@
           <w:p>
             <w:pPr>
               <w:pStyle w:val="Compact"/>
-              <w:jc w:val="left"/>
+              <w:jc w:val="both"/>
             </w:pPr>
             <w:r>
               <w:t xml:space="preserve">Alignment condition per billing structure, confirmed in the twin; option value per MW and break-even curtailment frequency, with sensitivity to every price input</w:t>
@@ -2713,7 +2752,7 @@
           <w:p>
             <w:pPr>
               <w:pStyle w:val="Compact"/>
-              <w:jc w:val="left"/>
+              <w:jc w:val="both"/>
             </w:pPr>
             <w:r>
               <w:t xml:space="preserve">M21–M24</w:t>
@@ -2725,7 +2764,7 @@
           <w:p>
             <w:pPr>
               <w:pStyle w:val="Compact"/>
-              <w:jc w:val="left"/>
+              <w:jc w:val="both"/>
             </w:pPr>
             <w:r>
               <w:t xml:space="preserve">WP5: release, documentation, validation, publication</w:t>
@@ -2737,7 +2776,7 @@
           <w:p>
             <w:pPr>
               <w:pStyle w:val="Compact"/>
-              <w:jc w:val="left"/>
+              <w:jc w:val="both"/>
             </w:pPr>
             <w:r>
               <w:t xml:space="preserve">D2: open release; D3: final report</w:t>
@@ -2749,7 +2788,7 @@
           <w:p>
             <w:pPr>
               <w:pStyle w:val="Compact"/>
-              <w:jc w:val="left"/>
+              <w:jc w:val="both"/>
             </w:pPr>
             <w:r>
               <w:t xml:space="preserve">Public repositories with reproducing pipelines; metered validation; final scientific and policy reports</w:t>
@@ -2761,6 +2800,7 @@
     <w:p>
       <w:pPr>
         <w:pStyle w:val="BodyText"/>
+        <w:jc w:val="both"/>
       </w:pPr>
       <w:r>
         <w:t xml:space="preserve">Two interim briefings are named deliverables: the M8 technical brief and the M21 policy draft, in Hebrew, circulable to the Authority and Noga [19]. Each milestone is tested against pre-stated criteria; a bounding result is itself a deliverable. Minimum-success path: H100/L40S validation, one serving engine, BMC wall measurement, the job and transfer models, the joint controller, and one Israeli flexibility scenario; B200-class cards, a second engine, fine-tuning, shared-GPU regimes and the formal guarantee are extension objectives as access allows.</w:t>
@@ -2797,7 +2837,7 @@
           <w:p>
             <w:pPr>
               <w:pStyle w:val="Compact"/>
-              <w:jc w:val="left"/>
+              <w:jc w:val="both"/>
             </w:pPr>
             <w:r>
               <w:t xml:space="preserve">Stage</w:t>
@@ -2809,7 +2849,7 @@
           <w:p>
             <w:pPr>
               <w:pStyle w:val="Compact"/>
-              <w:jc w:val="left"/>
+              <w:jc w:val="both"/>
             </w:pPr>
             <w:r>
               <w:t xml:space="preserve">Share</w:t>
@@ -2821,7 +2861,7 @@
           <w:p>
             <w:pPr>
               <w:pStyle w:val="Compact"/>
-              <w:jc w:val="left"/>
+              <w:jc w:val="both"/>
             </w:pPr>
             <w:r>
               <w:t xml:space="preserve">Amount (₪)</w:t>
@@ -2833,7 +2873,7 @@
           <w:p>
             <w:pPr>
               <w:pStyle w:val="Compact"/>
-              <w:jc w:val="left"/>
+              <w:jc w:val="both"/>
             </w:pPr>
             <w:r>
               <w:t xml:space="preserve">Principal costs</w:t>
@@ -2847,7 +2887,7 @@
           <w:p>
             <w:pPr>
               <w:pStyle w:val="Compact"/>
-              <w:jc w:val="left"/>
+              <w:jc w:val="both"/>
             </w:pPr>
             <w:r>
               <w:t xml:space="preserve">M1–M8 (WP1; WP2 begins)</w:t>
@@ -2859,7 +2899,7 @@
           <w:p>
             <w:pPr>
               <w:pStyle w:val="Compact"/>
-              <w:jc w:val="left"/>
+              <w:jc w:val="both"/>
             </w:pPr>
             <w:r>
               <w:t xml:space="preserve">30%</w:t>
@@ -2871,7 +2911,7 @@
           <w:p>
             <w:pPr>
               <w:pStyle w:val="Compact"/>
-              <w:jc w:val="left"/>
+              <w:jc w:val="both"/>
             </w:pPr>
             <w:r>
               <w:t xml:space="preserve">148,314</w:t>
@@ -2883,7 +2923,7 @@
           <w:p>
             <w:pPr>
               <w:pStyle w:val="Compact"/>
-              <w:jc w:val="left"/>
+              <w:jc w:val="both"/>
             </w:pPr>
             <w:r>
               <w:t xml:space="preserve">Postdoctoral researcher; GPU rentals for cap sweeps</w:t>
@@ -2897,7 +2937,7 @@
           <w:p>
             <w:pPr>
               <w:pStyle w:val="Compact"/>
-              <w:jc w:val="left"/>
+              <w:jc w:val="both"/>
             </w:pPr>
             <w:r>
               <w:t xml:space="preserve">M9–M16 (WP2 ends; WP3; WP4 begins)</w:t>
@@ -2909,7 +2949,7 @@
           <w:p>
             <w:pPr>
               <w:pStyle w:val="Compact"/>
-              <w:jc w:val="left"/>
+              <w:jc w:val="both"/>
             </w:pPr>
             <w:r>
               <w:t xml:space="preserve">33%</w:t>
@@ -2921,7 +2961,7 @@
           <w:p>
             <w:pPr>
               <w:pStyle w:val="Compact"/>
-              <w:jc w:val="left"/>
+              <w:jc w:val="both"/>
             </w:pPr>
             <w:r>
               <w:t xml:space="preserve">163,145</w:t>
@@ -2933,7 +2973,7 @@
           <w:p>
             <w:pPr>
               <w:pStyle w:val="Compact"/>
-              <w:jc w:val="left"/>
+              <w:jc w:val="both"/>
             </w:pPr>
             <w:r>
               <w:t xml:space="preserve">Postdoctoral researcher; card-model rentals for transfer validation; twin and controller work</w:t>
@@ -2947,7 +2987,7 @@
           <w:p>
             <w:pPr>
               <w:pStyle w:val="Compact"/>
-              <w:jc w:val="left"/>
+              <w:jc w:val="both"/>
             </w:pPr>
             <w:r>
               <w:t xml:space="preserve">M17–M21 (WP4 ends; WP5)</w:t>
@@ -2959,7 +2999,7 @@
           <w:p>
             <w:pPr>
               <w:pStyle w:val="Compact"/>
-              <w:jc w:val="left"/>
+              <w:jc w:val="both"/>
             </w:pPr>
             <w:r>
               <w:t xml:space="preserve">25%</w:t>
@@ -2971,7 +3011,7 @@
           <w:p>
             <w:pPr>
               <w:pStyle w:val="Compact"/>
-              <w:jc w:val="left"/>
+              <w:jc w:val="both"/>
             </w:pPr>
             <w:r>
               <w:t xml:space="preserve">123,595</w:t>
@@ -2983,7 +3023,7 @@
           <w:p>
             <w:pPr>
               <w:pStyle w:val="Compact"/>
-              <w:jc w:val="left"/>
+              <w:jc w:val="both"/>
             </w:pPr>
             <w:r>
               <w:t xml:space="preserve">Postdoctoral researcher; BMC-metered rentals; flexibility campaign</w:t>
@@ -2997,7 +3037,7 @@
           <w:p>
             <w:pPr>
               <w:pStyle w:val="Compact"/>
-              <w:jc w:val="left"/>
+              <w:jc w:val="both"/>
             </w:pPr>
             <w:r>
               <w:t xml:space="preserve">M22–M24 (WP5: release and validation)</w:t>
@@ -3009,7 +3049,7 @@
           <w:p>
             <w:pPr>
               <w:pStyle w:val="Compact"/>
-              <w:jc w:val="left"/>
+              <w:jc w:val="both"/>
             </w:pPr>
             <w:r>
               <w:t xml:space="preserve">12%</w:t>
@@ -3021,7 +3061,7 @@
           <w:p>
             <w:pPr>
               <w:pStyle w:val="Compact"/>
-              <w:jc w:val="left"/>
+              <w:jc w:val="both"/>
             </w:pPr>
             <w:r>
               <w:t xml:space="preserve">59,326</w:t>
@@ -3033,7 +3073,7 @@
           <w:p>
             <w:pPr>
               <w:pStyle w:val="Compact"/>
-              <w:jc w:val="left"/>
+              <w:jc w:val="both"/>
             </w:pPr>
             <w:r>
               <w:t xml:space="preserve">Postdoctoral researcher; metered validation runs; documentation; dissemination and publication</w:t>
@@ -3049,7 +3089,7 @@
           <w:p>
             <w:pPr>
               <w:pStyle w:val="Compact"/>
-              <w:jc w:val="left"/>
+              <w:jc w:val="both"/>
             </w:pPr>
             <w:r>
               <w:rPr>
@@ -3065,7 +3105,7 @@
           <w:p>
             <w:pPr>
               <w:pStyle w:val="Compact"/>
-              <w:jc w:val="left"/>
+              <w:jc w:val="both"/>
             </w:pPr>
             <w:r>
               <w:rPr>
@@ -3082,7 +3122,7 @@
             <w:pPr>
               <w:pStyle w:val="Compact"/>
               <w:bidi/>
-              <w:jc w:val="right"/>
+              <w:jc w:val="both"/>
             </w:pPr>
             <w:r>
               <w:rPr>
@@ -3124,7 +3164,7 @@
           <w:p>
             <w:pPr>
               <w:pStyle w:val="Compact"/>
-              <w:jc w:val="left"/>
+              <w:jc w:val="both"/>
             </w:pPr>
             <w:r>
               <w:t xml:space="preserve">Risk</w:t>
@@ -3136,7 +3176,7 @@
           <w:p>
             <w:pPr>
               <w:pStyle w:val="Compact"/>
-              <w:jc w:val="left"/>
+              <w:jc w:val="both"/>
             </w:pPr>
             <w:r>
               <w:t xml:space="preserve">Impact</w:t>
@@ -3148,7 +3188,7 @@
           <w:p>
             <w:pPr>
               <w:pStyle w:val="Compact"/>
-              <w:jc w:val="left"/>
+              <w:jc w:val="both"/>
             </w:pPr>
             <w:r>
               <w:t xml:space="preserve">Mitigation</w:t>
@@ -3162,7 +3202,7 @@
           <w:p>
             <w:pPr>
               <w:pStyle w:val="Compact"/>
-              <w:jc w:val="left"/>
+              <w:jc w:val="both"/>
             </w:pPr>
             <w:r>
               <w:t xml:space="preserve">Production serving software (continuous batching, shifting phases) blurs the per-card constant</w:t>
@@ -3174,7 +3214,7 @@
           <w:p>
             <w:pPr>
               <w:pStyle w:val="Compact"/>
-              <w:jc w:val="left"/>
+              <w:jc w:val="both"/>
             </w:pPr>
             <w:r>
               <w:t xml:space="preserve">Static cap loses near-optimality for LLMs</w:t>
@@ -3186,7 +3226,7 @@
           <w:p>
             <w:pPr>
               <w:pStyle w:val="Compact"/>
-              <w:jc w:val="left"/>
+              <w:jc w:val="both"/>
             </w:pPr>
             <w:r>
               <w:t xml:space="preserve">Measured first (WP1, M1); the job model predicts the optimum where the constant breaks</w:t>
@@ -3200,7 +3240,7 @@
           <w:p>
             <w:pPr>
               <w:pStyle w:val="Compact"/>
-              <w:jc w:val="left"/>
+              <w:jc w:val="both"/>
             </w:pPr>
             <w:r>
               <w:t xml:space="preserve">Power-cap control unavailable on some rented platforms</w:t>
@@ -3212,7 +3252,7 @@
           <w:p>
             <w:pPr>
               <w:pStyle w:val="Compact"/>
-              <w:jc w:val="left"/>
+              <w:jc w:val="both"/>
             </w:pPr>
             <w:r>
               <w:t xml:space="preserve">Measurement campaign narrowed</w:t>
@@ -3224,7 +3264,7 @@
           <w:p>
             <w:pPr>
               <w:pStyle w:val="Compact"/>
-              <w:jc w:val="left"/>
+              <w:jc w:val="both"/>
             </w:pPr>
             <w:r>
               <w:t xml:space="preserve">AWS EC2 gives passthrough and root; too-high cap floors are exposed via the graphics clock (L4 [1]); BMC rentals cover the wall tier</w:t>
@@ -3238,7 +3278,7 @@
           <w:p>
             <w:pPr>
               <w:pStyle w:val="Compact"/>
-              <w:jc w:val="left"/>
+              <w:jc w:val="both"/>
             </w:pPr>
             <w:r>
               <w:t xml:space="preserve">Postdoc recruitment slips, or the single hire is lost mid-project</w:t>
@@ -3250,7 +3290,7 @@
           <w:p>
             <w:pPr>
               <w:pStyle w:val="Compact"/>
-              <w:jc w:val="left"/>
+              <w:jc w:val="both"/>
             </w:pPr>
             <w:r>
               <w:t xml:space="preserve">Schedule and delivery at risk</w:t>
@@ -3262,7 +3302,7 @@
           <w:p>
             <w:pPr>
               <w:pStyle w:val="Compact"/>
-              <w:jc w:val="left"/>
+              <w:jc w:val="both"/>
             </w:pPr>
             <w:r>
               <w:t xml:space="preserve">PI runs the WP1 bench directly (the ELF harness is his); the minimum-success path is one-FTE executable; recruitment via HIT and national channels with a fallback</w:t>
@@ -3276,7 +3316,7 @@
           <w:p>
             <w:pPr>
               <w:pStyle w:val="Compact"/>
-              <w:jc w:val="left"/>
+              <w:jc w:val="both"/>
             </w:pPr>
             <w:r>
               <w:t xml:space="preserve">Out-of-band PSU telemetry (BMC/IPMI/Redfish) blocked on a rented server</w:t>
@@ -3288,7 +3328,7 @@
           <w:p>
             <w:pPr>
               <w:pStyle w:val="Compact"/>
-              <w:jc w:val="left"/>
+              <w:jc w:val="both"/>
             </w:pPr>
             <w:r>
               <w:t xml:space="preserve">Wall-tier measurement narrowed</w:t>
@@ -3300,7 +3340,7 @@
           <w:p>
             <w:pPr>
               <w:pStyle w:val="Compact"/>
-              <w:jc w:val="left"/>
+              <w:jc w:val="both"/>
             </w:pPr>
             <w:r>
               <w:t xml:space="preserve">Named BMC-capable bare-metal vendors with dated quotes (GPU Mart and equivalents); fallback to an in-line metered PDU at the wall</w:t>
@@ -3323,6 +3363,7 @@
     <w:p>
       <w:pPr>
         <w:pStyle w:val="FirstParagraph"/>
+        <w:jc w:val="both"/>
       </w:pPr>
       <w:r>
         <w:rPr>
@@ -3342,7 +3383,7 @@
       <w:pPr>
         <w:pStyle w:val="BodyText"/>
         <w:bidi/>
-        <w:jc w:val="right"/>
+        <w:jc w:val="both"/>
       </w:pPr>
       <w:r>
         <w:rPr>
@@ -3394,6 +3435,7 @@
     <w:p>
       <w:pPr>
         <w:pStyle w:val="BodyText"/>
+        <w:jc w:val="both"/>
       </w:pPr>
       <w:r>
         <w:rPr>
@@ -3423,7 +3465,7 @@
       <w:pPr>
         <w:pStyle w:val="FirstParagraph"/>
         <w:bidi/>
-        <w:jc w:val="right"/>
+        <w:jc w:val="both"/>
       </w:pPr>
       <w:r>
         <w:rPr>
@@ -3449,6 +3491,7 @@
           <w:ilvl w:val="0"/>
           <w:numId w:val="1004"/>
         </w:numPr>
+        <w:jc w:val="both"/>
       </w:pPr>
       <w:r>
         <w:t xml:space="preserve">Apartsin, A. and Aperstein, Y. (2026).</w:t>
@@ -3494,6 +3537,7 @@
           <w:ilvl w:val="0"/>
           <w:numId w:val="1004"/>
         </w:numPr>
+        <w:jc w:val="both"/>
       </w:pPr>
       <w:r>
         <w:t xml:space="preserve">JNS (22 July 2026).</w:t>
@@ -3522,6 +3566,7 @@
           <w:ilvl w:val="0"/>
           <w:numId w:val="1004"/>
         </w:numPr>
+        <w:jc w:val="both"/>
       </w:pPr>
       <w:r>
         <w:t xml:space="preserve">International Energy Agency (2025).</w:t>
@@ -3550,6 +3595,7 @@
           <w:ilvl w:val="0"/>
           <w:numId w:val="1004"/>
         </w:numPr>
+        <w:jc w:val="both"/>
       </w:pPr>
       <w:r>
         <w:t xml:space="preserve">Barroso, L. A. and Hölzle, U. (2007).</w:t>
@@ -3578,6 +3624,7 @@
           <w:ilvl w:val="0"/>
           <w:numId w:val="1004"/>
         </w:numPr>
+        <w:jc w:val="both"/>
       </w:pPr>
       <w:r>
         <w:t xml:space="preserve">Yao, F., Demers, A., and Shenker, S. (1995).</w:t>
@@ -3606,6 +3653,7 @@
           <w:ilvl w:val="0"/>
           <w:numId w:val="1004"/>
         </w:numPr>
+        <w:jc w:val="both"/>
       </w:pPr>
       <w:r>
         <w:t xml:space="preserve">Miyoshi, A., Lefurgy, C., Van Hensbergen, E., Rajamony, R., and Rajkumar, R. (2002).</w:t>
@@ -3634,6 +3682,7 @@
           <w:ilvl w:val="0"/>
           <w:numId w:val="1004"/>
         </w:numPr>
+        <w:jc w:val="both"/>
       </w:pPr>
       <w:r>
         <w:t xml:space="preserve">Gandhi, A., Harchol-Balter, M., Das, R., and Lefurgy, C. (2009).</w:t>
@@ -3662,6 +3711,7 @@
           <w:ilvl w:val="0"/>
           <w:numId w:val="1004"/>
         </w:numPr>
+        <w:jc w:val="both"/>
       </w:pPr>
       <w:r>
         <w:t xml:space="preserve">You, J., Chung, J.-W., and Chowdhury, M. (2022).</w:t>
@@ -3690,6 +3740,7 @@
           <w:ilvl w:val="0"/>
           <w:numId w:val="1004"/>
         </w:numPr>
+        <w:jc w:val="both"/>
       </w:pPr>
       <w:r>
         <w:t xml:space="preserve">Chung, J.-W., Ma, J. J., Wu, R., et al. (2025).</w:t>
@@ -3718,6 +3769,7 @@
           <w:ilvl w:val="0"/>
           <w:numId w:val="1004"/>
         </w:numPr>
+        <w:jc w:val="both"/>
       </w:pPr>
       <w:r>
         <w:t xml:space="preserve">Chung, J.-W., Wu, R., Ma, J. J., et al. (2026).</w:t>
@@ -3746,6 +3798,7 @@
           <w:ilvl w:val="0"/>
           <w:numId w:val="1004"/>
         </w:numPr>
+        <w:jc w:val="both"/>
       </w:pPr>
       <w:r>
         <w:t xml:space="preserve">Hu, Q., Sun, P., Yan, S., Wen, Y., et al. (2021).</w:t>
@@ -3774,6 +3827,7 @@
           <w:ilvl w:val="0"/>
           <w:numId w:val="1004"/>
         </w:numPr>
+        <w:jc w:val="both"/>
       </w:pPr>
       <w:r>
         <w:t xml:space="preserve">Alibaba Group (2020).</w:t>
@@ -3802,6 +3856,7 @@
           <w:ilvl w:val="0"/>
           <w:numId w:val="1004"/>
         </w:numPr>
+        <w:jc w:val="both"/>
       </w:pPr>
       <w:r>
         <w:t xml:space="preserve">Lipe, E., Karia, N., Espenshade, C., Stein, C., Tantawi, A., and Tardieu, O. (2026).</w:t>
@@ -3830,6 +3885,7 @@
           <w:ilvl w:val="0"/>
           <w:numId w:val="1004"/>
         </w:numPr>
+        <w:jc w:val="both"/>
       </w:pPr>
       <w:r>
         <w:t xml:space="preserve">Lu, T. and Reda, S. (2026).</w:t>
@@ -3858,6 +3914,7 @@
           <w:ilvl w:val="0"/>
           <w:numId w:val="1004"/>
         </w:numPr>
+        <w:jc w:val="both"/>
       </w:pPr>
       <w:r>
         <w:t xml:space="preserve">Rodriguez, C., Degioanni, L., Kameni, L., Vidal, R., et al. (2024).</w:t>
@@ -3886,6 +3943,7 @@
           <w:ilvl w:val="0"/>
           <w:numId w:val="1004"/>
         </w:numPr>
+        <w:jc w:val="both"/>
       </w:pPr>
       <w:r>
         <w:t xml:space="preserve">Kwon, W., Li, Z., Zhuang, S., et al. (2023).</w:t>
@@ -3915,7 +3973,7 @@
           <w:numId w:val="1004"/>
         </w:numPr>
         <w:bidi/>
-        <w:jc w:val="right"/>
+        <w:jc w:val="both"/>
       </w:pPr>
       <w:r>
         <w:rPr>
@@ -3958,7 +4016,7 @@
           <w:numId w:val="1004"/>
         </w:numPr>
         <w:bidi/>
-        <w:jc w:val="right"/>
+        <w:jc w:val="both"/>
       </w:pPr>
       <w:r>
         <w:rPr>
@@ -3989,7 +4047,7 @@
           <w:numId w:val="1004"/>
         </w:numPr>
         <w:bidi/>
-        <w:jc w:val="right"/>
+        <w:jc w:val="both"/>
       </w:pPr>
       <w:r>
         <w:rPr>
@@ -4005,6 +4063,7 @@
           <w:ilvl w:val="0"/>
           <w:numId w:val="1004"/>
         </w:numPr>
+        <w:jc w:val="both"/>
       </w:pPr>
       <w:r>
         <w:t xml:space="preserve">Ma, Y., Srinivasan, S., and Wang, X. (2025).</w:t>
@@ -4047,6 +4106,7 @@
           <w:ilvl w:val="0"/>
           <w:numId w:val="1004"/>
         </w:numPr>
+        <w:jc w:val="both"/>
       </w:pPr>
       <w:r>
         <w:t xml:space="preserve">Colangelo, P., Coskun, A. K., Megrue, J., et al. (2025).</w:t>
@@ -4089,6 +4149,7 @@
           <w:ilvl w:val="0"/>
           <w:numId w:val="1004"/>
         </w:numPr>
+        <w:jc w:val="both"/>
       </w:pPr>
       <w:r>
         <w:t xml:space="preserve">Fadel Argerich, M., Fürst, J., and Patiño-Martínez, M. (2026).</w:t>
@@ -4117,6 +4178,7 @@
           <w:ilvl w:val="0"/>
           <w:numId w:val="1004"/>
         </w:numPr>
+        <w:jc w:val="both"/>
       </w:pPr>
       <w:r>
         <w:t xml:space="preserve">Ma, B., Afzal, A., Eitzinger, J., and Wellein, G. (2026).</w:t>
@@ -4157,7 +4219,7 @@
       <w:pPr>
         <w:pStyle w:val="FirstParagraph"/>
         <w:bidi/>
-        <w:jc w:val="right"/>
+        <w:jc w:val="both"/>
       </w:pPr>
       <w:r>
         <w:rPr>
@@ -4181,6 +4243,7 @@
     <w:p>
       <w:pPr>
         <w:pStyle w:val="CaptionedFigure"/>
+        <w:jc w:val="both"/>
       </w:pPr>
       <w:r>
         <w:drawing>
@@ -4228,6 +4291,7 @@
     <w:p>
       <w:pPr>
         <w:pStyle w:val="ImageCaption"/>
+        <w:jc w:val="both"/>
       </w:pPr>
       <w:r>
         <w:t xml:space="preserve">Figure A1.</w:t>
@@ -4266,6 +4330,7 @@
     <w:p>
       <w:pPr>
         <w:pStyle w:val="CaptionedFigure"/>
+        <w:jc w:val="both"/>
       </w:pPr>
       <w:r>
         <w:drawing>
@@ -4313,6 +4378,7 @@
     <w:p>
       <w:pPr>
         <w:pStyle w:val="ImageCaption"/>
+        <w:jc w:val="both"/>
       </w:pPr>
       <w:r>
         <w:t xml:space="preserve">Figure A2.</w:t>
@@ -4351,6 +4417,7 @@
     <w:p>
       <w:pPr>
         <w:pStyle w:val="CaptionedFigure"/>
+        <w:jc w:val="both"/>
       </w:pPr>
       <w:r>
         <w:drawing>
@@ -4398,6 +4465,7 @@
     <w:p>
       <w:pPr>
         <w:pStyle w:val="ImageCaption"/>
+        <w:jc w:val="both"/>
       </w:pPr>
       <w:r>
         <w:t xml:space="preserve">Figure A3.</w:t>
@@ -4458,7 +4526,7 @@
           <w:tcPr/>
           <w:p>
             <w:pPr>
-              <w:jc w:val="center"/>
+              <w:jc w:val="both"/>
             </w:pPr>
             <w:r>
               <w:t xml:space="preserve">The project delivers five named artifacts, each with a defined user and use:</w:t>
@@ -4748,13 +4816,18 @@
               </w:tc>
             </w:tr>
           </w:tbl>
-          <w:p/>
+          <w:p>
+            <w:pPr>
+              <w:jc w:val="both"/>
+            </w:pPr>
+          </w:p>
         </w:tc>
       </w:tr>
     </w:tbl>
     <w:p>
       <w:pPr>
         <w:pStyle w:val="ImageCaption"/>
+        <w:jc w:val="both"/>
       </w:pPr>
       <w:r>
         <w:t xml:space="preserve">Table A1.</w:t>

</xml_diff>

<commit_message>
2.5.8 advisor/postdoc split + regenerated PDF/DOCX
Co-Authored-By: Claude Opus 4.8 <noreply@anthropic.com>
</commit_message>
<xml_diff>
--- a/JouleFlex-proposal-2026-09-06.docx
+++ b/JouleFlex-proposal-2026-09-06.docx
@@ -3382,6 +3382,25 @@
     <w:p>
       <w:pPr>
         <w:pStyle w:val="BodyText"/>
+        <w:jc w:val="both"/>
+      </w:pPr>
+      <w:r>
+        <w:rPr>
+          <w:b/>
+          <w:bCs/>
+        </w:rPr>
+        <w:t xml:space="preserve">Fit of expertise to the proposed work.</w:t>
+      </w:r>
+      <w:r>
+        <w:t xml:space="preserve"> </w:t>
+      </w:r>
+      <w:r>
+        <w:t xml:space="preserve">The scientific foundation is the PI's own study [1]: the ELF dataset, law, JP and fleet result. The work plan maps onto that record across all five packages, and the harness, models and simulation are built and validated. Beyond the study, the PI brings three decades in industry and academia: capacity and cost engineering, including system-sizing that saved a large operator about $10M; research and patents in computationally efficient computing (CalexNet); and graduate teaching at HIT, Afeka, Bar-Ilan and Tel-Aviv University.</w:t>
+      </w:r>
+    </w:p>
+    <w:p>
+      <w:pPr>
+        <w:pStyle w:val="BodyText"/>
         <w:bidi/>
         <w:jc w:val="both"/>
       </w:pPr>
@@ -3391,7 +3410,7 @@
           <w:bCs/>
           <w:rtl/>
         </w:rPr>
-        <w:t xml:space="preserve">Fit of expertise to the proposed work.</w:t>
+        <w:t xml:space="preserve">Research personnel.</w:t>
       </w:r>
       <w:r>
         <w:rPr>
@@ -3403,33 +3422,26 @@
         <w:rPr>
           <w:rtl/>
         </w:rPr>
-        <w:t xml:space="preserve">The scientific foundation is the PI's own study [1]: the ELF dataset, the law, the JP, the cost identity, the fleet saving. The work plan maps onto that record across all five packages, and the harness, models and simulation are built and validated. The Israel scenario runs on public Noga and Electricity Authority data, needing no external partner. Beyond the study, the PI brings three decades in industry and academia: capacity and cost engineering, including system-sizing that saved a large operator about $10M; research and patents in computationally efficient computing (CalexNet); and graduate teaching at HIT, Afeka, Bar-Ilan and Tel-Aviv University.</w:t>
-      </w:r>
-      <w:r>
-        <w:rPr>
-          <w:rtl/>
-        </w:rPr>
-        <w:t xml:space="preserve"> </w:t>
-      </w:r>
+        <w:t xml:space="preserve">One postdoctoral researcher at 90% position, both years, carries the measurement, modeling and control work under the PI's supervision, reported within a month of signature (נספח טז' §2.5). Core profile required at hiring: GPU systems and energy instrumentation (NVML/RAPL/BMC), machine-learning systems, and optimization or control. The grid-flexibility and techno-economic analysis of WP4 and WP5 is public-data modeling on Noga and Electricity Authority figures, developed on the project under the PI's direction, and needs no power-systems specialist. Recruitment runs through HIT and national postdoctoral channels; if the month-1 start slips the PI runs the WP1 bench directly (the ELF harness is his), so the minimum-success path holds.</w:t>
+      </w:r>
+    </w:p>
+    <w:p>
+      <w:pPr>
+        <w:pStyle w:val="BodyText"/>
+        <w:jc w:val="both"/>
+      </w:pPr>
       <w:r>
         <w:rPr>
           <w:b/>
           <w:bCs/>
-          <w:rtl/>
-        </w:rPr>
-        <w:t xml:space="preserve">Research personnel.</w:t>
-      </w:r>
-      <w:r>
-        <w:rPr>
-          <w:rtl/>
-        </w:rPr>
-        <w:t xml:space="preserve"> </w:t>
-      </w:r>
-      <w:r>
-        <w:rPr>
-          <w:rtl/>
-        </w:rPr>
-        <w:t xml:space="preserve">One postdoctoral researcher at 90% position, both years, carries the measurement, modeling and control work under the PI's supervision, reported within a month of signature (נספח טז' §2.5). Core profile required at hiring: GPU systems and energy instrumentation (NVML/RAPL/BMC), machine-learning systems, and optimization or control. The grid-flexibility and techno-economic analysis of WP4 and WP5 is public-data modeling on Noga and Electricity Authority figures, developed on the project under the PI's direction, and needs no power-systems specialist. Recruitment runs through HIT and national postdoctoral channels; if the month-1 start slips the PI runs the WP1 measurement bench directly (the ELF harness is his) and WP2 modeling re-sequences ahead of new sweeps, so the minimum-success path holds. An unpaid academic advisor in energy-market analysis (to be named) will review the WP5 techno-economic work.</w:t>
+        </w:rPr>
+        <w:t xml:space="preserve">Advisor.</w:t>
+      </w:r>
+      <w:r>
+        <w:t xml:space="preserve"> </w:t>
+      </w:r>
+      <w:r>
+        <w:t xml:space="preserve">A senior academic advisor with long experience in energy systems, energy efficiency and energy-systems management will advise the facility-level energy measurement and grid-flexibility work (WP4) and the techno-economic analysis (WP5), adding an energy-systems perspective to the team’s computing and ML expertise. The advisor will be named before signature.</w:t>
       </w:r>
     </w:p>
     <w:p>

</xml_diff>

<commit_message>
Proposal Word matched to PDF (20pp, styled); advisor senior expert
Co-Authored-By: Claude Opus 4.8 <noreply@anthropic.com>
</commit_message>
<xml_diff>
--- a/JouleFlex-proposal-2026-09-06.docx
+++ b/JouleFlex-proposal-2026-09-06.docx
@@ -141,7 +141,6 @@
     <w:p>
       <w:pPr>
         <w:pStyle w:val="FirstParagraph"/>
-        <w:jc w:val="both"/>
       </w:pPr>
       <w:r>
         <w:t xml:space="preserve">In July 2026 Israel's Electricity Authority froze new data-center connection requests after the queue reached 27,000 megawatts. Under electricity limits, data centers switch GPUs (AI processors) off or cap their power, deciding in watts (the momentary draw), not joules (the energy consumed). A capped GPU computes slower and pays its fixed power floor longer, so energy per unit of useful work can rise even as the meter shows fewer watts: less AI per kilowatt-hour. A similar challenge exists in aviation, where it is solved: fuel flow rises far faster than speed, yet slow flight burns fuel longer, so airlines cruise at the speed minimizing fuel per kilometer.</w:t>
@@ -150,7 +149,6 @@
     <w:p>
       <w:pPr>
         <w:pStyle w:val="BodyText"/>
-        <w:jc w:val="both"/>
       </w:pPr>
       <w:r>
         <w:t xml:space="preserve">The PI's recent study [1] measured the time-power tradeoff for AI workloads (5,500 measurements, 20 models, four GPUs). Energy per task is U-shaped in the power cap. On the large GPUs its minimum, the Joule Point (JP), sits at 43 to 46 percent of rated power; holding a card there cut energy per task 29 to 31 percent while running 1.2 times slower. Even under a strict deadline, capping saved 28 percent of energy while keeping 95 percent of workload value. A fleet simulation on the measured curves (only scheduling simulated) served equal work with 18 to 45 percent less energy.</w:t>
@@ -159,7 +157,6 @@
     <w:p>
       <w:pPr>
         <w:pStyle w:val="BodyText"/>
-        <w:jc w:val="both"/>
       </w:pPr>
       <w:r>
         <w:t xml:space="preserve">These insights change how AI data centers are planned, managed, and priced, raising decisions no current tool supports: how to design a flexible-connection-ready fleet whose cards run near their JP; how to measure and predict the JP for new cards and jobs; and how to price service to motivate customers toward efficiency, not per-hour billing rewarding the energy-worst point.</w:t>
@@ -255,7 +252,7 @@
           <w:p>
             <w:pPr>
               <w:pStyle w:val="Compact"/>
-              <w:jc w:val="both"/>
+              <w:jc w:val="left"/>
             </w:pPr>
             <w:r>
               <w:t xml:space="preserve">Term</w:t>
@@ -267,7 +264,7 @@
           <w:p>
             <w:pPr>
               <w:pStyle w:val="Compact"/>
-              <w:jc w:val="both"/>
+              <w:jc w:val="left"/>
             </w:pPr>
             <w:r>
               <w:t xml:space="preserve">Meaning</w:t>
@@ -281,7 +278,7 @@
           <w:p>
             <w:pPr>
               <w:pStyle w:val="Compact"/>
-              <w:jc w:val="both"/>
+              <w:jc w:val="left"/>
             </w:pPr>
             <w:r>
               <w:t xml:space="preserve">Power</w:t>
@@ -293,7 +290,7 @@
           <w:p>
             <w:pPr>
               <w:pStyle w:val="Compact"/>
-              <w:jc w:val="both"/>
+              <w:jc w:val="left"/>
             </w:pPr>
             <w:r>
               <w:t xml:space="preserve">How fast electricity is drawn at a given moment; watts (W) or megawatts (MW). The grid connection is sized by peak power.</w:t>
@@ -307,7 +304,7 @@
           <w:p>
             <w:pPr>
               <w:pStyle w:val="Compact"/>
-              <w:jc w:val="both"/>
+              <w:jc w:val="left"/>
             </w:pPr>
             <w:r>
               <w:t xml:space="preserve">Energy</w:t>
@@ -319,7 +316,7 @@
           <w:p>
             <w:pPr>
               <w:pStyle w:val="Compact"/>
-              <w:jc w:val="both"/>
+              <w:jc w:val="left"/>
             </w:pPr>
             <w:r>
               <w:t xml:space="preserve">The total electricity consumed: power × time; joules or kilowatt-hours. The bill and the carbon footprint are set by energy.</w:t>
@@ -333,7 +330,7 @@
           <w:p>
             <w:pPr>
               <w:pStyle w:val="Compact"/>
-              <w:jc w:val="both"/>
+              <w:jc w:val="left"/>
             </w:pPr>
             <w:r>
               <w:t xml:space="preserve">Power cap</w:t>
@@ -345,7 +342,7 @@
           <w:p>
             <w:pPr>
               <w:pStyle w:val="Compact"/>
-              <w:jc w:val="both"/>
+              <w:jc w:val="left"/>
             </w:pPr>
             <w:r>
               <w:t xml:space="preserve">A software limit on a GPU's power draw. Set with one command; takes effect in ~0.2 seconds. The control knob of this project.</w:t>
@@ -359,7 +356,7 @@
           <w:p>
             <w:pPr>
               <w:pStyle w:val="Compact"/>
-              <w:jc w:val="both"/>
+              <w:jc w:val="left"/>
             </w:pPr>
             <w:r>
               <w:t xml:space="preserve">TDP</w:t>
@@ -371,7 +368,7 @@
           <w:p>
             <w:pPr>
               <w:pStyle w:val="Compact"/>
-              <w:jc w:val="both"/>
+              <w:jc w:val="left"/>
             </w:pPr>
             <w:r>
               <w:t xml:space="preserve">A GPU's full rated power. Running at TDP is today's default.</w:t>
@@ -385,7 +382,7 @@
           <w:p>
             <w:pPr>
               <w:pStyle w:val="Compact"/>
-              <w:jc w:val="both"/>
+              <w:jc w:val="left"/>
             </w:pPr>
             <w:r>
               <w:t xml:space="preserve">Joule Point (JP)</w:t>
@@ -397,7 +394,7 @@
           <w:p>
             <w:pPr>
               <w:pStyle w:val="Compact"/>
-              <w:jc w:val="both"/>
+              <w:jc w:val="left"/>
             </w:pPr>
             <w:r>
               <w:t xml:space="preserve">The power cap at which energy per task is lowest for a given card; measured at 43–46% of TDP on large GPUs.</w:t>
@@ -411,7 +408,7 @@
           <w:p>
             <w:pPr>
               <w:pStyle w:val="Compact"/>
-              <w:jc w:val="both"/>
+              <w:jc w:val="left"/>
             </w:pPr>
             <w:r>
               <w:t xml:space="preserve">Operating point</w:t>
@@ -423,7 +420,7 @@
           <w:p>
             <w:pPr>
               <w:pStyle w:val="Compact"/>
-              <w:jc w:val="both"/>
+              <w:jc w:val="left"/>
             </w:pPr>
             <w:r>
               <w:t xml:space="preserve">The pair (GPU, power cap) a job runs at.</w:t>
@@ -437,7 +434,7 @@
           <w:p>
             <w:pPr>
               <w:pStyle w:val="Compact"/>
-              <w:jc w:val="both"/>
+              <w:jc w:val="left"/>
             </w:pPr>
             <w:r>
               <w:t xml:space="preserve">Power envelope</w:t>
@@ -449,7 +446,7 @@
           <w:p>
             <w:pPr>
               <w:pStyle w:val="Compact"/>
-              <w:jc w:val="both"/>
+              <w:jc w:val="left"/>
             </w:pPr>
             <w:r>
               <w:t xml:space="preserve">A limit on a facility's total power draw that can change over time, set by a budget, a price or carbon signal, or a grid instruction.</w:t>
@@ -463,7 +460,7 @@
           <w:p>
             <w:pPr>
               <w:pStyle w:val="Compact"/>
-              <w:jc w:val="both"/>
+              <w:jc w:val="left"/>
             </w:pPr>
             <w:r>
               <w:t xml:space="preserve">Power shaping</w:t>
@@ -475,7 +472,7 @@
           <w:p>
             <w:pPr>
               <w:pStyle w:val="Compact"/>
-              <w:jc w:val="both"/>
+              <w:jc w:val="left"/>
             </w:pPr>
             <w:r>
               <w:t xml:space="preserve">Keeping a fleet inside a power envelope by capping jobs, like traffic shaping in networks.</w:t>
@@ -489,7 +486,7 @@
           <w:p>
             <w:pPr>
               <w:pStyle w:val="Compact"/>
-              <w:jc w:val="both"/>
+              <w:jc w:val="left"/>
             </w:pPr>
             <w:r>
               <w:t xml:space="preserve">ELF</w:t>
@@ -501,7 +498,7 @@
           <w:p>
             <w:pPr>
               <w:pStyle w:val="Compact"/>
-              <w:jc w:val="both"/>
+              <w:jc w:val="left"/>
             </w:pPr>
             <w:r>
               <w:t xml:space="preserve">Our released dataset: dense power-cap sweeps of 20 AI models on 4 GPUs, ~5,500 measured rows.</w:t>
@@ -515,7 +512,7 @@
           <w:p>
             <w:pPr>
               <w:pStyle w:val="Compact"/>
-              <w:jc w:val="both"/>
+              <w:jc w:val="left"/>
             </w:pPr>
             <w:r>
               <w:t xml:space="preserve">SLO</w:t>
@@ -527,7 +524,7 @@
           <w:p>
             <w:pPr>
               <w:pStyle w:val="Compact"/>
-              <w:jc w:val="both"/>
+              <w:jc w:val="left"/>
             </w:pPr>
             <w:r>
               <w:t xml:space="preserve">Service level objective: the deadline or latency a job must meet.</w:t>
@@ -541,7 +538,7 @@
           <w:p>
             <w:pPr>
               <w:pStyle w:val="Compact"/>
-              <w:jc w:val="both"/>
+              <w:jc w:val="left"/>
             </w:pPr>
             <w:r>
               <w:t xml:space="preserve">Firm / flexible capacity</w:t>
@@ -553,7 +550,7 @@
           <w:p>
             <w:pPr>
               <w:pStyle w:val="Compact"/>
-              <w:jc w:val="both"/>
+              <w:jc w:val="left"/>
             </w:pPr>
             <w:r>
               <w:t xml:space="preserve">Grid connection capacity guaranteed at all times, versus capacity given on condition that the facility reduces power when instructed.</w:t>
@@ -567,7 +564,7 @@
           <w:p>
             <w:pPr>
               <w:pStyle w:val="Compact"/>
-              <w:jc w:val="both"/>
+              <w:jc w:val="left"/>
             </w:pPr>
             <w:r>
               <w:t xml:space="preserve">Card multiplier</w:t>
@@ -579,7 +576,7 @@
           <w:p>
             <w:pPr>
               <w:pStyle w:val="Compact"/>
-              <w:jc w:val="both"/>
+              <w:jc w:val="left"/>
             </w:pPr>
             <w:r>
               <w:t xml:space="preserve">The extra cards needed to keep total throughput when capping. It equals the latency ratio (~1.2×).</w:t>
@@ -610,7 +607,6 @@
     <w:p>
       <w:pPr>
         <w:pStyle w:val="FirstParagraph"/>
-        <w:jc w:val="both"/>
       </w:pPr>
       <w:r>
         <w:t xml:space="preserve">The objective is to construct</w:t>
@@ -708,7 +704,6 @@
     <w:p>
       <w:pPr>
         <w:pStyle w:val="FirstParagraph"/>
-        <w:jc w:val="both"/>
       </w:pPr>
       <w:r>
         <w:t xml:space="preserve">Can AI data centers operate as controllable electrical loads, each GPU near its energy-optimal cap and the facility</w:t>
@@ -729,7 +724,6 @@
     <w:p>
       <w:pPr>
         <w:pStyle w:val="BodyText"/>
-        <w:jc w:val="both"/>
       </w:pPr>
       <w:r>
         <w:t xml:space="preserve">Six sub-questions structure the work plan:</w:t>
@@ -742,7 +736,6 @@
           <w:ilvl w:val="0"/>
           <w:numId w:val="1001"/>
         </w:numPr>
-        <w:jc w:val="both"/>
       </w:pPr>
       <w:r>
         <w:rPr>
@@ -765,7 +758,6 @@
           <w:ilvl w:val="0"/>
           <w:numId w:val="1001"/>
         </w:numPr>
-        <w:jc w:val="both"/>
       </w:pPr>
       <w:r>
         <w:rPr>
@@ -788,7 +780,6 @@
           <w:ilvl w:val="0"/>
           <w:numId w:val="1001"/>
         </w:numPr>
-        <w:jc w:val="both"/>
       </w:pPr>
       <w:r>
         <w:rPr>
@@ -811,7 +802,6 @@
           <w:ilvl w:val="0"/>
           <w:numId w:val="1001"/>
         </w:numPr>
-        <w:jc w:val="both"/>
       </w:pPr>
       <w:r>
         <w:rPr>
@@ -834,7 +824,6 @@
           <w:ilvl w:val="0"/>
           <w:numId w:val="1001"/>
         </w:numPr>
-        <w:jc w:val="both"/>
       </w:pPr>
       <w:r>
         <w:rPr>
@@ -857,7 +846,6 @@
           <w:ilvl w:val="0"/>
           <w:numId w:val="1001"/>
         </w:numPr>
-        <w:jc w:val="both"/>
       </w:pPr>
       <w:r>
         <w:rPr>
@@ -896,7 +884,6 @@
     <w:p>
       <w:pPr>
         <w:pStyle w:val="FirstParagraph"/>
-        <w:jc w:val="both"/>
       </w:pPr>
       <w:r>
         <w:rPr>
@@ -927,7 +914,6 @@
     <w:p>
       <w:pPr>
         <w:pStyle w:val="BodyText"/>
-        <w:jc w:val="both"/>
       </w:pPr>
       <w:r>
         <w:rPr>
@@ -946,7 +932,6 @@
     <w:p>
       <w:pPr>
         <w:pStyle w:val="BodyText"/>
-        <w:jc w:val="both"/>
       </w:pPr>
       <w:r>
         <w:rPr>
@@ -977,7 +962,6 @@
     <w:p>
       <w:pPr>
         <w:pStyle w:val="BodyText"/>
-        <w:jc w:val="both"/>
       </w:pPr>
       <w:r>
         <w:t xml:space="preserve">P(θ) = P₀ + a·θ^β,   median R² = 0.99,</w:t>
@@ -986,7 +970,6 @@
     <w:p>
       <w:pPr>
         <w:pStyle w:val="BodyText"/>
-        <w:jc w:val="both"/>
       </w:pPr>
       <w:r>
         <w:t xml:space="preserve">a fixed floor P₀ plus a superlinear term. Energy per task, E = P/θ, is therefore U-shaped in the cap; its minimum, the</w:t>
@@ -1024,7 +1007,6 @@
     <w:p>
       <w:pPr>
         <w:pStyle w:val="FirstParagraph"/>
-        <w:jc w:val="both"/>
       </w:pPr>
       <w:r>
         <w:t xml:space="preserve">Four research lines meet here.</w:t>
@@ -1153,7 +1135,6 @@
           <w:ilvl w:val="0"/>
           <w:numId w:val="1002"/>
         </w:numPr>
-        <w:jc w:val="both"/>
       </w:pPr>
       <w:r>
         <w:rPr>
@@ -1176,7 +1157,6 @@
           <w:ilvl w:val="0"/>
           <w:numId w:val="1002"/>
         </w:numPr>
-        <w:jc w:val="both"/>
       </w:pPr>
       <w:r>
         <w:rPr>
@@ -1199,7 +1179,6 @@
           <w:ilvl w:val="0"/>
           <w:numId w:val="1002"/>
         </w:numPr>
-        <w:jc w:val="both"/>
       </w:pPr>
       <w:r>
         <w:rPr>
@@ -1222,7 +1201,6 @@
           <w:ilvl w:val="0"/>
           <w:numId w:val="1002"/>
         </w:numPr>
-        <w:jc w:val="both"/>
       </w:pPr>
       <w:r>
         <w:rPr>
@@ -1245,7 +1223,6 @@
           <w:ilvl w:val="0"/>
           <w:numId w:val="1002"/>
         </w:numPr>
-        <w:jc w:val="both"/>
       </w:pPr>
       <w:r>
         <w:rPr>
@@ -1268,7 +1245,6 @@
           <w:ilvl w:val="0"/>
           <w:numId w:val="1002"/>
         </w:numPr>
-        <w:jc w:val="both"/>
       </w:pPr>
       <w:r>
         <w:rPr>
@@ -1297,7 +1273,6 @@
     <w:p>
       <w:pPr>
         <w:pStyle w:val="FirstParagraph"/>
-        <w:jc w:val="both"/>
       </w:pPr>
       <w:r>
         <w:t xml:space="preserve">JouleFlex builds one measured foundation and three tools on it: first work out the energy-optimal way to run each job on each card, then control power to achieve it.</w:t>
@@ -1372,7 +1347,7 @@
           <w:p>
             <w:pPr>
               <w:pStyle w:val="Compact"/>
-              <w:jc w:val="both"/>
+              <w:jc w:val="left"/>
             </w:pPr>
             <w:r>
               <w:t xml:space="preserve">WP</w:t>
@@ -1384,7 +1359,7 @@
           <w:p>
             <w:pPr>
               <w:pStyle w:val="Compact"/>
-              <w:jc w:val="both"/>
+              <w:jc w:val="left"/>
             </w:pPr>
             <w:r>
               <w:t xml:space="preserve">Objective</w:t>
@@ -1396,7 +1371,7 @@
           <w:p>
             <w:pPr>
               <w:pStyle w:val="Compact"/>
-              <w:jc w:val="both"/>
+              <w:jc w:val="left"/>
             </w:pPr>
             <w:r>
               <w:t xml:space="preserve">Approach and output</w:t>
@@ -1410,7 +1385,7 @@
           <w:p>
             <w:pPr>
               <w:pStyle w:val="Compact"/>
-              <w:jc w:val="both"/>
+              <w:jc w:val="left"/>
             </w:pPr>
             <w:r>
               <w:rPr>
@@ -1426,7 +1401,7 @@
           <w:p>
             <w:pPr>
               <w:pStyle w:val="Compact"/>
-              <w:jc w:val="both"/>
+              <w:jc w:val="left"/>
             </w:pPr>
             <w:r>
               <w:t xml:space="preserve">Extend the energy-versus-power measurements to current GPUs, production software, and whole-server power.</w:t>
@@ -1438,7 +1413,7 @@
           <w:p>
             <w:pPr>
               <w:pStyle w:val="Compact"/>
-              <w:jc w:val="both"/>
+              <w:jc w:val="left"/>
             </w:pPr>
             <w:r>
               <w:t xml:space="preserve">Re-run the study's measurement sweep on new GPUs (H100/L40S class) and production serving engines (vLLM [16], TensorRT-LLM), reading power at three rented tiers: the GPU board (NVML), the host CPU domain (RAPL), and the server's power-supply input, the wall tier (BMC, read out-of-band via IPMI/Redfish). Accuracy is taken from vendor specifications and cross-checked across tiers; the JP is where the slope of P(θ) is zero, so a constant meter bias cancels in its location: the JP and per-card savings are calibration-robust, while absolute board-to-wall and megawatt figures carry that caveat.</w:t>
@@ -1468,7 +1443,7 @@
           <w:p>
             <w:pPr>
               <w:pStyle w:val="Compact"/>
-              <w:jc w:val="both"/>
+              <w:jc w:val="left"/>
             </w:pPr>
             <w:r>
               <w:rPr>
@@ -1484,7 +1459,7 @@
           <w:p>
             <w:pPr>
               <w:pStyle w:val="Compact"/>
-              <w:jc w:val="both"/>
+              <w:jc w:val="left"/>
             </w:pPr>
             <w:r>
               <w:t xml:space="preserve">Predict any new card's or job's efficient operating point without a full measurement sweep.</w:t>
@@ -1496,7 +1471,7 @@
           <w:p>
             <w:pPr>
               <w:pStyle w:val="Compact"/>
-              <w:jc w:val="both"/>
+              <w:jc w:val="left"/>
             </w:pPr>
             <w:r>
               <w:t xml:space="preserve">A job model predicts a job's best power cap from its features; a transfer model predicts a new card's curve from its published specifications plus one short test. Both report error bars and a stated range of validity, and a short proof bounds the small penalty of using one cap per card; the transfer model is a calibrated-prior predictor anchored by one test per card, its error bars reflecting the small card count.</w:t>
@@ -1526,7 +1501,7 @@
           <w:p>
             <w:pPr>
               <w:pStyle w:val="Compact"/>
-              <w:jc w:val="both"/>
+              <w:jc w:val="left"/>
             </w:pPr>
             <w:r>
               <w:rPr>
@@ -1542,7 +1517,7 @@
           <w:p>
             <w:pPr>
               <w:pStyle w:val="Compact"/>
-              <w:jc w:val="both"/>
+              <w:jc w:val="left"/>
             </w:pPr>
             <w:r>
               <w:t xml:space="preserve">Decide, in real time, which job runs on which card and at what power cap, to do the most useful work within a changing power limit.</w:t>
@@ -1554,7 +1529,7 @@
           <w:p>
             <w:pPr>
               <w:pStyle w:val="Compact"/>
-              <w:jc w:val="both"/>
+              <w:jc w:val="left"/>
             </w:pPr>
             <w:r>
               <w:t xml:space="preserve">A controller that makes both choices together, since moving a job changes the power left for the others, tested in a digital twin that replays the measured curves against exact baselines. When power is too tight it defers or rejects low-priority work and reports the cost. The joint problem is NP-hard; the per-card capping step is solved exactly.</w:t>
@@ -1584,7 +1559,7 @@
           <w:p>
             <w:pPr>
               <w:pStyle w:val="Compact"/>
-              <w:jc w:val="both"/>
+              <w:jc w:val="left"/>
             </w:pPr>
             <w:r>
               <w:rPr>
@@ -1600,7 +1575,7 @@
           <w:p>
             <w:pPr>
               <w:pStyle w:val="Compact"/>
-              <w:jc w:val="both"/>
+              <w:jc w:val="left"/>
             </w:pPr>
             <w:r>
               <w:t xml:space="preserve">Define what flexibility a controlled facility can offer the grid, and measure it.</w:t>
@@ -1612,7 +1587,7 @@
           <w:p>
             <w:pPr>
               <w:pStyle w:val="Compact"/>
-              <w:jc w:val="both"/>
+              <w:jc w:val="left"/>
             </w:pPr>
             <w:r>
               <w:t xml:space="preserve">Specify the contractable quantities, a committed power envelope, a flexibility offer, and an auditable delivery record, with ramp and recovery metrics; demonstrate them on a rented metered server and at fleet scale in the twin, under an Israeli firm-plus-flexible scenario.</w:t>
@@ -1642,7 +1617,7 @@
           <w:p>
             <w:pPr>
               <w:pStyle w:val="Compact"/>
-              <w:jc w:val="both"/>
+              <w:jc w:val="left"/>
             </w:pPr>
             <w:r>
               <w:rPr>
@@ -1658,7 +1633,7 @@
           <w:p>
             <w:pPr>
               <w:pStyle w:val="Compact"/>
-              <w:jc w:val="both"/>
+              <w:jc w:val="left"/>
             </w:pPr>
             <w:r>
               <w:t xml:space="preserve">Find pricing and connection rules that reward efficient operation, and release everything openly.</w:t>
@@ -1670,7 +1645,7 @@
           <w:p>
             <w:pPr>
               <w:pStyle w:val="Compact"/>
-              <w:jc w:val="both"/>
+              <w:jc w:val="left"/>
             </w:pPr>
             <w:r>
               <w:t xml:space="preserve">An incentive model showing why per-hour billing rewards the energy-worst point and what changes fix it; a valuation of the flexible-connection option from public Noga and Electricity Authority data; each rule tested in the WP3 twin.</w:t>
@@ -1698,7 +1673,6 @@
     <w:p>
       <w:pPr>
         <w:pStyle w:val="BodyText"/>
-        <w:jc w:val="both"/>
       </w:pPr>
       <w:r>
         <w:t xml:space="preserve">Success metrics are pre-registered per work package; the stage table in 2.5.7.1 states each threshold.</w:t>
@@ -1717,7 +1691,6 @@
     <w:p>
       <w:pPr>
         <w:pStyle w:val="FirstParagraph"/>
-        <w:jc w:val="both"/>
       </w:pPr>
       <w:r>
         <w:t xml:space="preserve">The measured law and the JP are established preliminary results [1]; the project’s novelty is the frontier built on them:</w:t>
@@ -1730,7 +1703,6 @@
           <w:ilvl w:val="0"/>
           <w:numId w:val="1003"/>
         </w:numPr>
-        <w:jc w:val="both"/>
       </w:pPr>
       <w:r>
         <w:rPr>
@@ -1753,7 +1725,6 @@
           <w:ilvl w:val="0"/>
           <w:numId w:val="1003"/>
         </w:numPr>
-        <w:jc w:val="both"/>
       </w:pPr>
       <w:r>
         <w:rPr>
@@ -1776,7 +1747,6 @@
           <w:ilvl w:val="0"/>
           <w:numId w:val="1003"/>
         </w:numPr>
-        <w:jc w:val="both"/>
       </w:pPr>
       <w:r>
         <w:rPr>
@@ -1799,7 +1769,6 @@
           <w:ilvl w:val="0"/>
           <w:numId w:val="1003"/>
         </w:numPr>
-        <w:jc w:val="both"/>
       </w:pPr>
       <w:r>
         <w:rPr>
@@ -1822,7 +1791,6 @@
           <w:ilvl w:val="0"/>
           <w:numId w:val="1003"/>
         </w:numPr>
-        <w:jc w:val="both"/>
       </w:pPr>
       <w:r>
         <w:rPr>
@@ -1845,7 +1813,6 @@
           <w:ilvl w:val="0"/>
           <w:numId w:val="1003"/>
         </w:numPr>
-        <w:jc w:val="both"/>
       </w:pPr>
       <w:r>
         <w:rPr>
@@ -1874,7 +1841,6 @@
     <w:p>
       <w:pPr>
         <w:pStyle w:val="FirstParagraph"/>
-        <w:jc w:val="both"/>
       </w:pPr>
       <w:r>
         <w:t xml:space="preserve">The roles divide cleanly: operators run the hardware, the Ministry sets the rules. Just as a regulator sets fuel-economy standards without driving the cars, JouleFlex gives the Ministry the measured basis for connection terms, planning coefficients and efficiency standards, without operating any facility itself. The proposal addresses the Ministry's 2026 R&amp;D policy [17] under call 34/2026 [18],</w:t>
@@ -1905,7 +1871,7 @@
           <w:p>
             <w:pPr>
               <w:pStyle w:val="Compact"/>
-              <w:jc w:val="both"/>
+              <w:jc w:val="left"/>
             </w:pPr>
             <w:r>
               <w:t xml:space="preserve">Clause</w:t>
@@ -1917,7 +1883,7 @@
           <w:p>
             <w:pPr>
               <w:pStyle w:val="Compact"/>
-              <w:jc w:val="both"/>
+              <w:jc w:val="left"/>
             </w:pPr>
             <w:r>
               <w:t xml:space="preserve">How the project addresses it</w:t>
@@ -1961,7 +1927,7 @@
           <w:p>
             <w:pPr>
               <w:pStyle w:val="Compact"/>
-              <w:jc w:val="both"/>
+              <w:jc w:val="left"/>
             </w:pPr>
             <w:r>
               <w:t xml:space="preserve">The core deliverable: power shaping manages a server farm's energy supply in real time; the flexibility framework tells planners how much a farm needs.</w:t>
@@ -2005,7 +1971,7 @@
           <w:p>
             <w:pPr>
               <w:pStyle w:val="Compact"/>
-              <w:jc w:val="both"/>
+              <w:jc w:val="left"/>
             </w:pPr>
             <w:r>
               <w:t xml:space="preserve">A facility following a power envelope on instruction, at ~0.2-second actuation, is a demand-response resource of grid-relevant size.</w:t>
@@ -2061,7 +2027,7 @@
           <w:p>
             <w:pPr>
               <w:pStyle w:val="Compact"/>
-              <w:jc w:val="both"/>
+              <w:jc w:val="left"/>
             </w:pPr>
             <w:r>
               <w:t xml:space="preserve">29–31 percent less energy per AI task at the card, 18–45 percent less per served job at the fleet, in software on installed hardware.</w:t>
@@ -2117,7 +2083,7 @@
           <w:p>
             <w:pPr>
               <w:pStyle w:val="Compact"/>
-              <w:jc w:val="both"/>
+              <w:jc w:val="left"/>
             </w:pPr>
             <w:r>
               <w:t xml:space="preserve">AI compute is the subject, learned models and control the instruments, an energy-system tool the deliverable.</w:t>
@@ -2161,7 +2127,7 @@
           <w:p>
             <w:pPr>
               <w:pStyle w:val="Compact"/>
-              <w:jc w:val="both"/>
+              <w:jc w:val="left"/>
             </w:pPr>
             <w:r>
               <w:t xml:space="preserve">Flexibility products, compliance metrics and the regulator-facing report are decision-support instruments for connection policy.</w:t>
@@ -2183,7 +2149,6 @@
     <w:p>
       <w:pPr>
         <w:pStyle w:val="FirstParagraph"/>
-        <w:jc w:val="both"/>
       </w:pPr>
       <w:r>
         <w:t xml:space="preserve">The preliminary results are the applicant's study</w:t>
@@ -2288,7 +2253,6 @@
     <w:p>
       <w:pPr>
         <w:pStyle w:val="FirstParagraph"/>
-        <w:jc w:val="both"/>
       </w:pPr>
       <w:r>
         <w:t xml:space="preserve">The project delivers five artifacts: the ELF-2 open dataset, the characterization kit, the control engine, the digital twin, and the grid interfaces and policy report. Appendix Table A1 states what each is and who uses it. Each artifact is released openly on delivery, every release crediting the Ministry’s R&amp;D program under call 34/2026 [18].</w:t>
@@ -2307,7 +2271,6 @@
     <w:p>
       <w:pPr>
         <w:pStyle w:val="FirstParagraph"/>
-        <w:jc w:val="both"/>
       </w:pPr>
       <w:r>
         <w:rPr>
@@ -2326,7 +2289,6 @@
     <w:p>
       <w:pPr>
         <w:pStyle w:val="BodyText"/>
-        <w:jc w:val="both"/>
       </w:pPr>
       <w:r>
         <w:rPr>
@@ -2345,7 +2307,6 @@
     <w:p>
       <w:pPr>
         <w:pStyle w:val="BodyText"/>
-        <w:jc w:val="both"/>
       </w:pPr>
       <w:r>
         <w:rPr>
@@ -2402,7 +2363,7 @@
           <w:p>
             <w:pPr>
               <w:pStyle w:val="Compact"/>
-              <w:jc w:val="both"/>
+              <w:jc w:val="left"/>
             </w:pPr>
             <w:r>
               <w:t xml:space="preserve">Months</w:t>
@@ -2414,7 +2375,7 @@
           <w:p>
             <w:pPr>
               <w:pStyle w:val="Compact"/>
-              <w:jc w:val="both"/>
+              <w:jc w:val="left"/>
             </w:pPr>
             <w:r>
               <w:t xml:space="preserve">Stage</w:t>
@@ -2426,7 +2387,7 @@
           <w:p>
             <w:pPr>
               <w:pStyle w:val="Compact"/>
-              <w:jc w:val="both"/>
+              <w:jc w:val="left"/>
             </w:pPr>
             <w:r>
               <w:t xml:space="preserve">Deliverable</w:t>
@@ -2438,7 +2399,7 @@
           <w:p>
             <w:pPr>
               <w:pStyle w:val="Compact"/>
-              <w:jc w:val="both"/>
+              <w:jc w:val="left"/>
             </w:pPr>
             <w:r>
               <w:t xml:space="preserve">Success metric</w:t>
@@ -2452,7 +2413,7 @@
           <w:p>
             <w:pPr>
               <w:pStyle w:val="Compact"/>
-              <w:jc w:val="both"/>
+              <w:jc w:val="left"/>
             </w:pPr>
             <w:r>
               <w:t xml:space="preserve">M1–M6</w:t>
@@ -2464,7 +2425,7 @@
           <w:p>
             <w:pPr>
               <w:pStyle w:val="Compact"/>
-              <w:jc w:val="both"/>
+              <w:jc w:val="left"/>
             </w:pPr>
             <w:r>
               <w:t xml:space="preserve">WP1: harness; new-generation and production-engine (vLLM) sweeps; board and node instrumentation</w:t>
@@ -2476,7 +2437,7 @@
           <w:p>
             <w:pPr>
               <w:pStyle w:val="Compact"/>
-              <w:jc w:val="both"/>
+              <w:jc w:val="left"/>
             </w:pPr>
             <w:r>
               <w:t xml:space="preserve">D1: ELF-2 v1</w:t>
@@ -2488,7 +2449,7 @@
           <w:p>
             <w:pPr>
               <w:pStyle w:val="Compact"/>
-              <w:jc w:val="both"/>
+              <w:jc w:val="left"/>
             </w:pPr>
             <w:r>
               <w:t xml:space="preserve">Law fit R² ≥ 0.95 per sweep, below the measured 0.99 median [1], or deviation documented; JP located (or absence documented) per platform at board and node power</w:t>
@@ -2502,7 +2463,7 @@
           <w:p>
             <w:pPr>
               <w:pStyle w:val="Compact"/>
-              <w:jc w:val="both"/>
+              <w:jc w:val="left"/>
             </w:pPr>
             <w:r>
               <w:t xml:space="preserve">M5–M8</w:t>
@@ -2514,7 +2475,7 @@
           <w:p>
             <w:pPr>
               <w:pStyle w:val="Compact"/>
-              <w:jc w:val="both"/>
+              <w:jc w:val="left"/>
             </w:pPr>
             <w:r>
               <w:t xml:space="preserve">WP1: shared GPUs, LLM phases, fine-tuning; sweeps where the constant should break</w:t>
@@ -2526,7 +2487,7 @@
           <w:p>
             <w:pPr>
               <w:pStyle w:val="Compact"/>
-              <w:jc w:val="both"/>
+              <w:jc w:val="left"/>
             </w:pPr>
             <w:r>
               <w:t xml:space="preserve">MS1: regime map</w:t>
@@ -2538,7 +2499,7 @@
           <w:p>
             <w:pPr>
               <w:pStyle w:val="Compact"/>
-              <w:jc w:val="both"/>
+              <w:jc w:val="left"/>
             </w:pPr>
             <w:r>
               <w:t xml:space="preserve">Server-input (BMC) wall tier validated; validity domain documented, including the pre-registered JP shift (percentage points of TDP) at which the per-card constant breaks; an M8 technical brief to the chief scientist unit</w:t>
@@ -2552,7 +2513,7 @@
           <w:p>
             <w:pPr>
               <w:pStyle w:val="Compact"/>
-              <w:jc w:val="both"/>
+              <w:jc w:val="left"/>
             </w:pPr>
             <w:r>
               <w:t xml:space="preserve">M7–M12</w:t>
@@ -2564,7 +2525,7 @@
           <w:p>
             <w:pPr>
               <w:pStyle w:val="Compact"/>
-              <w:jc w:val="both"/>
+              <w:jc w:val="left"/>
             </w:pPr>
             <w:r>
               <w:t xml:space="preserve">WP2: job model; transfer model; one-test characterization protocol</w:t>
@@ -2576,7 +2537,7 @@
           <w:p>
             <w:pPr>
               <w:pStyle w:val="Compact"/>
-              <w:jc w:val="both"/>
+              <w:jc w:val="left"/>
             </w:pPr>
             <w:r>
               <w:t xml:space="preserve">MS2: models result</w:t>
@@ -2588,7 +2549,7 @@
           <w:p>
             <w:pPr>
               <w:pStyle w:val="Compact"/>
-              <w:jc w:val="both"/>
+              <w:jc w:val="left"/>
             </w:pPr>
             <w:r>
               <w:t xml:space="preserve">Job-model placement within 5 percentage points of TDP where the constant breaks; transfer-model placement within 5 percentage points of TDP on held-out cards; protocol cost ≤ 8 hours and ≤ ₪1,500 per card model</w:t>
@@ -2602,7 +2563,7 @@
           <w:p>
             <w:pPr>
               <w:pStyle w:val="Compact"/>
-              <w:jc w:val="both"/>
+              <w:jc w:val="left"/>
             </w:pPr>
             <w:r>
               <w:t xml:space="preserve">M9–M16</w:t>
@@ -2614,7 +2575,7 @@
           <w:p>
             <w:pPr>
               <w:pStyle w:val="Compact"/>
-              <w:jc w:val="both"/>
+              <w:jc w:val="left"/>
             </w:pPr>
             <w:r>
               <w:t xml:space="preserve">WP3: twin; joint controller under fixed, price, carbon and curtailment envelopes</w:t>
@@ -2626,7 +2587,7 @@
           <w:p>
             <w:pPr>
               <w:pStyle w:val="Compact"/>
-              <w:jc w:val="both"/>
+              <w:jc w:val="left"/>
             </w:pPr>
             <w:r>
               <w:t xml:space="preserve">MS3: controller result</w:t>
@@ -2638,7 +2599,7 @@
           <w:p>
             <w:pPr>
               <w:pStyle w:val="Compact"/>
-              <w:jc w:val="both"/>
+              <w:jc w:val="left"/>
             </w:pPr>
             <w:r>
               <w:t xml:space="preserve">Energy per served job and SLO compliance versus uncapped, static-cap and cap-only baselines; a pre-registered floor of at least 10 percent below cap-only at equal compliance (the incremental gain over an already-capped fleet on held-out traces, not the saving over full power); zero exceedance beyond the WP1 noise band in committed windows, with overshoot and transient violations (under 1 percent of epochs) reported</w:t>
@@ -2652,7 +2613,7 @@
           <w:p>
             <w:pPr>
               <w:pStyle w:val="Compact"/>
-              <w:jc w:val="both"/>
+              <w:jc w:val="left"/>
             </w:pPr>
             <w:r>
               <w:t xml:space="preserve">M14–M20</w:t>
@@ -2664,7 +2625,7 @@
           <w:p>
             <w:pPr>
               <w:pStyle w:val="Compact"/>
-              <w:jc w:val="both"/>
+              <w:jc w:val="left"/>
             </w:pPr>
             <w:r>
               <w:t xml:space="preserve">WP4: flexibility products and metrics; demonstration on rented BMC-metered servers; Israel scenario</w:t>
@@ -2676,7 +2637,7 @@
           <w:p>
             <w:pPr>
               <w:pStyle w:val="Compact"/>
-              <w:jc w:val="both"/>
+              <w:jc w:val="left"/>
             </w:pPr>
             <w:r>
               <w:t xml:space="preserve">MS4: flexibility demonstration</w:t>
@@ -2688,7 +2649,7 @@
           <w:p>
             <w:pPr>
               <w:pStyle w:val="Compact"/>
-              <w:jc w:val="both"/>
+              <w:jc w:val="left"/>
             </w:pPr>
             <w:r>
               <w:t xml:space="preserve">Sheddable power as a fraction of the committed envelope (pre-registered floor: at least 15 percent within the ramp deadline at bounded SLO loss), measured on a BMC-metered server, projected to fleet scale in the twin (projection error versus the metered runs reported); ramp within 60 seconds and recovery within 5 minutes, within a grid flexibility product's response window [19]; delivery-record compliance and curtailment service cost</w:t>
@@ -2702,7 +2663,7 @@
           <w:p>
             <w:pPr>
               <w:pStyle w:val="Compact"/>
-              <w:jc w:val="both"/>
+              <w:jc w:val="left"/>
             </w:pPr>
             <w:r>
               <w:t xml:space="preserve">M16–M21</w:t>
@@ -2714,7 +2675,7 @@
           <w:p>
             <w:pPr>
               <w:pStyle w:val="Compact"/>
-              <w:jc w:val="both"/>
+              <w:jc w:val="left"/>
             </w:pPr>
             <w:r>
               <w:t xml:space="preserve">WP5: incentive model; connection valuation on published Israeli data; twin evaluation</w:t>
@@ -2726,7 +2687,7 @@
           <w:p>
             <w:pPr>
               <w:pStyle w:val="Compact"/>
-              <w:jc w:val="both"/>
+              <w:jc w:val="left"/>
             </w:pPr>
             <w:r>
               <w:t xml:space="preserve">MS5: policy report draft</w:t>
@@ -2738,7 +2699,7 @@
           <w:p>
             <w:pPr>
               <w:pStyle w:val="Compact"/>
-              <w:jc w:val="both"/>
+              <w:jc w:val="left"/>
             </w:pPr>
             <w:r>
               <w:t xml:space="preserve">Alignment condition per billing structure, confirmed in the twin; option value per MW and break-even curtailment frequency, with sensitivity to every price input</w:t>
@@ -2752,7 +2713,7 @@
           <w:p>
             <w:pPr>
               <w:pStyle w:val="Compact"/>
-              <w:jc w:val="both"/>
+              <w:jc w:val="left"/>
             </w:pPr>
             <w:r>
               <w:t xml:space="preserve">M21–M24</w:t>
@@ -2764,7 +2725,7 @@
           <w:p>
             <w:pPr>
               <w:pStyle w:val="Compact"/>
-              <w:jc w:val="both"/>
+              <w:jc w:val="left"/>
             </w:pPr>
             <w:r>
               <w:t xml:space="preserve">WP5: release, documentation, validation, publication</w:t>
@@ -2776,7 +2737,7 @@
           <w:p>
             <w:pPr>
               <w:pStyle w:val="Compact"/>
-              <w:jc w:val="both"/>
+              <w:jc w:val="left"/>
             </w:pPr>
             <w:r>
               <w:t xml:space="preserve">D2: open release; D3: final report</w:t>
@@ -2788,7 +2749,7 @@
           <w:p>
             <w:pPr>
               <w:pStyle w:val="Compact"/>
-              <w:jc w:val="both"/>
+              <w:jc w:val="left"/>
             </w:pPr>
             <w:r>
               <w:t xml:space="preserve">Public repositories with reproducing pipelines; metered validation; final scientific and policy reports</w:t>
@@ -2800,7 +2761,6 @@
     <w:p>
       <w:pPr>
         <w:pStyle w:val="BodyText"/>
-        <w:jc w:val="both"/>
       </w:pPr>
       <w:r>
         <w:t xml:space="preserve">Two interim briefings are named deliverables: the M8 technical brief and the M21 policy draft, in Hebrew, circulable to the Authority and Noga [19]. Each milestone is tested against pre-stated criteria; a bounding result is itself a deliverable. Minimum-success path: H100/L40S validation, one serving engine, BMC wall measurement, the job and transfer models, the joint controller, and one Israeli flexibility scenario; B200-class cards, a second engine, fine-tuning, shared-GPU regimes and the formal guarantee are extension objectives as access allows.</w:t>
@@ -2837,7 +2797,7 @@
           <w:p>
             <w:pPr>
               <w:pStyle w:val="Compact"/>
-              <w:jc w:val="both"/>
+              <w:jc w:val="left"/>
             </w:pPr>
             <w:r>
               <w:t xml:space="preserve">Stage</w:t>
@@ -2849,7 +2809,7 @@
           <w:p>
             <w:pPr>
               <w:pStyle w:val="Compact"/>
-              <w:jc w:val="both"/>
+              <w:jc w:val="left"/>
             </w:pPr>
             <w:r>
               <w:t xml:space="preserve">Share</w:t>
@@ -2861,7 +2821,7 @@
           <w:p>
             <w:pPr>
               <w:pStyle w:val="Compact"/>
-              <w:jc w:val="both"/>
+              <w:jc w:val="left"/>
             </w:pPr>
             <w:r>
               <w:t xml:space="preserve">Amount (₪)</w:t>
@@ -2873,7 +2833,7 @@
           <w:p>
             <w:pPr>
               <w:pStyle w:val="Compact"/>
-              <w:jc w:val="both"/>
+              <w:jc w:val="left"/>
             </w:pPr>
             <w:r>
               <w:t xml:space="preserve">Principal costs</w:t>
@@ -2887,7 +2847,7 @@
           <w:p>
             <w:pPr>
               <w:pStyle w:val="Compact"/>
-              <w:jc w:val="both"/>
+              <w:jc w:val="left"/>
             </w:pPr>
             <w:r>
               <w:t xml:space="preserve">M1–M8 (WP1; WP2 begins)</w:t>
@@ -2899,7 +2859,7 @@
           <w:p>
             <w:pPr>
               <w:pStyle w:val="Compact"/>
-              <w:jc w:val="both"/>
+              <w:jc w:val="left"/>
             </w:pPr>
             <w:r>
               <w:t xml:space="preserve">30%</w:t>
@@ -2911,7 +2871,7 @@
           <w:p>
             <w:pPr>
               <w:pStyle w:val="Compact"/>
-              <w:jc w:val="both"/>
+              <w:jc w:val="left"/>
             </w:pPr>
             <w:r>
               <w:t xml:space="preserve">148,314</w:t>
@@ -2923,7 +2883,7 @@
           <w:p>
             <w:pPr>
               <w:pStyle w:val="Compact"/>
-              <w:jc w:val="both"/>
+              <w:jc w:val="left"/>
             </w:pPr>
             <w:r>
               <w:t xml:space="preserve">Postdoctoral researcher; GPU rentals for cap sweeps</w:t>
@@ -2937,7 +2897,7 @@
           <w:p>
             <w:pPr>
               <w:pStyle w:val="Compact"/>
-              <w:jc w:val="both"/>
+              <w:jc w:val="left"/>
             </w:pPr>
             <w:r>
               <w:t xml:space="preserve">M9–M16 (WP2 ends; WP3; WP4 begins)</w:t>
@@ -2949,7 +2909,7 @@
           <w:p>
             <w:pPr>
               <w:pStyle w:val="Compact"/>
-              <w:jc w:val="both"/>
+              <w:jc w:val="left"/>
             </w:pPr>
             <w:r>
               <w:t xml:space="preserve">33%</w:t>
@@ -2961,7 +2921,7 @@
           <w:p>
             <w:pPr>
               <w:pStyle w:val="Compact"/>
-              <w:jc w:val="both"/>
+              <w:jc w:val="left"/>
             </w:pPr>
             <w:r>
               <w:t xml:space="preserve">163,145</w:t>
@@ -2973,7 +2933,7 @@
           <w:p>
             <w:pPr>
               <w:pStyle w:val="Compact"/>
-              <w:jc w:val="both"/>
+              <w:jc w:val="left"/>
             </w:pPr>
             <w:r>
               <w:t xml:space="preserve">Postdoctoral researcher; card-model rentals for transfer validation; twin and controller work</w:t>
@@ -2987,7 +2947,7 @@
           <w:p>
             <w:pPr>
               <w:pStyle w:val="Compact"/>
-              <w:jc w:val="both"/>
+              <w:jc w:val="left"/>
             </w:pPr>
             <w:r>
               <w:t xml:space="preserve">M17–M21 (WP4 ends; WP5)</w:t>
@@ -2999,7 +2959,7 @@
           <w:p>
             <w:pPr>
               <w:pStyle w:val="Compact"/>
-              <w:jc w:val="both"/>
+              <w:jc w:val="left"/>
             </w:pPr>
             <w:r>
               <w:t xml:space="preserve">25%</w:t>
@@ -3011,7 +2971,7 @@
           <w:p>
             <w:pPr>
               <w:pStyle w:val="Compact"/>
-              <w:jc w:val="both"/>
+              <w:jc w:val="left"/>
             </w:pPr>
             <w:r>
               <w:t xml:space="preserve">123,595</w:t>
@@ -3023,7 +2983,7 @@
           <w:p>
             <w:pPr>
               <w:pStyle w:val="Compact"/>
-              <w:jc w:val="both"/>
+              <w:jc w:val="left"/>
             </w:pPr>
             <w:r>
               <w:t xml:space="preserve">Postdoctoral researcher; BMC-metered rentals; flexibility campaign</w:t>
@@ -3037,7 +2997,7 @@
           <w:p>
             <w:pPr>
               <w:pStyle w:val="Compact"/>
-              <w:jc w:val="both"/>
+              <w:jc w:val="left"/>
             </w:pPr>
             <w:r>
               <w:t xml:space="preserve">M22–M24 (WP5: release and validation)</w:t>
@@ -3049,7 +3009,7 @@
           <w:p>
             <w:pPr>
               <w:pStyle w:val="Compact"/>
-              <w:jc w:val="both"/>
+              <w:jc w:val="left"/>
             </w:pPr>
             <w:r>
               <w:t xml:space="preserve">12%</w:t>
@@ -3061,7 +3021,7 @@
           <w:p>
             <w:pPr>
               <w:pStyle w:val="Compact"/>
-              <w:jc w:val="both"/>
+              <w:jc w:val="left"/>
             </w:pPr>
             <w:r>
               <w:t xml:space="preserve">59,326</w:t>
@@ -3073,7 +3033,7 @@
           <w:p>
             <w:pPr>
               <w:pStyle w:val="Compact"/>
-              <w:jc w:val="both"/>
+              <w:jc w:val="left"/>
             </w:pPr>
             <w:r>
               <w:t xml:space="preserve">Postdoctoral researcher; metered validation runs; documentation; dissemination and publication</w:t>
@@ -3089,7 +3049,7 @@
           <w:p>
             <w:pPr>
               <w:pStyle w:val="Compact"/>
-              <w:jc w:val="both"/>
+              <w:jc w:val="left"/>
             </w:pPr>
             <w:r>
               <w:rPr>
@@ -3105,7 +3065,7 @@
           <w:p>
             <w:pPr>
               <w:pStyle w:val="Compact"/>
-              <w:jc w:val="both"/>
+              <w:jc w:val="left"/>
             </w:pPr>
             <w:r>
               <w:rPr>
@@ -3164,7 +3124,7 @@
           <w:p>
             <w:pPr>
               <w:pStyle w:val="Compact"/>
-              <w:jc w:val="both"/>
+              <w:jc w:val="left"/>
             </w:pPr>
             <w:r>
               <w:t xml:space="preserve">Risk</w:t>
@@ -3176,7 +3136,7 @@
           <w:p>
             <w:pPr>
               <w:pStyle w:val="Compact"/>
-              <w:jc w:val="both"/>
+              <w:jc w:val="left"/>
             </w:pPr>
             <w:r>
               <w:t xml:space="preserve">Impact</w:t>
@@ -3188,7 +3148,7 @@
           <w:p>
             <w:pPr>
               <w:pStyle w:val="Compact"/>
-              <w:jc w:val="both"/>
+              <w:jc w:val="left"/>
             </w:pPr>
             <w:r>
               <w:t xml:space="preserve">Mitigation</w:t>
@@ -3202,7 +3162,7 @@
           <w:p>
             <w:pPr>
               <w:pStyle w:val="Compact"/>
-              <w:jc w:val="both"/>
+              <w:jc w:val="left"/>
             </w:pPr>
             <w:r>
               <w:t xml:space="preserve">Production serving software (continuous batching, shifting phases) blurs the per-card constant</w:t>
@@ -3214,7 +3174,7 @@
           <w:p>
             <w:pPr>
               <w:pStyle w:val="Compact"/>
-              <w:jc w:val="both"/>
+              <w:jc w:val="left"/>
             </w:pPr>
             <w:r>
               <w:t xml:space="preserve">Static cap loses near-optimality for LLMs</w:t>
@@ -3226,7 +3186,7 @@
           <w:p>
             <w:pPr>
               <w:pStyle w:val="Compact"/>
-              <w:jc w:val="both"/>
+              <w:jc w:val="left"/>
             </w:pPr>
             <w:r>
               <w:t xml:space="preserve">Measured first (WP1, M1); the job model predicts the optimum where the constant breaks</w:t>
@@ -3240,7 +3200,7 @@
           <w:p>
             <w:pPr>
               <w:pStyle w:val="Compact"/>
-              <w:jc w:val="both"/>
+              <w:jc w:val="left"/>
             </w:pPr>
             <w:r>
               <w:t xml:space="preserve">Power-cap control unavailable on some rented platforms</w:t>
@@ -3252,7 +3212,7 @@
           <w:p>
             <w:pPr>
               <w:pStyle w:val="Compact"/>
-              <w:jc w:val="both"/>
+              <w:jc w:val="left"/>
             </w:pPr>
             <w:r>
               <w:t xml:space="preserve">Measurement campaign narrowed</w:t>
@@ -3264,7 +3224,7 @@
           <w:p>
             <w:pPr>
               <w:pStyle w:val="Compact"/>
-              <w:jc w:val="both"/>
+              <w:jc w:val="left"/>
             </w:pPr>
             <w:r>
               <w:t xml:space="preserve">AWS EC2 gives passthrough and root; too-high cap floors are exposed via the graphics clock (L4 [1]); BMC rentals cover the wall tier</w:t>
@@ -3278,7 +3238,7 @@
           <w:p>
             <w:pPr>
               <w:pStyle w:val="Compact"/>
-              <w:jc w:val="both"/>
+              <w:jc w:val="left"/>
             </w:pPr>
             <w:r>
               <w:t xml:space="preserve">Postdoc recruitment slips, or the single hire is lost mid-project</w:t>
@@ -3290,7 +3250,7 @@
           <w:p>
             <w:pPr>
               <w:pStyle w:val="Compact"/>
-              <w:jc w:val="both"/>
+              <w:jc w:val="left"/>
             </w:pPr>
             <w:r>
               <w:t xml:space="preserve">Schedule and delivery at risk</w:t>
@@ -3302,7 +3262,7 @@
           <w:p>
             <w:pPr>
               <w:pStyle w:val="Compact"/>
-              <w:jc w:val="both"/>
+              <w:jc w:val="left"/>
             </w:pPr>
             <w:r>
               <w:t xml:space="preserve">PI runs the WP1 bench directly (the ELF harness is his); the minimum-success path is one-FTE executable; recruitment via HIT and national channels with a fallback</w:t>
@@ -3316,7 +3276,7 @@
           <w:p>
             <w:pPr>
               <w:pStyle w:val="Compact"/>
-              <w:jc w:val="both"/>
+              <w:jc w:val="left"/>
             </w:pPr>
             <w:r>
               <w:t xml:space="preserve">Out-of-band PSU telemetry (BMC/IPMI/Redfish) blocked on a rented server</w:t>
@@ -3328,7 +3288,7 @@
           <w:p>
             <w:pPr>
               <w:pStyle w:val="Compact"/>
-              <w:jc w:val="both"/>
+              <w:jc w:val="left"/>
             </w:pPr>
             <w:r>
               <w:t xml:space="preserve">Wall-tier measurement narrowed</w:t>
@@ -3340,7 +3300,7 @@
           <w:p>
             <w:pPr>
               <w:pStyle w:val="Compact"/>
-              <w:jc w:val="both"/>
+              <w:jc w:val="left"/>
             </w:pPr>
             <w:r>
               <w:t xml:space="preserve">Named BMC-capable bare-metal vendors with dated quotes (GPU Mart and equivalents); fallback to an in-line metered PDU at the wall</w:t>
@@ -3363,7 +3323,6 @@
     <w:p>
       <w:pPr>
         <w:pStyle w:val="FirstParagraph"/>
-        <w:jc w:val="both"/>
       </w:pPr>
       <w:r>
         <w:rPr>
@@ -3382,7 +3341,6 @@
     <w:p>
       <w:pPr>
         <w:pStyle w:val="BodyText"/>
-        <w:jc w:val="both"/>
       </w:pPr>
       <w:r>
         <w:rPr>
@@ -3428,7 +3386,6 @@
     <w:p>
       <w:pPr>
         <w:pStyle w:val="BodyText"/>
-        <w:jc w:val="both"/>
       </w:pPr>
       <w:r>
         <w:rPr>
@@ -3447,7 +3404,6 @@
     <w:p>
       <w:pPr>
         <w:pStyle w:val="BodyText"/>
-        <w:jc w:val="both"/>
       </w:pPr>
       <w:r>
         <w:rPr>
@@ -3503,7 +3459,6 @@
           <w:ilvl w:val="0"/>
           <w:numId w:val="1004"/>
         </w:numPr>
-        <w:jc w:val="both"/>
       </w:pPr>
       <w:r>
         <w:t xml:space="preserve">Apartsin, A. and Aperstein, Y. (2026).</w:t>
@@ -3549,7 +3504,6 @@
           <w:ilvl w:val="0"/>
           <w:numId w:val="1004"/>
         </w:numPr>
-        <w:jc w:val="both"/>
       </w:pPr>
       <w:r>
         <w:t xml:space="preserve">JNS (22 July 2026).</w:t>
@@ -3578,7 +3532,6 @@
           <w:ilvl w:val="0"/>
           <w:numId w:val="1004"/>
         </w:numPr>
-        <w:jc w:val="both"/>
       </w:pPr>
       <w:r>
         <w:t xml:space="preserve">International Energy Agency (2025).</w:t>
@@ -3607,7 +3560,6 @@
           <w:ilvl w:val="0"/>
           <w:numId w:val="1004"/>
         </w:numPr>
-        <w:jc w:val="both"/>
       </w:pPr>
       <w:r>
         <w:t xml:space="preserve">Barroso, L. A. and Hölzle, U. (2007).</w:t>
@@ -3636,7 +3588,6 @@
           <w:ilvl w:val="0"/>
           <w:numId w:val="1004"/>
         </w:numPr>
-        <w:jc w:val="both"/>
       </w:pPr>
       <w:r>
         <w:t xml:space="preserve">Yao, F., Demers, A., and Shenker, S. (1995).</w:t>
@@ -3665,7 +3616,6 @@
           <w:ilvl w:val="0"/>
           <w:numId w:val="1004"/>
         </w:numPr>
-        <w:jc w:val="both"/>
       </w:pPr>
       <w:r>
         <w:t xml:space="preserve">Miyoshi, A., Lefurgy, C., Van Hensbergen, E., Rajamony, R., and Rajkumar, R. (2002).</w:t>
@@ -3694,7 +3644,6 @@
           <w:ilvl w:val="0"/>
           <w:numId w:val="1004"/>
         </w:numPr>
-        <w:jc w:val="both"/>
       </w:pPr>
       <w:r>
         <w:t xml:space="preserve">Gandhi, A., Harchol-Balter, M., Das, R., and Lefurgy, C. (2009).</w:t>
@@ -3723,7 +3672,6 @@
           <w:ilvl w:val="0"/>
           <w:numId w:val="1004"/>
         </w:numPr>
-        <w:jc w:val="both"/>
       </w:pPr>
       <w:r>
         <w:t xml:space="preserve">You, J., Chung, J.-W., and Chowdhury, M. (2022).</w:t>
@@ -3752,7 +3700,6 @@
           <w:ilvl w:val="0"/>
           <w:numId w:val="1004"/>
         </w:numPr>
-        <w:jc w:val="both"/>
       </w:pPr>
       <w:r>
         <w:t xml:space="preserve">Chung, J.-W., Ma, J. J., Wu, R., et al. (2025).</w:t>
@@ -3781,7 +3728,6 @@
           <w:ilvl w:val="0"/>
           <w:numId w:val="1004"/>
         </w:numPr>
-        <w:jc w:val="both"/>
       </w:pPr>
       <w:r>
         <w:t xml:space="preserve">Chung, J.-W., Wu, R., Ma, J. J., et al. (2026).</w:t>
@@ -3810,7 +3756,6 @@
           <w:ilvl w:val="0"/>
           <w:numId w:val="1004"/>
         </w:numPr>
-        <w:jc w:val="both"/>
       </w:pPr>
       <w:r>
         <w:t xml:space="preserve">Hu, Q., Sun, P., Yan, S., Wen, Y., et al. (2021).</w:t>
@@ -3839,7 +3784,6 @@
           <w:ilvl w:val="0"/>
           <w:numId w:val="1004"/>
         </w:numPr>
-        <w:jc w:val="both"/>
       </w:pPr>
       <w:r>
         <w:t xml:space="preserve">Alibaba Group (2020).</w:t>
@@ -3868,7 +3812,6 @@
           <w:ilvl w:val="0"/>
           <w:numId w:val="1004"/>
         </w:numPr>
-        <w:jc w:val="both"/>
       </w:pPr>
       <w:r>
         <w:t xml:space="preserve">Lipe, E., Karia, N., Espenshade, C., Stein, C., Tantawi, A., and Tardieu, O. (2026).</w:t>
@@ -3897,7 +3840,6 @@
           <w:ilvl w:val="0"/>
           <w:numId w:val="1004"/>
         </w:numPr>
-        <w:jc w:val="both"/>
       </w:pPr>
       <w:r>
         <w:t xml:space="preserve">Lu, T. and Reda, S. (2026).</w:t>
@@ -3926,7 +3868,6 @@
           <w:ilvl w:val="0"/>
           <w:numId w:val="1004"/>
         </w:numPr>
-        <w:jc w:val="both"/>
       </w:pPr>
       <w:r>
         <w:t xml:space="preserve">Rodriguez, C., Degioanni, L., Kameni, L., Vidal, R., et al. (2024).</w:t>
@@ -3955,7 +3896,6 @@
           <w:ilvl w:val="0"/>
           <w:numId w:val="1004"/>
         </w:numPr>
-        <w:jc w:val="both"/>
       </w:pPr>
       <w:r>
         <w:t xml:space="preserve">Kwon, W., Li, Z., Zhuang, S., et al. (2023).</w:t>
@@ -4075,7 +4015,6 @@
           <w:ilvl w:val="0"/>
           <w:numId w:val="1004"/>
         </w:numPr>
-        <w:jc w:val="both"/>
       </w:pPr>
       <w:r>
         <w:t xml:space="preserve">Ma, Y., Srinivasan, S., and Wang, X. (2025).</w:t>
@@ -4118,7 +4057,6 @@
           <w:ilvl w:val="0"/>
           <w:numId w:val="1004"/>
         </w:numPr>
-        <w:jc w:val="both"/>
       </w:pPr>
       <w:r>
         <w:t xml:space="preserve">Colangelo, P., Coskun, A. K., Megrue, J., et al. (2025).</w:t>
@@ -4161,7 +4099,6 @@
           <w:ilvl w:val="0"/>
           <w:numId w:val="1004"/>
         </w:numPr>
-        <w:jc w:val="both"/>
       </w:pPr>
       <w:r>
         <w:t xml:space="preserve">Fadel Argerich, M., Fürst, J., and Patiño-Martínez, M. (2026).</w:t>
@@ -4190,7 +4127,6 @@
           <w:ilvl w:val="0"/>
           <w:numId w:val="1004"/>
         </w:numPr>
-        <w:jc w:val="both"/>
       </w:pPr>
       <w:r>
         <w:t xml:space="preserve">Ma, B., Afzal, A., Eitzinger, J., and Wellein, G. (2026).</w:t>
@@ -4255,12 +4191,11 @@
     <w:p>
       <w:pPr>
         <w:pStyle w:val="CaptionedFigure"/>
-        <w:jc w:val="both"/>
       </w:pPr>
       <w:r>
         <w:drawing>
           <wp:inline>
-            <wp:extent cx="5334000" cy="1694033"/>
+            <wp:extent cx="5727700" cy="1819068"/>
             <wp:effectExtent b="0" l="0" r="0" t="0"/>
             <wp:docPr descr="The response law P(theta)=P0+a*theta^beta is a card property" title="" id="52" name="Picture"/>
             <a:graphic>
@@ -4281,7 +4216,7 @@
                   <pic:spPr bwMode="auto">
                     <a:xfrm>
                       <a:off x="0" y="0"/>
-                      <a:ext cx="5334000" cy="1694033"/>
+                      <a:ext cx="5727700" cy="1819068"/>
                     </a:xfrm>
                     <a:prstGeom prst="rect">
                       <a:avLst/>
@@ -4303,7 +4238,6 @@
     <w:p>
       <w:pPr>
         <w:pStyle w:val="ImageCaption"/>
-        <w:jc w:val="both"/>
       </w:pPr>
       <w:r>
         <w:t xml:space="preserve">Figure A1.</w:t>
@@ -4342,12 +4276,11 @@
     <w:p>
       <w:pPr>
         <w:pStyle w:val="CaptionedFigure"/>
-        <w:jc w:val="both"/>
       </w:pPr>
       <w:r>
         <w:drawing>
           <wp:inline>
-            <wp:extent cx="5334000" cy="3681564"/>
+            <wp:extent cx="5727700" cy="3953299"/>
             <wp:effectExtent b="0" l="0" r="0" t="0"/>
             <wp:docPr descr="Energy per inference is U-shaped in the power cap; the minimum is the JP" title="" id="55" name="Picture"/>
             <a:graphic>
@@ -4368,7 +4301,7 @@
                   <pic:spPr bwMode="auto">
                     <a:xfrm>
                       <a:off x="0" y="0"/>
-                      <a:ext cx="5334000" cy="3681564"/>
+                      <a:ext cx="5727700" cy="3953299"/>
                     </a:xfrm>
                     <a:prstGeom prst="rect">
                       <a:avLst/>
@@ -4390,7 +4323,6 @@
     <w:p>
       <w:pPr>
         <w:pStyle w:val="ImageCaption"/>
-        <w:jc w:val="both"/>
       </w:pPr>
       <w:r>
         <w:t xml:space="preserve">Figure A2.</w:t>
@@ -4429,12 +4361,11 @@
     <w:p>
       <w:pPr>
         <w:pStyle w:val="CaptionedFigure"/>
-        <w:jc w:val="both"/>
       </w:pPr>
       <w:r>
         <w:drawing>
           <wp:inline>
-            <wp:extent cx="5334000" cy="3476837"/>
+            <wp:extent cx="5727700" cy="3733460"/>
             <wp:effectExtent b="0" l="0" r="0" t="0"/>
             <wp:docPr descr="Behind a fixed power feed, inferences per megawatt peak at the JP" title="" id="58" name="Picture"/>
             <a:graphic>
@@ -4455,7 +4386,7 @@
                   <pic:spPr bwMode="auto">
                     <a:xfrm>
                       <a:off x="0" y="0"/>
-                      <a:ext cx="5334000" cy="3476837"/>
+                      <a:ext cx="5727700" cy="3733460"/>
                     </a:xfrm>
                     <a:prstGeom prst="rect">
                       <a:avLst/>
@@ -4477,7 +4408,6 @@
     <w:p>
       <w:pPr>
         <w:pStyle w:val="ImageCaption"/>
-        <w:jc w:val="both"/>
       </w:pPr>
       <w:r>
         <w:t xml:space="preserve">Figure A3.</w:t>
@@ -4538,7 +4468,7 @@
           <w:tcPr/>
           <w:p>
             <w:pPr>
-              <w:jc w:val="both"/>
+              <w:jc w:val="center"/>
             </w:pPr>
             <w:r>
               <w:t xml:space="preserve">The project delivers five named artifacts, each with a defined user and use:</w:t>
@@ -4828,18 +4758,13 @@
               </w:tc>
             </w:tr>
           </w:tbl>
-          <w:p>
-            <w:pPr>
-              <w:jc w:val="both"/>
-            </w:pPr>
-          </w:p>
+          <w:p/>
         </w:tc>
       </w:tr>
     </w:tbl>
     <w:p>
       <w:pPr>
         <w:pStyle w:val="ImageCaption"/>
-        <w:jc w:val="both"/>
       </w:pPr>
       <w:r>
         <w:t xml:space="preserve">Table A1.</w:t>
@@ -4864,7 +4789,10 @@
       </w:r>
     </w:p>
     <w:bookmarkEnd w:id="61"/>
-    <w:sectPr/>
+    <w:sectPr>
+      <w:pgSz w:h="16838" w:w="11906"/>
+      <w:pgMar w:bottom="1440" w:left="1440" w:right="1440" w:top="1440"/>
+    </w:sectPr>
   </w:body>
 </w:document>
 </file>
@@ -5224,6 +5152,15 @@
   <w:style w:default="1" w:styleId="Normal" w:type="paragraph">
     <w:name w:val="Normal"/>
     <w:qFormat/>
+    <w:pPr>
+      <w:spacing w:after="80" w:before="0" w:line="312" w:lineRule="auto"/>
+      <w:jc w:val="both"/>
+    </w:pPr>
+    <w:rPr>
+      <w:rFonts w:ascii="David" w:cs="David" w:hAnsi="David"/>
+      <w:color w:val="111111"/>
+      <w:sz w:val="24"/>
+    </w:rPr>
   </w:style>
   <w:style w:styleId="BodyText" w:type="paragraph">
     <w:name w:val="Body Text"/>
@@ -5231,22 +5168,43 @@
     <w:link w:val="BodyTextChar"/>
     <w:qFormat/>
     <w:pPr>
-      <w:spacing w:after="180" w:before="180"/>
+      <w:spacing w:after="80" w:before="0" w:line="312" w:lineRule="auto"/>
+      <w:jc w:val="both"/>
     </w:pPr>
+    <w:rPr>
+      <w:rFonts w:ascii="David" w:cs="David" w:hAnsi="David"/>
+      <w:color w:val="111111"/>
+      <w:sz w:val="24"/>
+    </w:rPr>
   </w:style>
   <w:style w:customStyle="1" w:styleId="FirstParagraph" w:type="paragraph">
     <w:name w:val="First Paragraph"/>
     <w:basedOn w:val="BodyText"/>
     <w:next w:val="BodyText"/>
     <w:qFormat/>
+    <w:pPr>
+      <w:spacing w:after="80" w:before="0" w:line="312" w:lineRule="auto"/>
+      <w:jc w:val="both"/>
+    </w:pPr>
+    <w:rPr>
+      <w:rFonts w:ascii="David" w:cs="David" w:hAnsi="David"/>
+      <w:color w:val="111111"/>
+      <w:sz w:val="24"/>
+    </w:rPr>
   </w:style>
   <w:style w:customStyle="1" w:styleId="Compact" w:type="paragraph">
     <w:name w:val="Compact"/>
     <w:basedOn w:val="BodyText"/>
     <w:qFormat/>
     <w:pPr>
-      <w:spacing w:after="36" w:before="36"/>
+      <w:spacing w:after="80" w:before="0" w:line="312" w:lineRule="auto"/>
+      <w:jc w:val="both"/>
     </w:pPr>
+    <w:rPr>
+      <w:rFonts w:ascii="David" w:cs="David" w:hAnsi="David"/>
+      <w:color w:val="111111"/>
+      <w:sz w:val="24"/>
+    </w:rPr>
   </w:style>
   <w:style w:styleId="Title" w:type="paragraph">
     <w:name w:val="Title"/>
@@ -5256,15 +5214,15 @@
     <w:pPr>
       <w:keepNext/>
       <w:keepLines/>
-      <w:spacing w:after="240" w:before="480"/>
-      <w:jc w:val="center"/>
+      <w:spacing w:after="60" w:before="160" w:line="264" w:lineRule="auto"/>
+      <w:jc w:val="left"/>
     </w:pPr>
     <w:rPr>
-      <w:rFonts w:asciiTheme="majorHAnsi" w:cstheme="majorBidi" w:eastAsiaTheme="majorEastAsia" w:hAnsiTheme="majorHAnsi"/>
+      <w:rFonts w:ascii="David" w:asciiTheme="majorHAnsi" w:cs="David" w:cstheme="majorBidi" w:eastAsiaTheme="majorEastAsia" w:hAnsi="David" w:hAnsiTheme="majorHAnsi"/>
       <w:b/>
       <w:bCs/>
-      <w:color w:themeColor="accent1" w:themeShade="B5" w:val="345A8A"/>
-      <w:sz w:val="36"/>
+      <w:color w:val="0B4F6C"/>
+      <w:sz w:val="32"/>
       <w:szCs w:val="36"/>
     </w:rPr>
   </w:style>

</xml_diff>

<commit_message>
Proposal Word: table borders + heading rule to match PDF
Co-Authored-By: Claude Opus 4.8 <noreply@anthropic.com>
</commit_message>
<xml_diff>
--- a/JouleFlex-proposal-2026-09-06.docx
+++ b/JouleFlex-proposal-2026-09-06.docx
@@ -20,6 +20,9 @@
     <w:p>
       <w:pPr>
         <w:pStyle w:val="Heading2"/>
+        <w:pBdr>
+          <w:bottom w:val="single" w:sz="6" w:space="2" w:color="C8C8C8"/>
+        </w:pBdr>
       </w:pPr>
       <w:r>
         <w:t xml:space="preserve">2.5.1 Title, researchers and institution</w:t>
@@ -119,6 +122,9 @@
     <w:p>
       <w:pPr>
         <w:pStyle w:val="Heading2"/>
+        <w:pBdr>
+          <w:bottom w:val="single" w:sz="6" w:space="2" w:color="C8C8C8"/>
+        </w:pBdr>
         <w:bidi/>
         <w:jc w:val="right"/>
       </w:pPr>
@@ -141,6 +147,7 @@
     <w:p>
       <w:pPr>
         <w:pStyle w:val="FirstParagraph"/>
+        <w:jc w:val="both"/>
       </w:pPr>
       <w:r>
         <w:t xml:space="preserve">In July 2026 Israel's Electricity Authority froze new data-center connection requests after the queue reached 27,000 megawatts. Under electricity limits, data centers switch GPUs (AI processors) off or cap their power, deciding in watts (the momentary draw), not joules (the energy consumed). A capped GPU computes slower and pays its fixed power floor longer, so energy per unit of useful work can rise even as the meter shows fewer watts: less AI per kilowatt-hour. A similar challenge exists in aviation, where it is solved: fuel flow rises far faster than speed, yet slow flight burns fuel longer, so airlines cruise at the speed minimizing fuel per kilometer.</w:t>
@@ -149,6 +156,7 @@
     <w:p>
       <w:pPr>
         <w:pStyle w:val="BodyText"/>
+        <w:jc w:val="both"/>
       </w:pPr>
       <w:r>
         <w:t xml:space="preserve">The PI's recent study [1] measured the time-power tradeoff for AI workloads (5,500 measurements, 20 models, four GPUs). Energy per task is U-shaped in the power cap. On the large GPUs its minimum, the Joule Point (JP), sits at 43 to 46 percent of rated power; holding a card there cut energy per task 29 to 31 percent while running 1.2 times slower. Even under a strict deadline, capping saved 28 percent of energy while keeping 95 percent of workload value. A fleet simulation on the measured curves (only scheduling simulated) served equal work with 18 to 45 percent less energy.</w:t>
@@ -157,6 +165,7 @@
     <w:p>
       <w:pPr>
         <w:pStyle w:val="BodyText"/>
+        <w:jc w:val="both"/>
       </w:pPr>
       <w:r>
         <w:t xml:space="preserve">These insights change how AI data centers are planned, managed, and priced, raising decisions no current tool supports: how to design a flexible-connection-ready fleet whose cards run near their JP; how to measure and predict the JP for new cards and jobs; and how to price service to motivate customers toward efficiency, not per-hour billing rewarding the energy-worst point.</w:t>
@@ -228,6 +237,9 @@
     <w:p>
       <w:pPr>
         <w:pStyle w:val="Heading2"/>
+        <w:pBdr>
+          <w:bottom w:val="single" w:sz="6" w:space="2" w:color="C8C8C8"/>
+        </w:pBdr>
       </w:pPr>
       <w:r>
         <w:t xml:space="preserve">2.5.3 Glossary</w:t>
@@ -238,6 +250,14 @@
         <w:tblStyle w:val="Table"/>
         <w:tblW w:type="auto" w:w="0"/>
         <w:tblLook w:firstRow="1" w:lastRow="0" w:firstColumn="0" w:lastColumn="0" w:noHBand="0" w:noVBand="0" w:val="0020"/>
+        <w:tblBorders>
+          <w:top w:val="single" w:sz="6" w:space="0" w:color="C8C8C8"/>
+          <w:left w:val="single" w:sz="6" w:space="0" w:color="C8C8C8"/>
+          <w:bottom w:val="single" w:sz="6" w:space="0" w:color="C8C8C8"/>
+          <w:right w:val="single" w:sz="6" w:space="0" w:color="C8C8C8"/>
+          <w:insideH w:val="single" w:sz="6" w:space="0" w:color="C8C8C8"/>
+          <w:insideV w:val="single" w:sz="6" w:space="0" w:color="C8C8C8"/>
+        </w:tblBorders>
       </w:tblPr>
       <w:tblGrid>
         <w:gridCol w:w="3960"/>
@@ -252,7 +272,7 @@
           <w:p>
             <w:pPr>
               <w:pStyle w:val="Compact"/>
-              <w:jc w:val="left"/>
+              <w:jc w:val="both"/>
             </w:pPr>
             <w:r>
               <w:t xml:space="preserve">Term</w:t>
@@ -264,7 +284,7 @@
           <w:p>
             <w:pPr>
               <w:pStyle w:val="Compact"/>
-              <w:jc w:val="left"/>
+              <w:jc w:val="both"/>
             </w:pPr>
             <w:r>
               <w:t xml:space="preserve">Meaning</w:t>
@@ -278,7 +298,7 @@
           <w:p>
             <w:pPr>
               <w:pStyle w:val="Compact"/>
-              <w:jc w:val="left"/>
+              <w:jc w:val="both"/>
             </w:pPr>
             <w:r>
               <w:t xml:space="preserve">Power</w:t>
@@ -290,7 +310,7 @@
           <w:p>
             <w:pPr>
               <w:pStyle w:val="Compact"/>
-              <w:jc w:val="left"/>
+              <w:jc w:val="both"/>
             </w:pPr>
             <w:r>
               <w:t xml:space="preserve">How fast electricity is drawn at a given moment; watts (W) or megawatts (MW). The grid connection is sized by peak power.</w:t>
@@ -304,7 +324,7 @@
           <w:p>
             <w:pPr>
               <w:pStyle w:val="Compact"/>
-              <w:jc w:val="left"/>
+              <w:jc w:val="both"/>
             </w:pPr>
             <w:r>
               <w:t xml:space="preserve">Energy</w:t>
@@ -316,7 +336,7 @@
           <w:p>
             <w:pPr>
               <w:pStyle w:val="Compact"/>
-              <w:jc w:val="left"/>
+              <w:jc w:val="both"/>
             </w:pPr>
             <w:r>
               <w:t xml:space="preserve">The total electricity consumed: power × time; joules or kilowatt-hours. The bill and the carbon footprint are set by energy.</w:t>
@@ -330,7 +350,7 @@
           <w:p>
             <w:pPr>
               <w:pStyle w:val="Compact"/>
-              <w:jc w:val="left"/>
+              <w:jc w:val="both"/>
             </w:pPr>
             <w:r>
               <w:t xml:space="preserve">Power cap</w:t>
@@ -342,7 +362,7 @@
           <w:p>
             <w:pPr>
               <w:pStyle w:val="Compact"/>
-              <w:jc w:val="left"/>
+              <w:jc w:val="both"/>
             </w:pPr>
             <w:r>
               <w:t xml:space="preserve">A software limit on a GPU's power draw. Set with one command; takes effect in ~0.2 seconds. The control knob of this project.</w:t>
@@ -356,7 +376,7 @@
           <w:p>
             <w:pPr>
               <w:pStyle w:val="Compact"/>
-              <w:jc w:val="left"/>
+              <w:jc w:val="both"/>
             </w:pPr>
             <w:r>
               <w:t xml:space="preserve">TDP</w:t>
@@ -368,7 +388,7 @@
           <w:p>
             <w:pPr>
               <w:pStyle w:val="Compact"/>
-              <w:jc w:val="left"/>
+              <w:jc w:val="both"/>
             </w:pPr>
             <w:r>
               <w:t xml:space="preserve">A GPU's full rated power. Running at TDP is today's default.</w:t>
@@ -382,7 +402,7 @@
           <w:p>
             <w:pPr>
               <w:pStyle w:val="Compact"/>
-              <w:jc w:val="left"/>
+              <w:jc w:val="both"/>
             </w:pPr>
             <w:r>
               <w:t xml:space="preserve">Joule Point (JP)</w:t>
@@ -394,7 +414,7 @@
           <w:p>
             <w:pPr>
               <w:pStyle w:val="Compact"/>
-              <w:jc w:val="left"/>
+              <w:jc w:val="both"/>
             </w:pPr>
             <w:r>
               <w:t xml:space="preserve">The power cap at which energy per task is lowest for a given card; measured at 43–46% of TDP on large GPUs.</w:t>
@@ -408,7 +428,7 @@
           <w:p>
             <w:pPr>
               <w:pStyle w:val="Compact"/>
-              <w:jc w:val="left"/>
+              <w:jc w:val="both"/>
             </w:pPr>
             <w:r>
               <w:t xml:space="preserve">Operating point</w:t>
@@ -420,7 +440,7 @@
           <w:p>
             <w:pPr>
               <w:pStyle w:val="Compact"/>
-              <w:jc w:val="left"/>
+              <w:jc w:val="both"/>
             </w:pPr>
             <w:r>
               <w:t xml:space="preserve">The pair (GPU, power cap) a job runs at.</w:t>
@@ -434,7 +454,7 @@
           <w:p>
             <w:pPr>
               <w:pStyle w:val="Compact"/>
-              <w:jc w:val="left"/>
+              <w:jc w:val="both"/>
             </w:pPr>
             <w:r>
               <w:t xml:space="preserve">Power envelope</w:t>
@@ -446,7 +466,7 @@
           <w:p>
             <w:pPr>
               <w:pStyle w:val="Compact"/>
-              <w:jc w:val="left"/>
+              <w:jc w:val="both"/>
             </w:pPr>
             <w:r>
               <w:t xml:space="preserve">A limit on a facility's total power draw that can change over time, set by a budget, a price or carbon signal, or a grid instruction.</w:t>
@@ -460,7 +480,7 @@
           <w:p>
             <w:pPr>
               <w:pStyle w:val="Compact"/>
-              <w:jc w:val="left"/>
+              <w:jc w:val="both"/>
             </w:pPr>
             <w:r>
               <w:t xml:space="preserve">Power shaping</w:t>
@@ -472,7 +492,7 @@
           <w:p>
             <w:pPr>
               <w:pStyle w:val="Compact"/>
-              <w:jc w:val="left"/>
+              <w:jc w:val="both"/>
             </w:pPr>
             <w:r>
               <w:t xml:space="preserve">Keeping a fleet inside a power envelope by capping jobs, like traffic shaping in networks.</w:t>
@@ -486,7 +506,7 @@
           <w:p>
             <w:pPr>
               <w:pStyle w:val="Compact"/>
-              <w:jc w:val="left"/>
+              <w:jc w:val="both"/>
             </w:pPr>
             <w:r>
               <w:t xml:space="preserve">ELF</w:t>
@@ -498,7 +518,7 @@
           <w:p>
             <w:pPr>
               <w:pStyle w:val="Compact"/>
-              <w:jc w:val="left"/>
+              <w:jc w:val="both"/>
             </w:pPr>
             <w:r>
               <w:t xml:space="preserve">Our released dataset: dense power-cap sweeps of 20 AI models on 4 GPUs, ~5,500 measured rows.</w:t>
@@ -512,7 +532,7 @@
           <w:p>
             <w:pPr>
               <w:pStyle w:val="Compact"/>
-              <w:jc w:val="left"/>
+              <w:jc w:val="both"/>
             </w:pPr>
             <w:r>
               <w:t xml:space="preserve">SLO</w:t>
@@ -524,7 +544,7 @@
           <w:p>
             <w:pPr>
               <w:pStyle w:val="Compact"/>
-              <w:jc w:val="left"/>
+              <w:jc w:val="both"/>
             </w:pPr>
             <w:r>
               <w:t xml:space="preserve">Service level objective: the deadline or latency a job must meet.</w:t>
@@ -538,7 +558,7 @@
           <w:p>
             <w:pPr>
               <w:pStyle w:val="Compact"/>
-              <w:jc w:val="left"/>
+              <w:jc w:val="both"/>
             </w:pPr>
             <w:r>
               <w:t xml:space="preserve">Firm / flexible capacity</w:t>
@@ -550,7 +570,7 @@
           <w:p>
             <w:pPr>
               <w:pStyle w:val="Compact"/>
-              <w:jc w:val="left"/>
+              <w:jc w:val="both"/>
             </w:pPr>
             <w:r>
               <w:t xml:space="preserve">Grid connection capacity guaranteed at all times, versus capacity given on condition that the facility reduces power when instructed.</w:t>
@@ -564,7 +584,7 @@
           <w:p>
             <w:pPr>
               <w:pStyle w:val="Compact"/>
-              <w:jc w:val="left"/>
+              <w:jc w:val="both"/>
             </w:pPr>
             <w:r>
               <w:t xml:space="preserve">Card multiplier</w:t>
@@ -576,7 +596,7 @@
           <w:p>
             <w:pPr>
               <w:pStyle w:val="Compact"/>
-              <w:jc w:val="left"/>
+              <w:jc w:val="both"/>
             </w:pPr>
             <w:r>
               <w:t xml:space="preserve">The extra cards needed to keep total throughput when capping. It equals the latency ratio (~1.2×).</w:t>
@@ -590,6 +610,9 @@
     <w:p>
       <w:pPr>
         <w:pStyle w:val="Heading2"/>
+        <w:pBdr>
+          <w:bottom w:val="single" w:sz="6" w:space="2" w:color="C8C8C8"/>
+        </w:pBdr>
       </w:pPr>
       <w:r>
         <w:t xml:space="preserve">2.5.4 Objectives of the program</w:t>
@@ -607,6 +630,7 @@
     <w:p>
       <w:pPr>
         <w:pStyle w:val="FirstParagraph"/>
+        <w:jc w:val="both"/>
       </w:pPr>
       <w:r>
         <w:t xml:space="preserve">The objective is to construct</w:t>
@@ -704,6 +728,7 @@
     <w:p>
       <w:pPr>
         <w:pStyle w:val="FirstParagraph"/>
+        <w:jc w:val="both"/>
       </w:pPr>
       <w:r>
         <w:t xml:space="preserve">Can AI data centers operate as controllable electrical loads, each GPU near its energy-optimal cap and the facility</w:t>
@@ -724,6 +749,7 @@
     <w:p>
       <w:pPr>
         <w:pStyle w:val="BodyText"/>
+        <w:jc w:val="both"/>
       </w:pPr>
       <w:r>
         <w:t xml:space="preserve">Six sub-questions structure the work plan:</w:t>
@@ -736,6 +762,7 @@
           <w:ilvl w:val="0"/>
           <w:numId w:val="1001"/>
         </w:numPr>
+        <w:jc w:val="both"/>
       </w:pPr>
       <w:r>
         <w:rPr>
@@ -758,6 +785,7 @@
           <w:ilvl w:val="0"/>
           <w:numId w:val="1001"/>
         </w:numPr>
+        <w:jc w:val="both"/>
       </w:pPr>
       <w:r>
         <w:rPr>
@@ -780,6 +808,7 @@
           <w:ilvl w:val="0"/>
           <w:numId w:val="1001"/>
         </w:numPr>
+        <w:jc w:val="both"/>
       </w:pPr>
       <w:r>
         <w:rPr>
@@ -802,6 +831,7 @@
           <w:ilvl w:val="0"/>
           <w:numId w:val="1001"/>
         </w:numPr>
+        <w:jc w:val="both"/>
       </w:pPr>
       <w:r>
         <w:rPr>
@@ -824,6 +854,7 @@
           <w:ilvl w:val="0"/>
           <w:numId w:val="1001"/>
         </w:numPr>
+        <w:jc w:val="both"/>
       </w:pPr>
       <w:r>
         <w:rPr>
@@ -846,6 +877,7 @@
           <w:ilvl w:val="0"/>
           <w:numId w:val="1001"/>
         </w:numPr>
+        <w:jc w:val="both"/>
       </w:pPr>
       <w:r>
         <w:rPr>
@@ -867,6 +899,9 @@
     <w:p>
       <w:pPr>
         <w:pStyle w:val="Heading2"/>
+        <w:pBdr>
+          <w:bottom w:val="single" w:sz="6" w:space="2" w:color="C8C8C8"/>
+        </w:pBdr>
       </w:pPr>
       <w:r>
         <w:t xml:space="preserve">2.5.5 The proposed research</w:t>
@@ -884,6 +919,7 @@
     <w:p>
       <w:pPr>
         <w:pStyle w:val="FirstParagraph"/>
+        <w:jc w:val="both"/>
       </w:pPr>
       <w:r>
         <w:rPr>
@@ -914,6 +950,7 @@
     <w:p>
       <w:pPr>
         <w:pStyle w:val="BodyText"/>
+        <w:jc w:val="both"/>
       </w:pPr>
       <w:r>
         <w:rPr>
@@ -932,6 +969,7 @@
     <w:p>
       <w:pPr>
         <w:pStyle w:val="BodyText"/>
+        <w:jc w:val="both"/>
       </w:pPr>
       <w:r>
         <w:rPr>
@@ -962,6 +1000,7 @@
     <w:p>
       <w:pPr>
         <w:pStyle w:val="BodyText"/>
+        <w:jc w:val="both"/>
       </w:pPr>
       <w:r>
         <w:t xml:space="preserve">P(θ) = P₀ + a·θ^β,   median R² = 0.99,</w:t>
@@ -970,6 +1009,7 @@
     <w:p>
       <w:pPr>
         <w:pStyle w:val="BodyText"/>
+        <w:jc w:val="both"/>
       </w:pPr>
       <w:r>
         <w:t xml:space="preserve">a fixed floor P₀ plus a superlinear term. Energy per task, E = P/θ, is therefore U-shaped in the cap; its minimum, the</w:t>
@@ -1007,6 +1047,7 @@
     <w:p>
       <w:pPr>
         <w:pStyle w:val="FirstParagraph"/>
+        <w:jc w:val="both"/>
       </w:pPr>
       <w:r>
         <w:t xml:space="preserve">Four research lines meet here.</w:t>
@@ -1135,6 +1176,7 @@
           <w:ilvl w:val="0"/>
           <w:numId w:val="1002"/>
         </w:numPr>
+        <w:jc w:val="both"/>
       </w:pPr>
       <w:r>
         <w:rPr>
@@ -1157,6 +1199,7 @@
           <w:ilvl w:val="0"/>
           <w:numId w:val="1002"/>
         </w:numPr>
+        <w:jc w:val="both"/>
       </w:pPr>
       <w:r>
         <w:rPr>
@@ -1179,6 +1222,7 @@
           <w:ilvl w:val="0"/>
           <w:numId w:val="1002"/>
         </w:numPr>
+        <w:jc w:val="both"/>
       </w:pPr>
       <w:r>
         <w:rPr>
@@ -1201,6 +1245,7 @@
           <w:ilvl w:val="0"/>
           <w:numId w:val="1002"/>
         </w:numPr>
+        <w:jc w:val="both"/>
       </w:pPr>
       <w:r>
         <w:rPr>
@@ -1223,6 +1268,7 @@
           <w:ilvl w:val="0"/>
           <w:numId w:val="1002"/>
         </w:numPr>
+        <w:jc w:val="both"/>
       </w:pPr>
       <w:r>
         <w:rPr>
@@ -1245,6 +1291,7 @@
           <w:ilvl w:val="0"/>
           <w:numId w:val="1002"/>
         </w:numPr>
+        <w:jc w:val="both"/>
       </w:pPr>
       <w:r>
         <w:rPr>
@@ -1273,6 +1320,7 @@
     <w:p>
       <w:pPr>
         <w:pStyle w:val="FirstParagraph"/>
+        <w:jc w:val="both"/>
       </w:pPr>
       <w:r>
         <w:t xml:space="preserve">JouleFlex builds one measured foundation and three tools on it: first work out the energy-optimal way to run each job on each card, then control power to achieve it.</w:t>
@@ -1332,6 +1380,14 @@
         <w:tblStyle w:val="Table"/>
         <w:tblW w:type="auto" w:w="0"/>
         <w:tblLook w:firstRow="1" w:lastRow="0" w:firstColumn="0" w:lastColumn="0" w:noHBand="0" w:noVBand="0" w:val="0020"/>
+        <w:tblBorders>
+          <w:top w:val="single" w:sz="6" w:space="0" w:color="C8C8C8"/>
+          <w:left w:val="single" w:sz="6" w:space="0" w:color="C8C8C8"/>
+          <w:bottom w:val="single" w:sz="6" w:space="0" w:color="C8C8C8"/>
+          <w:right w:val="single" w:sz="6" w:space="0" w:color="C8C8C8"/>
+          <w:insideH w:val="single" w:sz="6" w:space="0" w:color="C8C8C8"/>
+          <w:insideV w:val="single" w:sz="6" w:space="0" w:color="C8C8C8"/>
+        </w:tblBorders>
       </w:tblPr>
       <w:tblGrid>
         <w:gridCol w:w="2640"/>
@@ -1347,7 +1403,7 @@
           <w:p>
             <w:pPr>
               <w:pStyle w:val="Compact"/>
-              <w:jc w:val="left"/>
+              <w:jc w:val="both"/>
             </w:pPr>
             <w:r>
               <w:t xml:space="preserve">WP</w:t>
@@ -1359,7 +1415,7 @@
           <w:p>
             <w:pPr>
               <w:pStyle w:val="Compact"/>
-              <w:jc w:val="left"/>
+              <w:jc w:val="both"/>
             </w:pPr>
             <w:r>
               <w:t xml:space="preserve">Objective</w:t>
@@ -1371,7 +1427,7 @@
           <w:p>
             <w:pPr>
               <w:pStyle w:val="Compact"/>
-              <w:jc w:val="left"/>
+              <w:jc w:val="both"/>
             </w:pPr>
             <w:r>
               <w:t xml:space="preserve">Approach and output</w:t>
@@ -1385,7 +1441,7 @@
           <w:p>
             <w:pPr>
               <w:pStyle w:val="Compact"/>
-              <w:jc w:val="left"/>
+              <w:jc w:val="both"/>
             </w:pPr>
             <w:r>
               <w:rPr>
@@ -1401,7 +1457,7 @@
           <w:p>
             <w:pPr>
               <w:pStyle w:val="Compact"/>
-              <w:jc w:val="left"/>
+              <w:jc w:val="both"/>
             </w:pPr>
             <w:r>
               <w:t xml:space="preserve">Extend the energy-versus-power measurements to current GPUs, production software, and whole-server power.</w:t>
@@ -1413,7 +1469,7 @@
           <w:p>
             <w:pPr>
               <w:pStyle w:val="Compact"/>
-              <w:jc w:val="left"/>
+              <w:jc w:val="both"/>
             </w:pPr>
             <w:r>
               <w:t xml:space="preserve">Re-run the study's measurement sweep on new GPUs (H100/L40S class) and production serving engines (vLLM [16], TensorRT-LLM), reading power at three rented tiers: the GPU board (NVML), the host CPU domain (RAPL), and the server's power-supply input, the wall tier (BMC, read out-of-band via IPMI/Redfish). Accuracy is taken from vendor specifications and cross-checked across tiers; the JP is where the slope of P(θ) is zero, so a constant meter bias cancels in its location: the JP and per-card savings are calibration-robust, while absolute board-to-wall and megawatt figures carry that caveat.</w:t>
@@ -1443,7 +1499,7 @@
           <w:p>
             <w:pPr>
               <w:pStyle w:val="Compact"/>
-              <w:jc w:val="left"/>
+              <w:jc w:val="both"/>
             </w:pPr>
             <w:r>
               <w:rPr>
@@ -1459,7 +1515,7 @@
           <w:p>
             <w:pPr>
               <w:pStyle w:val="Compact"/>
-              <w:jc w:val="left"/>
+              <w:jc w:val="both"/>
             </w:pPr>
             <w:r>
               <w:t xml:space="preserve">Predict any new card's or job's efficient operating point without a full measurement sweep.</w:t>
@@ -1471,7 +1527,7 @@
           <w:p>
             <w:pPr>
               <w:pStyle w:val="Compact"/>
-              <w:jc w:val="left"/>
+              <w:jc w:val="both"/>
             </w:pPr>
             <w:r>
               <w:t xml:space="preserve">A job model predicts a job's best power cap from its features; a transfer model predicts a new card's curve from its published specifications plus one short test. Both report error bars and a stated range of validity, and a short proof bounds the small penalty of using one cap per card; the transfer model is a calibrated-prior predictor anchored by one test per card, its error bars reflecting the small card count.</w:t>
@@ -1501,7 +1557,7 @@
           <w:p>
             <w:pPr>
               <w:pStyle w:val="Compact"/>
-              <w:jc w:val="left"/>
+              <w:jc w:val="both"/>
             </w:pPr>
             <w:r>
               <w:rPr>
@@ -1517,7 +1573,7 @@
           <w:p>
             <w:pPr>
               <w:pStyle w:val="Compact"/>
-              <w:jc w:val="left"/>
+              <w:jc w:val="both"/>
             </w:pPr>
             <w:r>
               <w:t xml:space="preserve">Decide, in real time, which job runs on which card and at what power cap, to do the most useful work within a changing power limit.</w:t>
@@ -1529,7 +1585,7 @@
           <w:p>
             <w:pPr>
               <w:pStyle w:val="Compact"/>
-              <w:jc w:val="left"/>
+              <w:jc w:val="both"/>
             </w:pPr>
             <w:r>
               <w:t xml:space="preserve">A controller that makes both choices together, since moving a job changes the power left for the others, tested in a digital twin that replays the measured curves against exact baselines. When power is too tight it defers or rejects low-priority work and reports the cost. The joint problem is NP-hard; the per-card capping step is solved exactly.</w:t>
@@ -1559,7 +1615,7 @@
           <w:p>
             <w:pPr>
               <w:pStyle w:val="Compact"/>
-              <w:jc w:val="left"/>
+              <w:jc w:val="both"/>
             </w:pPr>
             <w:r>
               <w:rPr>
@@ -1575,7 +1631,7 @@
           <w:p>
             <w:pPr>
               <w:pStyle w:val="Compact"/>
-              <w:jc w:val="left"/>
+              <w:jc w:val="both"/>
             </w:pPr>
             <w:r>
               <w:t xml:space="preserve">Define what flexibility a controlled facility can offer the grid, and measure it.</w:t>
@@ -1587,7 +1643,7 @@
           <w:p>
             <w:pPr>
               <w:pStyle w:val="Compact"/>
-              <w:jc w:val="left"/>
+              <w:jc w:val="both"/>
             </w:pPr>
             <w:r>
               <w:t xml:space="preserve">Specify the contractable quantities, a committed power envelope, a flexibility offer, and an auditable delivery record, with ramp and recovery metrics; demonstrate them on a rented metered server and at fleet scale in the twin, under an Israeli firm-plus-flexible scenario.</w:t>
@@ -1617,7 +1673,7 @@
           <w:p>
             <w:pPr>
               <w:pStyle w:val="Compact"/>
-              <w:jc w:val="left"/>
+              <w:jc w:val="both"/>
             </w:pPr>
             <w:r>
               <w:rPr>
@@ -1633,7 +1689,7 @@
           <w:p>
             <w:pPr>
               <w:pStyle w:val="Compact"/>
-              <w:jc w:val="left"/>
+              <w:jc w:val="both"/>
             </w:pPr>
             <w:r>
               <w:t xml:space="preserve">Find pricing and connection rules that reward efficient operation, and release everything openly.</w:t>
@@ -1645,7 +1701,7 @@
           <w:p>
             <w:pPr>
               <w:pStyle w:val="Compact"/>
-              <w:jc w:val="left"/>
+              <w:jc w:val="both"/>
             </w:pPr>
             <w:r>
               <w:t xml:space="preserve">An incentive model showing why per-hour billing rewards the energy-worst point and what changes fix it; a valuation of the flexible-connection option from public Noga and Electricity Authority data; each rule tested in the WP3 twin.</w:t>
@@ -1673,6 +1729,7 @@
     <w:p>
       <w:pPr>
         <w:pStyle w:val="BodyText"/>
+        <w:jc w:val="both"/>
       </w:pPr>
       <w:r>
         <w:t xml:space="preserve">Success metrics are pre-registered per work package; the stage table in 2.5.7.1 states each threshold.</w:t>
@@ -1691,6 +1748,7 @@
     <w:p>
       <w:pPr>
         <w:pStyle w:val="FirstParagraph"/>
+        <w:jc w:val="both"/>
       </w:pPr>
       <w:r>
         <w:t xml:space="preserve">The measured law and the JP are established preliminary results [1]; the project’s novelty is the frontier built on them:</w:t>
@@ -1703,6 +1761,7 @@
           <w:ilvl w:val="0"/>
           <w:numId w:val="1003"/>
         </w:numPr>
+        <w:jc w:val="both"/>
       </w:pPr>
       <w:r>
         <w:rPr>
@@ -1725,6 +1784,7 @@
           <w:ilvl w:val="0"/>
           <w:numId w:val="1003"/>
         </w:numPr>
+        <w:jc w:val="both"/>
       </w:pPr>
       <w:r>
         <w:rPr>
@@ -1747,6 +1807,7 @@
           <w:ilvl w:val="0"/>
           <w:numId w:val="1003"/>
         </w:numPr>
+        <w:jc w:val="both"/>
       </w:pPr>
       <w:r>
         <w:rPr>
@@ -1769,6 +1830,7 @@
           <w:ilvl w:val="0"/>
           <w:numId w:val="1003"/>
         </w:numPr>
+        <w:jc w:val="both"/>
       </w:pPr>
       <w:r>
         <w:rPr>
@@ -1791,6 +1853,7 @@
           <w:ilvl w:val="0"/>
           <w:numId w:val="1003"/>
         </w:numPr>
+        <w:jc w:val="both"/>
       </w:pPr>
       <w:r>
         <w:rPr>
@@ -1813,6 +1876,7 @@
           <w:ilvl w:val="0"/>
           <w:numId w:val="1003"/>
         </w:numPr>
+        <w:jc w:val="both"/>
       </w:pPr>
       <w:r>
         <w:rPr>
@@ -1841,6 +1905,7 @@
     <w:p>
       <w:pPr>
         <w:pStyle w:val="FirstParagraph"/>
+        <w:jc w:val="both"/>
       </w:pPr>
       <w:r>
         <w:t xml:space="preserve">The roles divide cleanly: operators run the hardware, the Ministry sets the rules. Just as a regulator sets fuel-economy standards without driving the cars, JouleFlex gives the Ministry the measured basis for connection terms, planning coefficients and efficiency standards, without operating any facility itself. The proposal addresses the Ministry's 2026 R&amp;D policy [17] under call 34/2026 [18],</w:t>
@@ -1857,6 +1922,14 @@
         <w:tblStyle w:val="Table"/>
         <w:tblW w:type="auto" w:w="0"/>
         <w:tblLook w:firstRow="1" w:lastRow="0" w:firstColumn="0" w:lastColumn="0" w:noHBand="0" w:noVBand="0" w:val="0020"/>
+        <w:tblBorders>
+          <w:top w:val="single" w:sz="6" w:space="0" w:color="C8C8C8"/>
+          <w:left w:val="single" w:sz="6" w:space="0" w:color="C8C8C8"/>
+          <w:bottom w:val="single" w:sz="6" w:space="0" w:color="C8C8C8"/>
+          <w:right w:val="single" w:sz="6" w:space="0" w:color="C8C8C8"/>
+          <w:insideH w:val="single" w:sz="6" w:space="0" w:color="C8C8C8"/>
+          <w:insideV w:val="single" w:sz="6" w:space="0" w:color="C8C8C8"/>
+        </w:tblBorders>
       </w:tblPr>
       <w:tblGrid>
         <w:gridCol w:w="3960"/>
@@ -1871,7 +1944,7 @@
           <w:p>
             <w:pPr>
               <w:pStyle w:val="Compact"/>
-              <w:jc w:val="left"/>
+              <w:jc w:val="both"/>
             </w:pPr>
             <w:r>
               <w:t xml:space="preserve">Clause</w:t>
@@ -1883,7 +1956,7 @@
           <w:p>
             <w:pPr>
               <w:pStyle w:val="Compact"/>
-              <w:jc w:val="left"/>
+              <w:jc w:val="both"/>
             </w:pPr>
             <w:r>
               <w:t xml:space="preserve">How the project addresses it</w:t>
@@ -1927,7 +2000,7 @@
           <w:p>
             <w:pPr>
               <w:pStyle w:val="Compact"/>
-              <w:jc w:val="left"/>
+              <w:jc w:val="both"/>
             </w:pPr>
             <w:r>
               <w:t xml:space="preserve">The core deliverable: power shaping manages a server farm's energy supply in real time; the flexibility framework tells planners how much a farm needs.</w:t>
@@ -1971,7 +2044,7 @@
           <w:p>
             <w:pPr>
               <w:pStyle w:val="Compact"/>
-              <w:jc w:val="left"/>
+              <w:jc w:val="both"/>
             </w:pPr>
             <w:r>
               <w:t xml:space="preserve">A facility following a power envelope on instruction, at ~0.2-second actuation, is a demand-response resource of grid-relevant size.</w:t>
@@ -2027,7 +2100,7 @@
           <w:p>
             <w:pPr>
               <w:pStyle w:val="Compact"/>
-              <w:jc w:val="left"/>
+              <w:jc w:val="both"/>
             </w:pPr>
             <w:r>
               <w:t xml:space="preserve">29–31 percent less energy per AI task at the card, 18–45 percent less per served job at the fleet, in software on installed hardware.</w:t>
@@ -2083,7 +2156,7 @@
           <w:p>
             <w:pPr>
               <w:pStyle w:val="Compact"/>
-              <w:jc w:val="left"/>
+              <w:jc w:val="both"/>
             </w:pPr>
             <w:r>
               <w:t xml:space="preserve">AI compute is the subject, learned models and control the instruments, an energy-system tool the deliverable.</w:t>
@@ -2127,7 +2200,7 @@
           <w:p>
             <w:pPr>
               <w:pStyle w:val="Compact"/>
-              <w:jc w:val="left"/>
+              <w:jc w:val="both"/>
             </w:pPr>
             <w:r>
               <w:t xml:space="preserve">Flexibility products, compliance metrics and the regulator-facing report are decision-support instruments for connection policy.</w:t>
@@ -2149,6 +2222,7 @@
     <w:p>
       <w:pPr>
         <w:pStyle w:val="FirstParagraph"/>
+        <w:jc w:val="both"/>
       </w:pPr>
       <w:r>
         <w:t xml:space="preserve">The preliminary results are the applicant's study</w:t>
@@ -2236,6 +2310,9 @@
     <w:p>
       <w:pPr>
         <w:pStyle w:val="Heading2"/>
+        <w:pBdr>
+          <w:bottom w:val="single" w:sz="6" w:space="2" w:color="C8C8C8"/>
+        </w:pBdr>
       </w:pPr>
       <w:r>
         <w:t xml:space="preserve">2.5.6 Application: expected benefit and impact</w:t>
@@ -2253,6 +2330,7 @@
     <w:p>
       <w:pPr>
         <w:pStyle w:val="FirstParagraph"/>
+        <w:jc w:val="both"/>
       </w:pPr>
       <w:r>
         <w:t xml:space="preserve">The project delivers five artifacts: the ELF-2 open dataset, the characterization kit, the control engine, the digital twin, and the grid interfaces and policy report. Appendix Table A1 states what each is and who uses it. Each artifact is released openly on delivery, every release crediting the Ministry’s R&amp;D program under call 34/2026 [18].</w:t>
@@ -2271,6 +2349,7 @@
     <w:p>
       <w:pPr>
         <w:pStyle w:val="FirstParagraph"/>
+        <w:jc w:val="both"/>
       </w:pPr>
       <w:r>
         <w:rPr>
@@ -2289,6 +2368,7 @@
     <w:p>
       <w:pPr>
         <w:pStyle w:val="BodyText"/>
+        <w:jc w:val="both"/>
       </w:pPr>
       <w:r>
         <w:rPr>
@@ -2307,6 +2387,7 @@
     <w:p>
       <w:pPr>
         <w:pStyle w:val="BodyText"/>
+        <w:jc w:val="both"/>
       </w:pPr>
       <w:r>
         <w:rPr>
@@ -2328,6 +2409,9 @@
     <w:p>
       <w:pPr>
         <w:pStyle w:val="Heading2"/>
+        <w:pBdr>
+          <w:bottom w:val="single" w:sz="6" w:space="2" w:color="C8C8C8"/>
+        </w:pBdr>
       </w:pPr>
       <w:r>
         <w:t xml:space="preserve">2.5.7 Work plan</w:t>
@@ -2347,6 +2431,14 @@
         <w:tblStyle w:val="Table"/>
         <w:tblW w:type="auto" w:w="0"/>
         <w:tblLook w:firstRow="1" w:lastRow="0" w:firstColumn="0" w:lastColumn="0" w:noHBand="0" w:noVBand="0" w:val="0020"/>
+        <w:tblBorders>
+          <w:top w:val="single" w:sz="6" w:space="0" w:color="C8C8C8"/>
+          <w:left w:val="single" w:sz="6" w:space="0" w:color="C8C8C8"/>
+          <w:bottom w:val="single" w:sz="6" w:space="0" w:color="C8C8C8"/>
+          <w:right w:val="single" w:sz="6" w:space="0" w:color="C8C8C8"/>
+          <w:insideH w:val="single" w:sz="6" w:space="0" w:color="C8C8C8"/>
+          <w:insideV w:val="single" w:sz="6" w:space="0" w:color="C8C8C8"/>
+        </w:tblBorders>
       </w:tblPr>
       <w:tblGrid>
         <w:gridCol w:w="1980"/>
@@ -2363,7 +2455,7 @@
           <w:p>
             <w:pPr>
               <w:pStyle w:val="Compact"/>
-              <w:jc w:val="left"/>
+              <w:jc w:val="both"/>
             </w:pPr>
             <w:r>
               <w:t xml:space="preserve">Months</w:t>
@@ -2375,7 +2467,7 @@
           <w:p>
             <w:pPr>
               <w:pStyle w:val="Compact"/>
-              <w:jc w:val="left"/>
+              <w:jc w:val="both"/>
             </w:pPr>
             <w:r>
               <w:t xml:space="preserve">Stage</w:t>
@@ -2387,7 +2479,7 @@
           <w:p>
             <w:pPr>
               <w:pStyle w:val="Compact"/>
-              <w:jc w:val="left"/>
+              <w:jc w:val="both"/>
             </w:pPr>
             <w:r>
               <w:t xml:space="preserve">Deliverable</w:t>
@@ -2399,7 +2491,7 @@
           <w:p>
             <w:pPr>
               <w:pStyle w:val="Compact"/>
-              <w:jc w:val="left"/>
+              <w:jc w:val="both"/>
             </w:pPr>
             <w:r>
               <w:t xml:space="preserve">Success metric</w:t>
@@ -2413,7 +2505,7 @@
           <w:p>
             <w:pPr>
               <w:pStyle w:val="Compact"/>
-              <w:jc w:val="left"/>
+              <w:jc w:val="both"/>
             </w:pPr>
             <w:r>
               <w:t xml:space="preserve">M1–M6</w:t>
@@ -2425,7 +2517,7 @@
           <w:p>
             <w:pPr>
               <w:pStyle w:val="Compact"/>
-              <w:jc w:val="left"/>
+              <w:jc w:val="both"/>
             </w:pPr>
             <w:r>
               <w:t xml:space="preserve">WP1: harness; new-generation and production-engine (vLLM) sweeps; board and node instrumentation</w:t>
@@ -2437,7 +2529,7 @@
           <w:p>
             <w:pPr>
               <w:pStyle w:val="Compact"/>
-              <w:jc w:val="left"/>
+              <w:jc w:val="both"/>
             </w:pPr>
             <w:r>
               <w:t xml:space="preserve">D1: ELF-2 v1</w:t>
@@ -2449,7 +2541,7 @@
           <w:p>
             <w:pPr>
               <w:pStyle w:val="Compact"/>
-              <w:jc w:val="left"/>
+              <w:jc w:val="both"/>
             </w:pPr>
             <w:r>
               <w:t xml:space="preserve">Law fit R² ≥ 0.95 per sweep, below the measured 0.99 median [1], or deviation documented; JP located (or absence documented) per platform at board and node power</w:t>
@@ -2463,7 +2555,7 @@
           <w:p>
             <w:pPr>
               <w:pStyle w:val="Compact"/>
-              <w:jc w:val="left"/>
+              <w:jc w:val="both"/>
             </w:pPr>
             <w:r>
               <w:t xml:space="preserve">M5–M8</w:t>
@@ -2475,7 +2567,7 @@
           <w:p>
             <w:pPr>
               <w:pStyle w:val="Compact"/>
-              <w:jc w:val="left"/>
+              <w:jc w:val="both"/>
             </w:pPr>
             <w:r>
               <w:t xml:space="preserve">WP1: shared GPUs, LLM phases, fine-tuning; sweeps where the constant should break</w:t>
@@ -2487,7 +2579,7 @@
           <w:p>
             <w:pPr>
               <w:pStyle w:val="Compact"/>
-              <w:jc w:val="left"/>
+              <w:jc w:val="both"/>
             </w:pPr>
             <w:r>
               <w:t xml:space="preserve">MS1: regime map</w:t>
@@ -2499,7 +2591,7 @@
           <w:p>
             <w:pPr>
               <w:pStyle w:val="Compact"/>
-              <w:jc w:val="left"/>
+              <w:jc w:val="both"/>
             </w:pPr>
             <w:r>
               <w:t xml:space="preserve">Server-input (BMC) wall tier validated; validity domain documented, including the pre-registered JP shift (percentage points of TDP) at which the per-card constant breaks; an M8 technical brief to the chief scientist unit</w:t>
@@ -2513,7 +2605,7 @@
           <w:p>
             <w:pPr>
               <w:pStyle w:val="Compact"/>
-              <w:jc w:val="left"/>
+              <w:jc w:val="both"/>
             </w:pPr>
             <w:r>
               <w:t xml:space="preserve">M7–M12</w:t>
@@ -2525,7 +2617,7 @@
           <w:p>
             <w:pPr>
               <w:pStyle w:val="Compact"/>
-              <w:jc w:val="left"/>
+              <w:jc w:val="both"/>
             </w:pPr>
             <w:r>
               <w:t xml:space="preserve">WP2: job model; transfer model; one-test characterization protocol</w:t>
@@ -2537,7 +2629,7 @@
           <w:p>
             <w:pPr>
               <w:pStyle w:val="Compact"/>
-              <w:jc w:val="left"/>
+              <w:jc w:val="both"/>
             </w:pPr>
             <w:r>
               <w:t xml:space="preserve">MS2: models result</w:t>
@@ -2549,7 +2641,7 @@
           <w:p>
             <w:pPr>
               <w:pStyle w:val="Compact"/>
-              <w:jc w:val="left"/>
+              <w:jc w:val="both"/>
             </w:pPr>
             <w:r>
               <w:t xml:space="preserve">Job-model placement within 5 percentage points of TDP where the constant breaks; transfer-model placement within 5 percentage points of TDP on held-out cards; protocol cost ≤ 8 hours and ≤ ₪1,500 per card model</w:t>
@@ -2563,7 +2655,7 @@
           <w:p>
             <w:pPr>
               <w:pStyle w:val="Compact"/>
-              <w:jc w:val="left"/>
+              <w:jc w:val="both"/>
             </w:pPr>
             <w:r>
               <w:t xml:space="preserve">M9–M16</w:t>
@@ -2575,7 +2667,7 @@
           <w:p>
             <w:pPr>
               <w:pStyle w:val="Compact"/>
-              <w:jc w:val="left"/>
+              <w:jc w:val="both"/>
             </w:pPr>
             <w:r>
               <w:t xml:space="preserve">WP3: twin; joint controller under fixed, price, carbon and curtailment envelopes</w:t>
@@ -2587,7 +2679,7 @@
           <w:p>
             <w:pPr>
               <w:pStyle w:val="Compact"/>
-              <w:jc w:val="left"/>
+              <w:jc w:val="both"/>
             </w:pPr>
             <w:r>
               <w:t xml:space="preserve">MS3: controller result</w:t>
@@ -2599,7 +2691,7 @@
           <w:p>
             <w:pPr>
               <w:pStyle w:val="Compact"/>
-              <w:jc w:val="left"/>
+              <w:jc w:val="both"/>
             </w:pPr>
             <w:r>
               <w:t xml:space="preserve">Energy per served job and SLO compliance versus uncapped, static-cap and cap-only baselines; a pre-registered floor of at least 10 percent below cap-only at equal compliance (the incremental gain over an already-capped fleet on held-out traces, not the saving over full power); zero exceedance beyond the WP1 noise band in committed windows, with overshoot and transient violations (under 1 percent of epochs) reported</w:t>
@@ -2613,7 +2705,7 @@
           <w:p>
             <w:pPr>
               <w:pStyle w:val="Compact"/>
-              <w:jc w:val="left"/>
+              <w:jc w:val="both"/>
             </w:pPr>
             <w:r>
               <w:t xml:space="preserve">M14–M20</w:t>
@@ -2625,7 +2717,7 @@
           <w:p>
             <w:pPr>
               <w:pStyle w:val="Compact"/>
-              <w:jc w:val="left"/>
+              <w:jc w:val="both"/>
             </w:pPr>
             <w:r>
               <w:t xml:space="preserve">WP4: flexibility products and metrics; demonstration on rented BMC-metered servers; Israel scenario</w:t>
@@ -2637,7 +2729,7 @@
           <w:p>
             <w:pPr>
               <w:pStyle w:val="Compact"/>
-              <w:jc w:val="left"/>
+              <w:jc w:val="both"/>
             </w:pPr>
             <w:r>
               <w:t xml:space="preserve">MS4: flexibility demonstration</w:t>
@@ -2649,7 +2741,7 @@
           <w:p>
             <w:pPr>
               <w:pStyle w:val="Compact"/>
-              <w:jc w:val="left"/>
+              <w:jc w:val="both"/>
             </w:pPr>
             <w:r>
               <w:t xml:space="preserve">Sheddable power as a fraction of the committed envelope (pre-registered floor: at least 15 percent within the ramp deadline at bounded SLO loss), measured on a BMC-metered server, projected to fleet scale in the twin (projection error versus the metered runs reported); ramp within 60 seconds and recovery within 5 minutes, within a grid flexibility product's response window [19]; delivery-record compliance and curtailment service cost</w:t>
@@ -2663,7 +2755,7 @@
           <w:p>
             <w:pPr>
               <w:pStyle w:val="Compact"/>
-              <w:jc w:val="left"/>
+              <w:jc w:val="both"/>
             </w:pPr>
             <w:r>
               <w:t xml:space="preserve">M16–M21</w:t>
@@ -2675,7 +2767,7 @@
           <w:p>
             <w:pPr>
               <w:pStyle w:val="Compact"/>
-              <w:jc w:val="left"/>
+              <w:jc w:val="both"/>
             </w:pPr>
             <w:r>
               <w:t xml:space="preserve">WP5: incentive model; connection valuation on published Israeli data; twin evaluation</w:t>
@@ -2687,7 +2779,7 @@
           <w:p>
             <w:pPr>
               <w:pStyle w:val="Compact"/>
-              <w:jc w:val="left"/>
+              <w:jc w:val="both"/>
             </w:pPr>
             <w:r>
               <w:t xml:space="preserve">MS5: policy report draft</w:t>
@@ -2699,7 +2791,7 @@
           <w:p>
             <w:pPr>
               <w:pStyle w:val="Compact"/>
-              <w:jc w:val="left"/>
+              <w:jc w:val="both"/>
             </w:pPr>
             <w:r>
               <w:t xml:space="preserve">Alignment condition per billing structure, confirmed in the twin; option value per MW and break-even curtailment frequency, with sensitivity to every price input</w:t>
@@ -2713,7 +2805,7 @@
           <w:p>
             <w:pPr>
               <w:pStyle w:val="Compact"/>
-              <w:jc w:val="left"/>
+              <w:jc w:val="both"/>
             </w:pPr>
             <w:r>
               <w:t xml:space="preserve">M21–M24</w:t>
@@ -2725,7 +2817,7 @@
           <w:p>
             <w:pPr>
               <w:pStyle w:val="Compact"/>
-              <w:jc w:val="left"/>
+              <w:jc w:val="both"/>
             </w:pPr>
             <w:r>
               <w:t xml:space="preserve">WP5: release, documentation, validation, publication</w:t>
@@ -2737,7 +2829,7 @@
           <w:p>
             <w:pPr>
               <w:pStyle w:val="Compact"/>
-              <w:jc w:val="left"/>
+              <w:jc w:val="both"/>
             </w:pPr>
             <w:r>
               <w:t xml:space="preserve">D2: open release; D3: final report</w:t>
@@ -2749,7 +2841,7 @@
           <w:p>
             <w:pPr>
               <w:pStyle w:val="Compact"/>
-              <w:jc w:val="left"/>
+              <w:jc w:val="both"/>
             </w:pPr>
             <w:r>
               <w:t xml:space="preserve">Public repositories with reproducing pipelines; metered validation; final scientific and policy reports</w:t>
@@ -2761,6 +2853,7 @@
     <w:p>
       <w:pPr>
         <w:pStyle w:val="BodyText"/>
+        <w:jc w:val="both"/>
       </w:pPr>
       <w:r>
         <w:t xml:space="preserve">Two interim briefings are named deliverables: the M8 technical brief and the M21 policy draft, in Hebrew, circulable to the Authority and Noga [19]. Each milestone is tested against pre-stated criteria; a bounding result is itself a deliverable. Minimum-success path: H100/L40S validation, one serving engine, BMC wall measurement, the job and transfer models, the joint controller, and one Israeli flexibility scenario; B200-class cards, a second engine, fine-tuning, shared-GPU regimes and the formal guarantee are extension objectives as access allows.</w:t>
@@ -2781,6 +2874,14 @@
         <w:tblStyle w:val="Table"/>
         <w:tblW w:type="auto" w:w="0"/>
         <w:tblLook w:firstRow="1" w:lastRow="0" w:firstColumn="0" w:lastColumn="0" w:noHBand="0" w:noVBand="0" w:val="0020"/>
+        <w:tblBorders>
+          <w:top w:val="single" w:sz="6" w:space="0" w:color="C8C8C8"/>
+          <w:left w:val="single" w:sz="6" w:space="0" w:color="C8C8C8"/>
+          <w:bottom w:val="single" w:sz="6" w:space="0" w:color="C8C8C8"/>
+          <w:right w:val="single" w:sz="6" w:space="0" w:color="C8C8C8"/>
+          <w:insideH w:val="single" w:sz="6" w:space="0" w:color="C8C8C8"/>
+          <w:insideV w:val="single" w:sz="6" w:space="0" w:color="C8C8C8"/>
+        </w:tblBorders>
       </w:tblPr>
       <w:tblGrid>
         <w:gridCol w:w="1980"/>
@@ -2797,7 +2898,7 @@
           <w:p>
             <w:pPr>
               <w:pStyle w:val="Compact"/>
-              <w:jc w:val="left"/>
+              <w:jc w:val="both"/>
             </w:pPr>
             <w:r>
               <w:t xml:space="preserve">Stage</w:t>
@@ -2809,7 +2910,7 @@
           <w:p>
             <w:pPr>
               <w:pStyle w:val="Compact"/>
-              <w:jc w:val="left"/>
+              <w:jc w:val="both"/>
             </w:pPr>
             <w:r>
               <w:t xml:space="preserve">Share</w:t>
@@ -2821,7 +2922,7 @@
           <w:p>
             <w:pPr>
               <w:pStyle w:val="Compact"/>
-              <w:jc w:val="left"/>
+              <w:jc w:val="both"/>
             </w:pPr>
             <w:r>
               <w:t xml:space="preserve">Amount (₪)</w:t>
@@ -2833,7 +2934,7 @@
           <w:p>
             <w:pPr>
               <w:pStyle w:val="Compact"/>
-              <w:jc w:val="left"/>
+              <w:jc w:val="both"/>
             </w:pPr>
             <w:r>
               <w:t xml:space="preserve">Principal costs</w:t>
@@ -2847,7 +2948,7 @@
           <w:p>
             <w:pPr>
               <w:pStyle w:val="Compact"/>
-              <w:jc w:val="left"/>
+              <w:jc w:val="both"/>
             </w:pPr>
             <w:r>
               <w:t xml:space="preserve">M1–M8 (WP1; WP2 begins)</w:t>
@@ -2859,7 +2960,7 @@
           <w:p>
             <w:pPr>
               <w:pStyle w:val="Compact"/>
-              <w:jc w:val="left"/>
+              <w:jc w:val="both"/>
             </w:pPr>
             <w:r>
               <w:t xml:space="preserve">30%</w:t>
@@ -2871,7 +2972,7 @@
           <w:p>
             <w:pPr>
               <w:pStyle w:val="Compact"/>
-              <w:jc w:val="left"/>
+              <w:jc w:val="both"/>
             </w:pPr>
             <w:r>
               <w:t xml:space="preserve">148,314</w:t>
@@ -2883,7 +2984,7 @@
           <w:p>
             <w:pPr>
               <w:pStyle w:val="Compact"/>
-              <w:jc w:val="left"/>
+              <w:jc w:val="both"/>
             </w:pPr>
             <w:r>
               <w:t xml:space="preserve">Postdoctoral researcher; GPU rentals for cap sweeps</w:t>
@@ -2897,7 +2998,7 @@
           <w:p>
             <w:pPr>
               <w:pStyle w:val="Compact"/>
-              <w:jc w:val="left"/>
+              <w:jc w:val="both"/>
             </w:pPr>
             <w:r>
               <w:t xml:space="preserve">M9–M16 (WP2 ends; WP3; WP4 begins)</w:t>
@@ -2909,7 +3010,7 @@
           <w:p>
             <w:pPr>
               <w:pStyle w:val="Compact"/>
-              <w:jc w:val="left"/>
+              <w:jc w:val="both"/>
             </w:pPr>
             <w:r>
               <w:t xml:space="preserve">33%</w:t>
@@ -2921,7 +3022,7 @@
           <w:p>
             <w:pPr>
               <w:pStyle w:val="Compact"/>
-              <w:jc w:val="left"/>
+              <w:jc w:val="both"/>
             </w:pPr>
             <w:r>
               <w:t xml:space="preserve">163,145</w:t>
@@ -2933,7 +3034,7 @@
           <w:p>
             <w:pPr>
               <w:pStyle w:val="Compact"/>
-              <w:jc w:val="left"/>
+              <w:jc w:val="both"/>
             </w:pPr>
             <w:r>
               <w:t xml:space="preserve">Postdoctoral researcher; card-model rentals for transfer validation; twin and controller work</w:t>
@@ -2947,7 +3048,7 @@
           <w:p>
             <w:pPr>
               <w:pStyle w:val="Compact"/>
-              <w:jc w:val="left"/>
+              <w:jc w:val="both"/>
             </w:pPr>
             <w:r>
               <w:t xml:space="preserve">M17–M21 (WP4 ends; WP5)</w:t>
@@ -2959,7 +3060,7 @@
           <w:p>
             <w:pPr>
               <w:pStyle w:val="Compact"/>
-              <w:jc w:val="left"/>
+              <w:jc w:val="both"/>
             </w:pPr>
             <w:r>
               <w:t xml:space="preserve">25%</w:t>
@@ -2971,7 +3072,7 @@
           <w:p>
             <w:pPr>
               <w:pStyle w:val="Compact"/>
-              <w:jc w:val="left"/>
+              <w:jc w:val="both"/>
             </w:pPr>
             <w:r>
               <w:t xml:space="preserve">123,595</w:t>
@@ -2983,7 +3084,7 @@
           <w:p>
             <w:pPr>
               <w:pStyle w:val="Compact"/>
-              <w:jc w:val="left"/>
+              <w:jc w:val="both"/>
             </w:pPr>
             <w:r>
               <w:t xml:space="preserve">Postdoctoral researcher; BMC-metered rentals; flexibility campaign</w:t>
@@ -2997,7 +3098,7 @@
           <w:p>
             <w:pPr>
               <w:pStyle w:val="Compact"/>
-              <w:jc w:val="left"/>
+              <w:jc w:val="both"/>
             </w:pPr>
             <w:r>
               <w:t xml:space="preserve">M22–M24 (WP5: release and validation)</w:t>
@@ -3009,7 +3110,7 @@
           <w:p>
             <w:pPr>
               <w:pStyle w:val="Compact"/>
-              <w:jc w:val="left"/>
+              <w:jc w:val="both"/>
             </w:pPr>
             <w:r>
               <w:t xml:space="preserve">12%</w:t>
@@ -3021,7 +3122,7 @@
           <w:p>
             <w:pPr>
               <w:pStyle w:val="Compact"/>
-              <w:jc w:val="left"/>
+              <w:jc w:val="both"/>
             </w:pPr>
             <w:r>
               <w:t xml:space="preserve">59,326</w:t>
@@ -3033,7 +3134,7 @@
           <w:p>
             <w:pPr>
               <w:pStyle w:val="Compact"/>
-              <w:jc w:val="left"/>
+              <w:jc w:val="both"/>
             </w:pPr>
             <w:r>
               <w:t xml:space="preserve">Postdoctoral researcher; metered validation runs; documentation; dissemination and publication</w:t>
@@ -3049,7 +3150,7 @@
           <w:p>
             <w:pPr>
               <w:pStyle w:val="Compact"/>
-              <w:jc w:val="left"/>
+              <w:jc w:val="both"/>
             </w:pPr>
             <w:r>
               <w:rPr>
@@ -3065,7 +3166,7 @@
           <w:p>
             <w:pPr>
               <w:pStyle w:val="Compact"/>
-              <w:jc w:val="left"/>
+              <w:jc w:val="both"/>
             </w:pPr>
             <w:r>
               <w:rPr>
@@ -3109,6 +3210,14 @@
         <w:tblStyle w:val="Table"/>
         <w:tblW w:type="auto" w:w="0"/>
         <w:tblLook w:firstRow="1" w:lastRow="0" w:firstColumn="0" w:lastColumn="0" w:noHBand="0" w:noVBand="0" w:val="0020"/>
+        <w:tblBorders>
+          <w:top w:val="single" w:sz="6" w:space="0" w:color="C8C8C8"/>
+          <w:left w:val="single" w:sz="6" w:space="0" w:color="C8C8C8"/>
+          <w:bottom w:val="single" w:sz="6" w:space="0" w:color="C8C8C8"/>
+          <w:right w:val="single" w:sz="6" w:space="0" w:color="C8C8C8"/>
+          <w:insideH w:val="single" w:sz="6" w:space="0" w:color="C8C8C8"/>
+          <w:insideV w:val="single" w:sz="6" w:space="0" w:color="C8C8C8"/>
+        </w:tblBorders>
       </w:tblPr>
       <w:tblGrid>
         <w:gridCol w:w="2640"/>
@@ -3124,7 +3233,7 @@
           <w:p>
             <w:pPr>
               <w:pStyle w:val="Compact"/>
-              <w:jc w:val="left"/>
+              <w:jc w:val="both"/>
             </w:pPr>
             <w:r>
               <w:t xml:space="preserve">Risk</w:t>
@@ -3136,7 +3245,7 @@
           <w:p>
             <w:pPr>
               <w:pStyle w:val="Compact"/>
-              <w:jc w:val="left"/>
+              <w:jc w:val="both"/>
             </w:pPr>
             <w:r>
               <w:t xml:space="preserve">Impact</w:t>
@@ -3148,7 +3257,7 @@
           <w:p>
             <w:pPr>
               <w:pStyle w:val="Compact"/>
-              <w:jc w:val="left"/>
+              <w:jc w:val="both"/>
             </w:pPr>
             <w:r>
               <w:t xml:space="preserve">Mitigation</w:t>
@@ -3162,7 +3271,7 @@
           <w:p>
             <w:pPr>
               <w:pStyle w:val="Compact"/>
-              <w:jc w:val="left"/>
+              <w:jc w:val="both"/>
             </w:pPr>
             <w:r>
               <w:t xml:space="preserve">Production serving software (continuous batching, shifting phases) blurs the per-card constant</w:t>
@@ -3174,7 +3283,7 @@
           <w:p>
             <w:pPr>
               <w:pStyle w:val="Compact"/>
-              <w:jc w:val="left"/>
+              <w:jc w:val="both"/>
             </w:pPr>
             <w:r>
               <w:t xml:space="preserve">Static cap loses near-optimality for LLMs</w:t>
@@ -3186,7 +3295,7 @@
           <w:p>
             <w:pPr>
               <w:pStyle w:val="Compact"/>
-              <w:jc w:val="left"/>
+              <w:jc w:val="both"/>
             </w:pPr>
             <w:r>
               <w:t xml:space="preserve">Measured first (WP1, M1); the job model predicts the optimum where the constant breaks</w:t>
@@ -3200,7 +3309,7 @@
           <w:p>
             <w:pPr>
               <w:pStyle w:val="Compact"/>
-              <w:jc w:val="left"/>
+              <w:jc w:val="both"/>
             </w:pPr>
             <w:r>
               <w:t xml:space="preserve">Power-cap control unavailable on some rented platforms</w:t>
@@ -3212,7 +3321,7 @@
           <w:p>
             <w:pPr>
               <w:pStyle w:val="Compact"/>
-              <w:jc w:val="left"/>
+              <w:jc w:val="both"/>
             </w:pPr>
             <w:r>
               <w:t xml:space="preserve">Measurement campaign narrowed</w:t>
@@ -3224,7 +3333,7 @@
           <w:p>
             <w:pPr>
               <w:pStyle w:val="Compact"/>
-              <w:jc w:val="left"/>
+              <w:jc w:val="both"/>
             </w:pPr>
             <w:r>
               <w:t xml:space="preserve">AWS EC2 gives passthrough and root; too-high cap floors are exposed via the graphics clock (L4 [1]); BMC rentals cover the wall tier</w:t>
@@ -3238,7 +3347,7 @@
           <w:p>
             <w:pPr>
               <w:pStyle w:val="Compact"/>
-              <w:jc w:val="left"/>
+              <w:jc w:val="both"/>
             </w:pPr>
             <w:r>
               <w:t xml:space="preserve">Postdoc recruitment slips, or the single hire is lost mid-project</w:t>
@@ -3250,7 +3359,7 @@
           <w:p>
             <w:pPr>
               <w:pStyle w:val="Compact"/>
-              <w:jc w:val="left"/>
+              <w:jc w:val="both"/>
             </w:pPr>
             <w:r>
               <w:t xml:space="preserve">Schedule and delivery at risk</w:t>
@@ -3262,7 +3371,7 @@
           <w:p>
             <w:pPr>
               <w:pStyle w:val="Compact"/>
-              <w:jc w:val="left"/>
+              <w:jc w:val="both"/>
             </w:pPr>
             <w:r>
               <w:t xml:space="preserve">PI runs the WP1 bench directly (the ELF harness is his); the minimum-success path is one-FTE executable; recruitment via HIT and national channels with a fallback</w:t>
@@ -3276,7 +3385,7 @@
           <w:p>
             <w:pPr>
               <w:pStyle w:val="Compact"/>
-              <w:jc w:val="left"/>
+              <w:jc w:val="both"/>
             </w:pPr>
             <w:r>
               <w:t xml:space="preserve">Out-of-band PSU telemetry (BMC/IPMI/Redfish) blocked on a rented server</w:t>
@@ -3288,7 +3397,7 @@
           <w:p>
             <w:pPr>
               <w:pStyle w:val="Compact"/>
-              <w:jc w:val="left"/>
+              <w:jc w:val="both"/>
             </w:pPr>
             <w:r>
               <w:t xml:space="preserve">Wall-tier measurement narrowed</w:t>
@@ -3300,7 +3409,7 @@
           <w:p>
             <w:pPr>
               <w:pStyle w:val="Compact"/>
-              <w:jc w:val="left"/>
+              <w:jc w:val="both"/>
             </w:pPr>
             <w:r>
               <w:t xml:space="preserve">Named BMC-capable bare-metal vendors with dated quotes (GPU Mart and equivalents); fallback to an in-line metered PDU at the wall</w:t>
@@ -3315,6 +3424,9 @@
     <w:p>
       <w:pPr>
         <w:pStyle w:val="Heading2"/>
+        <w:pBdr>
+          <w:bottom w:val="single" w:sz="6" w:space="2" w:color="C8C8C8"/>
+        </w:pBdr>
       </w:pPr>
       <w:r>
         <w:t xml:space="preserve">2.5.8 The applicant</w:t>
@@ -3323,6 +3435,7 @@
     <w:p>
       <w:pPr>
         <w:pStyle w:val="FirstParagraph"/>
+        <w:jc w:val="both"/>
       </w:pPr>
       <w:r>
         <w:rPr>
@@ -3341,6 +3454,7 @@
     <w:p>
       <w:pPr>
         <w:pStyle w:val="BodyText"/>
+        <w:jc w:val="both"/>
       </w:pPr>
       <w:r>
         <w:rPr>
@@ -3386,6 +3500,7 @@
     <w:p>
       <w:pPr>
         <w:pStyle w:val="BodyText"/>
+        <w:jc w:val="both"/>
       </w:pPr>
       <w:r>
         <w:rPr>
@@ -3404,6 +3519,7 @@
     <w:p>
       <w:pPr>
         <w:pStyle w:val="BodyText"/>
+        <w:jc w:val="both"/>
       </w:pPr>
       <w:r>
         <w:rPr>
@@ -3424,6 +3540,9 @@
     <w:p>
       <w:pPr>
         <w:pStyle w:val="Heading2"/>
+        <w:pBdr>
+          <w:bottom w:val="single" w:sz="6" w:space="2" w:color="C8C8C8"/>
+        </w:pBdr>
       </w:pPr>
       <w:r>
         <w:t xml:space="preserve">2.5.9 Funding</w:t>
@@ -3447,6 +3566,9 @@
     <w:p>
       <w:pPr>
         <w:pStyle w:val="Heading2"/>
+        <w:pBdr>
+          <w:bottom w:val="single" w:sz="6" w:space="2" w:color="C8C8C8"/>
+        </w:pBdr>
       </w:pPr>
       <w:r>
         <w:t xml:space="preserve">2.5.10 Bibliography</w:t>
@@ -3459,6 +3581,7 @@
           <w:ilvl w:val="0"/>
           <w:numId w:val="1004"/>
         </w:numPr>
+        <w:jc w:val="both"/>
       </w:pPr>
       <w:r>
         <w:t xml:space="preserve">Apartsin, A. and Aperstein, Y. (2026).</w:t>
@@ -3504,6 +3627,7 @@
           <w:ilvl w:val="0"/>
           <w:numId w:val="1004"/>
         </w:numPr>
+        <w:jc w:val="both"/>
       </w:pPr>
       <w:r>
         <w:t xml:space="preserve">JNS (22 July 2026).</w:t>
@@ -3532,6 +3656,7 @@
           <w:ilvl w:val="0"/>
           <w:numId w:val="1004"/>
         </w:numPr>
+        <w:jc w:val="both"/>
       </w:pPr>
       <w:r>
         <w:t xml:space="preserve">International Energy Agency (2025).</w:t>
@@ -3560,6 +3685,7 @@
           <w:ilvl w:val="0"/>
           <w:numId w:val="1004"/>
         </w:numPr>
+        <w:jc w:val="both"/>
       </w:pPr>
       <w:r>
         <w:t xml:space="preserve">Barroso, L. A. and Hölzle, U. (2007).</w:t>
@@ -3588,6 +3714,7 @@
           <w:ilvl w:val="0"/>
           <w:numId w:val="1004"/>
         </w:numPr>
+        <w:jc w:val="both"/>
       </w:pPr>
       <w:r>
         <w:t xml:space="preserve">Yao, F., Demers, A., and Shenker, S. (1995).</w:t>
@@ -3616,6 +3743,7 @@
           <w:ilvl w:val="0"/>
           <w:numId w:val="1004"/>
         </w:numPr>
+        <w:jc w:val="both"/>
       </w:pPr>
       <w:r>
         <w:t xml:space="preserve">Miyoshi, A., Lefurgy, C., Van Hensbergen, E., Rajamony, R., and Rajkumar, R. (2002).</w:t>
@@ -3644,6 +3772,7 @@
           <w:ilvl w:val="0"/>
           <w:numId w:val="1004"/>
         </w:numPr>
+        <w:jc w:val="both"/>
       </w:pPr>
       <w:r>
         <w:t xml:space="preserve">Gandhi, A., Harchol-Balter, M., Das, R., and Lefurgy, C. (2009).</w:t>
@@ -3672,6 +3801,7 @@
           <w:ilvl w:val="0"/>
           <w:numId w:val="1004"/>
         </w:numPr>
+        <w:jc w:val="both"/>
       </w:pPr>
       <w:r>
         <w:t xml:space="preserve">You, J., Chung, J.-W., and Chowdhury, M. (2022).</w:t>
@@ -3700,6 +3830,7 @@
           <w:ilvl w:val="0"/>
           <w:numId w:val="1004"/>
         </w:numPr>
+        <w:jc w:val="both"/>
       </w:pPr>
       <w:r>
         <w:t xml:space="preserve">Chung, J.-W., Ma, J. J., Wu, R., et al. (2025).</w:t>
@@ -3728,6 +3859,7 @@
           <w:ilvl w:val="0"/>
           <w:numId w:val="1004"/>
         </w:numPr>
+        <w:jc w:val="both"/>
       </w:pPr>
       <w:r>
         <w:t xml:space="preserve">Chung, J.-W., Wu, R., Ma, J. J., et al. (2026).</w:t>
@@ -3756,6 +3888,7 @@
           <w:ilvl w:val="0"/>
           <w:numId w:val="1004"/>
         </w:numPr>
+        <w:jc w:val="both"/>
       </w:pPr>
       <w:r>
         <w:t xml:space="preserve">Hu, Q., Sun, P., Yan, S., Wen, Y., et al. (2021).</w:t>
@@ -3784,6 +3917,7 @@
           <w:ilvl w:val="0"/>
           <w:numId w:val="1004"/>
         </w:numPr>
+        <w:jc w:val="both"/>
       </w:pPr>
       <w:r>
         <w:t xml:space="preserve">Alibaba Group (2020).</w:t>
@@ -3812,6 +3946,7 @@
           <w:ilvl w:val="0"/>
           <w:numId w:val="1004"/>
         </w:numPr>
+        <w:jc w:val="both"/>
       </w:pPr>
       <w:r>
         <w:t xml:space="preserve">Lipe, E., Karia, N., Espenshade, C., Stein, C., Tantawi, A., and Tardieu, O. (2026).</w:t>
@@ -3840,6 +3975,7 @@
           <w:ilvl w:val="0"/>
           <w:numId w:val="1004"/>
         </w:numPr>
+        <w:jc w:val="both"/>
       </w:pPr>
       <w:r>
         <w:t xml:space="preserve">Lu, T. and Reda, S. (2026).</w:t>
@@ -3868,6 +4004,7 @@
           <w:ilvl w:val="0"/>
           <w:numId w:val="1004"/>
         </w:numPr>
+        <w:jc w:val="both"/>
       </w:pPr>
       <w:r>
         <w:t xml:space="preserve">Rodriguez, C., Degioanni, L., Kameni, L., Vidal, R., et al. (2024).</w:t>
@@ -3896,6 +4033,7 @@
           <w:ilvl w:val="0"/>
           <w:numId w:val="1004"/>
         </w:numPr>
+        <w:jc w:val="both"/>
       </w:pPr>
       <w:r>
         <w:t xml:space="preserve">Kwon, W., Li, Z., Zhuang, S., et al. (2023).</w:t>
@@ -4015,6 +4153,7 @@
           <w:ilvl w:val="0"/>
           <w:numId w:val="1004"/>
         </w:numPr>
+        <w:jc w:val="both"/>
       </w:pPr>
       <w:r>
         <w:t xml:space="preserve">Ma, Y., Srinivasan, S., and Wang, X. (2025).</w:t>
@@ -4057,6 +4196,7 @@
           <w:ilvl w:val="0"/>
           <w:numId w:val="1004"/>
         </w:numPr>
+        <w:jc w:val="both"/>
       </w:pPr>
       <w:r>
         <w:t xml:space="preserve">Colangelo, P., Coskun, A. K., Megrue, J., et al. (2025).</w:t>
@@ -4099,6 +4239,7 @@
           <w:ilvl w:val="0"/>
           <w:numId w:val="1004"/>
         </w:numPr>
+        <w:jc w:val="both"/>
       </w:pPr>
       <w:r>
         <w:t xml:space="preserve">Fadel Argerich, M., Fürst, J., and Patiño-Martínez, M. (2026).</w:t>
@@ -4127,6 +4268,7 @@
           <w:ilvl w:val="0"/>
           <w:numId w:val="1004"/>
         </w:numPr>
+        <w:jc w:val="both"/>
       </w:pPr>
       <w:r>
         <w:t xml:space="preserve">Ma, B., Afzal, A., Eitzinger, J., and Wellein, G. (2026).</w:t>
@@ -4153,6 +4295,9 @@
     <w:p>
       <w:pPr>
         <w:pStyle w:val="Heading2"/>
+        <w:pBdr>
+          <w:bottom w:val="single" w:sz="6" w:space="2" w:color="C8C8C8"/>
+        </w:pBdr>
         <w:bidi/>
         <w:jc w:val="right"/>
       </w:pPr>
@@ -4191,6 +4336,7 @@
     <w:p>
       <w:pPr>
         <w:pStyle w:val="CaptionedFigure"/>
+        <w:jc w:val="both"/>
       </w:pPr>
       <w:r>
         <w:drawing>
@@ -4238,6 +4384,7 @@
     <w:p>
       <w:pPr>
         <w:pStyle w:val="ImageCaption"/>
+        <w:jc w:val="both"/>
       </w:pPr>
       <w:r>
         <w:t xml:space="preserve">Figure A1.</w:t>
@@ -4276,6 +4423,7 @@
     <w:p>
       <w:pPr>
         <w:pStyle w:val="CaptionedFigure"/>
+        <w:jc w:val="both"/>
       </w:pPr>
       <w:r>
         <w:drawing>
@@ -4323,6 +4471,7 @@
     <w:p>
       <w:pPr>
         <w:pStyle w:val="ImageCaption"/>
+        <w:jc w:val="both"/>
       </w:pPr>
       <w:r>
         <w:t xml:space="preserve">Figure A2.</w:t>
@@ -4361,6 +4510,7 @@
     <w:p>
       <w:pPr>
         <w:pStyle w:val="CaptionedFigure"/>
+        <w:jc w:val="both"/>
       </w:pPr>
       <w:r>
         <w:drawing>
@@ -4408,6 +4558,7 @@
     <w:p>
       <w:pPr>
         <w:pStyle w:val="ImageCaption"/>
+        <w:jc w:val="both"/>
       </w:pPr>
       <w:r>
         <w:t xml:space="preserve">Figure A3.</w:t>
@@ -4443,6 +4594,14 @@
         <w:tblW w:type="auto" w:w="0"/>
         <w:jc w:val="center"/>
         <w:tblLook w:firstRow="0" w:lastRow="0" w:firstColumn="0" w:lastColumn="0"/>
+        <w:tblBorders>
+          <w:top w:val="single" w:sz="6" w:space="0" w:color="C8C8C8"/>
+          <w:left w:val="single" w:sz="6" w:space="0" w:color="C8C8C8"/>
+          <w:bottom w:val="single" w:sz="6" w:space="0" w:color="C8C8C8"/>
+          <w:right w:val="single" w:sz="6" w:space="0" w:color="C8C8C8"/>
+          <w:insideH w:val="single" w:sz="6" w:space="0" w:color="C8C8C8"/>
+          <w:insideV w:val="single" w:sz="6" w:space="0" w:color="C8C8C8"/>
+        </w:tblBorders>
       </w:tblPr>
       <w:tblGrid>
         <w:gridCol w:w="2640"/>
@@ -4456,6 +4615,9 @@
             <w:pPr>
               <w:pStyle w:val="Heading2"/>
               <w:jc w:val="center"/>
+              <w:pBdr>
+                <w:bottom w:val="single" w:sz="6" w:space="2" w:color="C8C8C8"/>
+              </w:pBdr>
             </w:pPr>
             <w:bookmarkStart w:id="60" w:name="Xb70b95b8b38ded80618834689cadeac3dd55d32"/>
             <w:r>
@@ -4468,7 +4630,7 @@
           <w:tcPr/>
           <w:p>
             <w:pPr>
-              <w:jc w:val="center"/>
+              <w:jc w:val="both"/>
             </w:pPr>
             <w:r>
               <w:t xml:space="preserve">The project delivers five named artifacts, each with a defined user and use:</w:t>
@@ -4758,13 +4920,18 @@
               </w:tc>
             </w:tr>
           </w:tbl>
-          <w:p/>
+          <w:p>
+            <w:pPr>
+              <w:jc w:val="both"/>
+            </w:pPr>
+          </w:p>
         </w:tc>
       </w:tr>
     </w:tbl>
     <w:p>
       <w:pPr>
         <w:pStyle w:val="ImageCaption"/>
+        <w:jc w:val="both"/>
       </w:pPr>
       <w:r>
         <w:t xml:space="preserve">Table A1.</w:t>

</xml_diff>

<commit_message>
Word proposal: fix Table A1 heading layout
Co-Authored-By: Claude Opus 4.8 <noreply@anthropic.com>
</commit_message>
<xml_diff>
--- a/JouleFlex-proposal-2026-09-06.docx
+++ b/JouleFlex-proposal-2026-09-06.docx
@@ -3513,7 +3513,7 @@
         <w:t xml:space="preserve"> </w:t>
       </w:r>
       <w:r>
-        <w:t xml:space="preserve">A senior academic advisor with long experience in energy systems, energy efficiency and energy-systems management will advise the facility-level energy measurement and grid-flexibility work (WP4) and the techno-economic analysis (WP5), adding an energy-systems perspective to the team’s computing and ML expertise. The advisor will be named before signature.</w:t>
+        <w:t xml:space="preserve">A senior expert with long experience in energy systems, energy efficiency and energy-systems management will advise the facility-level energy measurement and grid-flexibility work (WP4) and the techno-economic analysis (WP5), adding an energy-systems perspective to the team’s computing and ML expertise. The advisor will be named before signature.</w:t>
       </w:r>
     </w:p>
     <w:p>
@@ -4291,7 +4291,7 @@
       </w:r>
     </w:p>
     <w:bookmarkEnd w:id="50"/>
-    <w:bookmarkStart w:id="61" w:name="X5d5bc83c2eef3c669b01ea2354df53c4eb22d2f"/>
+    <w:bookmarkStart w:id="60" w:name="X5d5bc83c2eef3c669b01ea2354df53c4eb22d2f"/>
     <w:p>
       <w:pPr>
         <w:pStyle w:val="Heading2"/>
@@ -4335,7 +4335,7 @@
     </w:p>
     <w:p>
       <w:pPr>
-        <w:pStyle w:val="CaptionedFigure"/>
+        <w:pStyle w:val="BodyText"/>
         <w:jc w:val="both"/>
       </w:pPr>
       <w:r>
@@ -4383,7 +4383,7 @@
     </w:p>
     <w:p>
       <w:pPr>
-        <w:pStyle w:val="ImageCaption"/>
+        <w:pStyle w:val="BodyText"/>
         <w:jc w:val="both"/>
       </w:pPr>
       <w:r>
@@ -4422,7 +4422,7 @@
     </w:p>
     <w:p>
       <w:pPr>
-        <w:pStyle w:val="CaptionedFigure"/>
+        <w:pStyle w:val="BodyText"/>
         <w:jc w:val="both"/>
       </w:pPr>
       <w:r>
@@ -4470,7 +4470,7 @@
     </w:p>
     <w:p>
       <w:pPr>
-        <w:pStyle w:val="ImageCaption"/>
+        <w:pStyle w:val="BodyText"/>
         <w:jc w:val="both"/>
       </w:pPr>
       <w:r>
@@ -4509,7 +4509,7 @@
     </w:p>
     <w:p>
       <w:pPr>
-        <w:pStyle w:val="CaptionedFigure"/>
+        <w:pStyle w:val="BodyText"/>
         <w:jc w:val="both"/>
       </w:pPr>
       <w:r>
@@ -4557,7 +4557,7 @@
     </w:p>
     <w:p>
       <w:pPr>
-        <w:pStyle w:val="ImageCaption"/>
+        <w:pStyle w:val="BodyText"/>
         <w:jc w:val="both"/>
       </w:pPr>
       <w:r>
@@ -4586,14 +4586,35 @@
       </w:r>
       <w:r>
         <w:t xml:space="preserve">JP, near 5,500 installed cards, about 50 percent above the uncapped configuration. This is the capacity lever the Israel demonstration (WP4) operationalizes: under a rationed connection, efficiency becomes throughput. The same measured curves, allocated exactly across a fleet, dominate uncapped operation at every power budget from 100 down to 40 percent of total TDP; the preliminary measured-curve fleet simulation result appears in section 2.5.5.8.</w:t>
+      </w:r>
+    </w:p>
+    <w:bookmarkEnd w:id="60"/>
+    <w:bookmarkStart w:id="61" w:name="Xb70b95b8b38ded80618834689cadeac3dd55d32"/>
+    <w:p>
+      <w:pPr>
+        <w:pStyle w:val="Heading2"/>
+        <w:pBdr>
+          <w:bottom w:val="single" w:sz="6" w:space="2" w:color="C8C8C8"/>
+        </w:pBdr>
+      </w:pPr>
+      <w:r>
+        <w:t xml:space="preserve">Table A1. The five deliverables: what each is, who uses it</w:t>
+      </w:r>
+    </w:p>
+    <w:p>
+      <w:pPr>
+        <w:pStyle w:val="FirstParagraph"/>
+        <w:jc w:val="both"/>
+      </w:pPr>
+      <w:r>
+        <w:t xml:space="preserve">The project delivers five named artifacts, each with a defined user and use:</w:t>
       </w:r>
     </w:p>
     <w:tbl>
       <w:tblPr>
-        <w:tblStyle w:val="FigureTable"/>
+        <w:tblStyle w:val="Table"/>
         <w:tblW w:type="auto" w:w="0"/>
-        <w:jc w:val="center"/>
-        <w:tblLook w:firstRow="0" w:lastRow="0" w:firstColumn="0" w:lastColumn="0"/>
+        <w:tblLook w:firstRow="1" w:lastRow="0" w:firstColumn="0" w:lastColumn="0" w:noHBand="0" w:noVBand="0" w:val="0020"/>
         <w:tblBorders>
           <w:top w:val="single" w:sz="6" w:space="0" w:color="C8C8C8"/>
           <w:left w:val="single" w:sz="6" w:space="0" w:color="C8C8C8"/>
@@ -4609,328 +4630,260 @@
         <w:gridCol w:w="2640"/>
       </w:tblGrid>
       <w:tr>
-        <w:tc>
-          <w:tcPr/>
-          <w:p>
-            <w:pPr>
-              <w:pStyle w:val="Heading2"/>
-              <w:jc w:val="center"/>
-              <w:pBdr>
-                <w:bottom w:val="single" w:sz="6" w:space="2" w:color="C8C8C8"/>
-              </w:pBdr>
-            </w:pPr>
-            <w:bookmarkStart w:id="60" w:name="Xb70b95b8b38ded80618834689cadeac3dd55d32"/>
-            <w:r>
-              <w:t xml:space="preserve">Table A1. The five deliverables: what each is, who uses it</w:t>
-            </w:r>
-            <w:bookmarkEnd w:id="60"/>
-          </w:p>
-        </w:tc>
-        <w:tc>
-          <w:tcPr/>
-          <w:p>
-            <w:pPr>
-              <w:jc w:val="both"/>
-            </w:pPr>
-            <w:r>
-              <w:t xml:space="preserve">The project delivers five named artifacts, each with a defined user and use:</w:t>
-            </w:r>
-          </w:p>
-        </w:tc>
-        <w:tc>
-          <w:tcPr/>
-          <w:tbl>
-            <w:tblPr>
-              <w:tblStyle w:val="Table"/>
-              <w:tblW w:type="auto" w:w="0"/>
-              <w:tblLook w:firstRow="1" w:lastRow="0" w:firstColumn="0" w:lastColumn="0" w:noHBand="0" w:noVBand="0" w:val="0020"/>
-            </w:tblPr>
-            <w:tblGrid>
-              <w:gridCol w:w="2640"/>
-              <w:gridCol w:w="2640"/>
-              <w:gridCol w:w="2640"/>
-            </w:tblGrid>
-            <w:tr>
-              <w:trPr>
-                <w:tblHeader w:val="on"/>
-              </w:trPr>
-              <w:tc>
-                <w:tcPr/>
-                <w:p>
-                  <w:pPr>
-                    <w:pStyle w:val="Compact"/>
-                    <w:jc w:val="left"/>
-                    <w:jc w:val="center"/>
-                  </w:pPr>
-                  <w:r>
-                    <w:t xml:space="preserve">Deliverable</w:t>
-                  </w:r>
-                </w:p>
-              </w:tc>
-              <w:tc>
-                <w:tcPr/>
-                <w:p>
-                  <w:pPr>
-                    <w:pStyle w:val="Compact"/>
-                    <w:jc w:val="left"/>
-                    <w:jc w:val="center"/>
-                  </w:pPr>
-                  <w:r>
-                    <w:t xml:space="preserve">What it is</w:t>
-                  </w:r>
-                </w:p>
-              </w:tc>
-              <w:tc>
-                <w:tcPr/>
-                <w:p>
-                  <w:pPr>
-                    <w:pStyle w:val="Compact"/>
-                    <w:jc w:val="left"/>
-                    <w:jc w:val="center"/>
-                  </w:pPr>
-                  <w:r>
-                    <w:t xml:space="preserve">Who uses it, for what</w:t>
-                  </w:r>
-                </w:p>
-              </w:tc>
-            </w:tr>
-            <w:tr>
-              <w:tc>
-                <w:tcPr/>
-                <w:p>
-                  <w:pPr>
-                    <w:pStyle w:val="Compact"/>
-                    <w:jc w:val="left"/>
-                    <w:jc w:val="center"/>
-                  </w:pPr>
-                  <w:r>
-                    <w:rPr>
-                      <w:b/>
-                      <w:bCs/>
-                    </w:rPr>
-                    <w:t xml:space="preserve">ELF-2</w:t>
-                  </w:r>
-                </w:p>
-              </w:tc>
-              <w:tc>
-                <w:tcPr/>
-                <w:p>
-                  <w:pPr>
-                    <w:pStyle w:val="Compact"/>
-                    <w:jc w:val="left"/>
-                    <w:jc w:val="center"/>
-                  </w:pPr>
-                  <w:r>
-                    <w:t xml:space="preserve">An open dataset: power, throughput and latency at every operating point, board to wall, on current GPUs and production serving software</w:t>
-                  </w:r>
-                </w:p>
-              </w:tc>
-              <w:tc>
-                <w:tcPr/>
-                <w:p>
-                  <w:pPr>
-                    <w:pStyle w:val="Compact"/>
-                    <w:jc w:val="left"/>
-                    <w:jc w:val="center"/>
-                  </w:pPr>
-                  <w:r>
-                    <w:t xml:space="preserve">Researchers and vendors, as ground truth; every other deliverable is built and validated on it</w:t>
-                  </w:r>
-                </w:p>
-              </w:tc>
-            </w:tr>
-            <w:tr>
-              <w:tc>
-                <w:tcPr/>
-                <w:p>
-                  <w:pPr>
-                    <w:pStyle w:val="Compact"/>
-                    <w:jc w:val="left"/>
-                    <w:jc w:val="center"/>
-                  </w:pPr>
-                  <w:r>
-                    <w:rPr>
-                      <w:b/>
-                      <w:bCs/>
-                    </w:rPr>
-                    <w:t xml:space="preserve">The characterization kit</w:t>
-                  </w:r>
-                </w:p>
-              </w:tc>
-              <w:tc>
-                <w:tcPr/>
-                <w:p>
-                  <w:pPr>
-                    <w:pStyle w:val="Compact"/>
-                    <w:jc w:val="left"/>
-                    <w:jc w:val="center"/>
-                  </w:pPr>
-                  <w:r>
-                    <w:t xml:space="preserve">Software plus protocol: a one-test procedure and the two fitted models placing the JP of a new or unmeasured card within the validated hardware domain, in hours</w:t>
-                  </w:r>
-                </w:p>
-              </w:tc>
-              <w:tc>
-                <w:tcPr/>
-                <w:p>
-                  <w:pPr>
-                    <w:pStyle w:val="Compact"/>
-                    <w:jc w:val="left"/>
-                    <w:jc w:val="center"/>
-                  </w:pPr>
-                  <w:r>
-                    <w:t xml:space="preserve">A GPU engineer or operator qualifying a new card model or a new serving stack before deployment, at known cost</w:t>
-                  </w:r>
-                </w:p>
-              </w:tc>
-            </w:tr>
-            <w:tr>
-              <w:tc>
-                <w:tcPr/>
-                <w:p>
-                  <w:pPr>
-                    <w:pStyle w:val="Compact"/>
-                    <w:jc w:val="left"/>
-                    <w:jc w:val="center"/>
-                  </w:pPr>
-                  <w:r>
-                    <w:rPr>
-                      <w:b/>
-                      <w:bCs/>
-                    </w:rPr>
-                    <w:t xml:space="preserve">The control engine</w:t>
-                  </w:r>
-                </w:p>
-              </w:tc>
-              <w:tc>
-                <w:tcPr/>
-                <w:p>
-                  <w:pPr>
-                    <w:pStyle w:val="Compact"/>
-                    <w:jc w:val="left"/>
-                    <w:jc w:val="center"/>
-                  </w:pPr>
-                  <w:r>
-                    <w:t xml:space="preserve">An open-source control engine that assigns jobs and sets caps to keep a fleet inside its envelope, evaluated in the twin and demonstrated on a metered rented server before any deployment</w:t>
-                  </w:r>
-                </w:p>
-              </w:tc>
-              <w:tc>
-                <w:tcPr/>
-                <w:p>
-                  <w:pPr>
-                    <w:pStyle w:val="Compact"/>
-                    <w:jc w:val="left"/>
-                    <w:jc w:val="center"/>
-                  </w:pPr>
-                  <w:r>
-                    <w:t xml:space="preserve">An AI data-center manager, to cut energy per job and honor a committed envelope; its report doubles as the compliance record</w:t>
-                  </w:r>
-                </w:p>
-              </w:tc>
-            </w:tr>
-            <w:tr>
-              <w:tc>
-                <w:tcPr/>
-                <w:p>
-                  <w:pPr>
-                    <w:pStyle w:val="Compact"/>
-                    <w:jc w:val="left"/>
-                    <w:jc w:val="center"/>
-                  </w:pPr>
-                  <w:r>
-                    <w:rPr>
-                      <w:b/>
-                      <w:bCs/>
-                    </w:rPr>
-                    <w:t xml:space="preserve">The digital twin</w:t>
-                  </w:r>
-                </w:p>
-              </w:tc>
-              <w:tc>
-                <w:tcPr/>
-                <w:p>
-                  <w:pPr>
-                    <w:pStyle w:val="Compact"/>
-                    <w:jc w:val="left"/>
-                    <w:jc w:val="center"/>
-                  </w:pPr>
-                  <w:r>
-                    <w:t xml:space="preserve">A simulator replaying the measured curves of a described fleet and job mix, evaluating any policy or envelope scenario exactly before hardware is touched</w:t>
-                  </w:r>
-                </w:p>
-              </w:tc>
-              <w:tc>
-                <w:tcPr/>
-                <w:p>
-                  <w:pPr>
-                    <w:pStyle w:val="Compact"/>
-                    <w:jc w:val="left"/>
-                    <w:jc w:val="center"/>
-                  </w:pPr>
-                  <w:r>
-                    <w:t xml:space="preserve">An operator testing policies before deployment; a planner or regulator asking what a proposed facility could deliver and shed under a given connection</w:t>
-                  </w:r>
-                </w:p>
-              </w:tc>
-            </w:tr>
-            <w:tr>
-              <w:tc>
-                <w:tcPr/>
-                <w:p>
-                  <w:pPr>
-                    <w:pStyle w:val="Compact"/>
-                    <w:jc w:val="left"/>
-                    <w:jc w:val="center"/>
-                  </w:pPr>
-                  <w:r>
-                    <w:rPr>
-                      <w:b/>
-                      <w:bCs/>
-                    </w:rPr>
-                    <w:t xml:space="preserve">The grid interface and policy report</w:t>
-                  </w:r>
-                </w:p>
-              </w:tc>
-              <w:tc>
-                <w:tcPr/>
-                <w:p>
-                  <w:pPr>
-                    <w:pStyle w:val="Compact"/>
-                    <w:jc w:val="left"/>
-                    <w:jc w:val="center"/>
-                  </w:pPr>
-                  <w:r>
-                    <w:t xml:space="preserve">A blueprint: open formats for the envelope commitment, the flexibility offer and the delivery record, plus a regulator-facing report quantifying firm-plus-flexible connections against the national queue</w:t>
-                  </w:r>
-                </w:p>
-              </w:tc>
-              <w:tc>
-                <w:tcPr/>
-                <w:p>
-                  <w:pPr>
-                    <w:pStyle w:val="Compact"/>
-                    <w:jc w:val="left"/>
-                    <w:jc w:val="center"/>
-                  </w:pPr>
-                  <w:r>
-                    <w:t xml:space="preserve">The Electricity Authority and Noga, as the technical basis for offering conditional connections and auditing compliance</w:t>
-                  </w:r>
-                </w:p>
-              </w:tc>
-            </w:tr>
-          </w:tbl>
-          <w:p>
-            <w:pPr>
-              <w:jc w:val="both"/>
-            </w:pPr>
+        <w:trPr>
+          <w:tblHeader w:val="on"/>
+        </w:trPr>
+        <w:tc>
+          <w:tcPr/>
+          <w:p>
+            <w:pPr>
+              <w:pStyle w:val="Compact"/>
+              <w:jc w:val="both"/>
+            </w:pPr>
+            <w:r>
+              <w:t xml:space="preserve">Deliverable</w:t>
+            </w:r>
+          </w:p>
+        </w:tc>
+        <w:tc>
+          <w:tcPr/>
+          <w:p>
+            <w:pPr>
+              <w:pStyle w:val="Compact"/>
+              <w:jc w:val="both"/>
+            </w:pPr>
+            <w:r>
+              <w:t xml:space="preserve">What it is</w:t>
+            </w:r>
+          </w:p>
+        </w:tc>
+        <w:tc>
+          <w:tcPr/>
+          <w:p>
+            <w:pPr>
+              <w:pStyle w:val="Compact"/>
+              <w:jc w:val="both"/>
+            </w:pPr>
+            <w:r>
+              <w:t xml:space="preserve">Who uses it, for what</w:t>
+            </w:r>
+          </w:p>
+        </w:tc>
+      </w:tr>
+      <w:tr>
+        <w:tc>
+          <w:tcPr/>
+          <w:p>
+            <w:pPr>
+              <w:pStyle w:val="Compact"/>
+              <w:jc w:val="both"/>
+            </w:pPr>
+            <w:r>
+              <w:rPr>
+                <w:b/>
+                <w:bCs/>
+              </w:rPr>
+              <w:t xml:space="preserve">ELF-2</w:t>
+            </w:r>
+          </w:p>
+        </w:tc>
+        <w:tc>
+          <w:tcPr/>
+          <w:p>
+            <w:pPr>
+              <w:pStyle w:val="Compact"/>
+              <w:jc w:val="both"/>
+            </w:pPr>
+            <w:r>
+              <w:t xml:space="preserve">An open dataset: power, throughput and latency at every operating point, board to wall, on current GPUs and production serving software</w:t>
+            </w:r>
+          </w:p>
+        </w:tc>
+        <w:tc>
+          <w:tcPr/>
+          <w:p>
+            <w:pPr>
+              <w:pStyle w:val="Compact"/>
+              <w:jc w:val="both"/>
+            </w:pPr>
+            <w:r>
+              <w:t xml:space="preserve">Researchers and vendors, as ground truth; every other deliverable is built and validated on it</w:t>
+            </w:r>
+          </w:p>
+        </w:tc>
+      </w:tr>
+      <w:tr>
+        <w:tc>
+          <w:tcPr/>
+          <w:p>
+            <w:pPr>
+              <w:pStyle w:val="Compact"/>
+              <w:jc w:val="both"/>
+            </w:pPr>
+            <w:r>
+              <w:rPr>
+                <w:b/>
+                <w:bCs/>
+              </w:rPr>
+              <w:t xml:space="preserve">The characterization kit</w:t>
+            </w:r>
+          </w:p>
+        </w:tc>
+        <w:tc>
+          <w:tcPr/>
+          <w:p>
+            <w:pPr>
+              <w:pStyle w:val="Compact"/>
+              <w:jc w:val="both"/>
+            </w:pPr>
+            <w:r>
+              <w:t xml:space="preserve">Software plus protocol: a one-test procedure and the two fitted models placing the JP of a new or unmeasured card within the validated hardware domain, in hours</w:t>
+            </w:r>
+          </w:p>
+        </w:tc>
+        <w:tc>
+          <w:tcPr/>
+          <w:p>
+            <w:pPr>
+              <w:pStyle w:val="Compact"/>
+              <w:jc w:val="both"/>
+            </w:pPr>
+            <w:r>
+              <w:t xml:space="preserve">A GPU engineer or operator qualifying a new card model or a new serving stack before deployment, at known cost</w:t>
+            </w:r>
+          </w:p>
+        </w:tc>
+      </w:tr>
+      <w:tr>
+        <w:tc>
+          <w:tcPr/>
+          <w:p>
+            <w:pPr>
+              <w:pStyle w:val="Compact"/>
+              <w:jc w:val="both"/>
+            </w:pPr>
+            <w:r>
+              <w:rPr>
+                <w:b/>
+                <w:bCs/>
+              </w:rPr>
+              <w:t xml:space="preserve">The control engine</w:t>
+            </w:r>
+          </w:p>
+        </w:tc>
+        <w:tc>
+          <w:tcPr/>
+          <w:p>
+            <w:pPr>
+              <w:pStyle w:val="Compact"/>
+              <w:jc w:val="both"/>
+            </w:pPr>
+            <w:r>
+              <w:t xml:space="preserve">An open-source control engine that assigns jobs and sets caps to keep a fleet inside its envelope, evaluated in the twin and demonstrated on a metered rented server before any deployment</w:t>
+            </w:r>
+          </w:p>
+        </w:tc>
+        <w:tc>
+          <w:tcPr/>
+          <w:p>
+            <w:pPr>
+              <w:pStyle w:val="Compact"/>
+              <w:jc w:val="both"/>
+            </w:pPr>
+            <w:r>
+              <w:t xml:space="preserve">An AI data-center manager, to cut energy per job and honor a committed envelope; its report doubles as the compliance record</w:t>
+            </w:r>
+          </w:p>
+        </w:tc>
+      </w:tr>
+      <w:tr>
+        <w:tc>
+          <w:tcPr/>
+          <w:p>
+            <w:pPr>
+              <w:pStyle w:val="Compact"/>
+              <w:jc w:val="both"/>
+            </w:pPr>
+            <w:r>
+              <w:rPr>
+                <w:b/>
+                <w:bCs/>
+              </w:rPr>
+              <w:t xml:space="preserve">The digital twin</w:t>
+            </w:r>
+          </w:p>
+        </w:tc>
+        <w:tc>
+          <w:tcPr/>
+          <w:p>
+            <w:pPr>
+              <w:pStyle w:val="Compact"/>
+              <w:jc w:val="both"/>
+            </w:pPr>
+            <w:r>
+              <w:t xml:space="preserve">A simulator replaying the measured curves of a described fleet and job mix, evaluating any policy or envelope scenario exactly before hardware is touched</w:t>
+            </w:r>
+          </w:p>
+        </w:tc>
+        <w:tc>
+          <w:tcPr/>
+          <w:p>
+            <w:pPr>
+              <w:pStyle w:val="Compact"/>
+              <w:jc w:val="both"/>
+            </w:pPr>
+            <w:r>
+              <w:t xml:space="preserve">An operator testing policies before deployment; a planner or regulator asking what a proposed facility could deliver and shed under a given connection</w:t>
+            </w:r>
+          </w:p>
+        </w:tc>
+      </w:tr>
+      <w:tr>
+        <w:tc>
+          <w:tcPr/>
+          <w:p>
+            <w:pPr>
+              <w:pStyle w:val="Compact"/>
+              <w:jc w:val="both"/>
+            </w:pPr>
+            <w:r>
+              <w:rPr>
+                <w:b/>
+                <w:bCs/>
+              </w:rPr>
+              <w:t xml:space="preserve">The grid interface and policy report</w:t>
+            </w:r>
+          </w:p>
+        </w:tc>
+        <w:tc>
+          <w:tcPr/>
+          <w:p>
+            <w:pPr>
+              <w:pStyle w:val="Compact"/>
+              <w:jc w:val="both"/>
+            </w:pPr>
+            <w:r>
+              <w:t xml:space="preserve">A blueprint: open formats for the envelope commitment, the flexibility offer and the delivery record, plus a regulator-facing report quantifying firm-plus-flexible connections against the national queue</w:t>
+            </w:r>
+          </w:p>
+        </w:tc>
+        <w:tc>
+          <w:tcPr/>
+          <w:p>
+            <w:pPr>
+              <w:pStyle w:val="Compact"/>
+              <w:jc w:val="both"/>
+            </w:pPr>
+            <w:r>
+              <w:t xml:space="preserve">The Electricity Authority and Noga, as the technical basis for offering conditional connections and auditing compliance</w:t>
+            </w:r>
           </w:p>
         </w:tc>
       </w:tr>
     </w:tbl>
     <w:p>
       <w:pPr>
-        <w:pStyle w:val="ImageCaption"/>
+        <w:pStyle w:val="BodyText"/>
         <w:jc w:val="both"/>
       </w:pPr>
       <w:r>

</xml_diff>

<commit_message>
Name advisor Prof. Tshuva; regen PDF + Word
Co-Authored-By: Claude Opus 4.8 <noreply@anthropic.com>
</commit_message>
<xml_diff>
--- a/JouleFlex-proposal-2026-09-06.docx
+++ b/JouleFlex-proposal-2026-09-06.docx
@@ -3494,7 +3494,7 @@
         <w:rPr>
           <w:rtl/>
         </w:rPr>
-        <w:t xml:space="preserve">One postdoctoral researcher at 90% position, both years, carries the measurement, modeling and control work under the PI's supervision, reported within a month of signature (נספח טז' §2.5). Core profile required at hiring: GPU systems and energy instrumentation (NVML/RAPL/BMC), machine-learning systems, and optimization or control. The grid-flexibility and techno-economic analysis of WP4 and WP5 is public-data modeling on Noga and Electricity Authority figures, developed on the project under the PI's direction, and needs no power-systems specialist. Recruitment runs through HIT and national postdoctoral channels; if the month-1 start slips the PI runs the WP1 bench directly (the ELF harness is his), so the minimum-success path holds.</w:t>
+        <w:t xml:space="preserve">One postdoctoral researcher at 90% position, both years, carries the measurement, modeling and control work under the PI's supervision, reported within a month of signature (נספח טז' §2.5). Core profile required at hiring: GPU systems and energy instrumentation (NVML/RAPL/BMC), machine-learning systems, and optimization or control. The grid-flexibility and techno-economic analysis of WP4 and WP5 is public-data modeling on Noga and Electricity Authority figures, developed on the project under the PI's direction, and needs no dedicated power-systems hire. Recruitment runs through HIT and national postdoctoral channels; if the month-1 start slips the PI runs the WP1 bench directly (the ELF harness is his), so the minimum-success path holds.</w:t>
       </w:r>
     </w:p>
     <w:p>
@@ -3513,7 +3513,7 @@
         <w:t xml:space="preserve"> </w:t>
       </w:r>
       <w:r>
-        <w:t xml:space="preserve">A senior expert with long experience in energy systems, energy efficiency and energy-systems management will advise the facility-level energy measurement and grid-flexibility work (WP4) and the techno-economic analysis (WP5), adding an energy-systems perspective to the team’s computing and ML expertise. The advisor will be named before signature.</w:t>
+        <w:t xml:space="preserve">Prof. Moshe Tshuva (Afeka College of Engineering), an energy-systems engineer with over two decades in energy-systems management, energy efficiency and thermodynamics, advises the techno-economic and connection-valuation analysis (WP5) and strengthens the energy-systems basis of the benefit and impact case, adding a senior energy-systems perspective to the team’s computing and machine-learning expertise.</w:t>
       </w:r>
     </w:p>
     <w:p>

</xml_diff>

<commit_message>
Formula typesetting: proper sub/superscripts + italic variables
Co-Authored-By: Claude Opus 4.8 <noreply@anthropic.com>
</commit_message>
<xml_diff>
--- a/JouleFlex-proposal-2026-09-06.docx
+++ b/JouleFlex-proposal-2026-09-06.docx
@@ -1003,7 +1003,99 @@
         <w:jc w:val="both"/>
       </w:pPr>
       <w:r>
-        <w:t xml:space="preserve">P(θ) = P₀ + a·θ^β,   median R² = 0.99,</w:t>
+        <w:rPr>
+          <w:i/>
+          <w:iCs/>
+        </w:rPr>
+        <w:t xml:space="preserve">P</w:t>
+      </w:r>
+      <w:r>
+        <w:t xml:space="preserve">(</w:t>
+      </w:r>
+      <w:r>
+        <w:rPr>
+          <w:i/>
+          <w:iCs/>
+        </w:rPr>
+        <w:t xml:space="preserve">θ</w:t>
+      </w:r>
+      <w:r>
+        <w:t xml:space="preserve">) =</w:t>
+      </w:r>
+      <w:r>
+        <w:t xml:space="preserve"> </w:t>
+      </w:r>
+      <w:r>
+        <w:rPr>
+          <w:i/>
+          <w:iCs/>
+        </w:rPr>
+        <w:t xml:space="preserve">P</w:t>
+      </w:r>
+      <w:r>
+        <w:rPr>
+          <w:vertAlign w:val="subscript"/>
+        </w:rPr>
+        <w:t xml:space="preserve">0</w:t>
+      </w:r>
+      <w:r>
+        <w:t xml:space="preserve"> </w:t>
+      </w:r>
+      <w:r>
+        <w:t xml:space="preserve">+</w:t>
+      </w:r>
+      <w:r>
+        <w:t xml:space="preserve"> </w:t>
+      </w:r>
+      <w:r>
+        <w:rPr>
+          <w:i/>
+          <w:iCs/>
+        </w:rPr>
+        <w:t xml:space="preserve">a</w:t>
+      </w:r>
+      <w:r>
+        <w:t xml:space="preserve">·</w:t>
+      </w:r>
+      <w:r>
+        <w:rPr>
+          <w:i/>
+          <w:iCs/>
+        </w:rPr>
+        <w:t xml:space="preserve">θ</w:t>
+      </w:r>
+      <w:r>
+        <w:rPr>
+          <w:i/>
+          <w:iCs/>
+          <w:vertAlign w:val="superscript"/>
+        </w:rPr>
+        <w:t xml:space="preserve">β</w:t>
+      </w:r>
+      <w:r>
+        <w:t xml:space="preserve">,   median</w:t>
+      </w:r>
+      <w:r>
+        <w:t xml:space="preserve"> </w:t>
+      </w:r>
+      <w:r>
+        <w:rPr>
+          <w:i/>
+          <w:iCs/>
+        </w:rPr>
+        <w:t xml:space="preserve">R</w:t>
+      </w:r>
+      <w:r>
+        <w:rPr>
+          <w:vertAlign w:val="superscript"/>
+        </w:rPr>
+        <w:t xml:space="preserve">2</w:t>
+      </w:r>
+      <w:r>
+        <w:t xml:space="preserve"> </w:t>
+      </w:r>
+      <w:r>
+        <w:t xml:space="preserve">= 0.99,</w:t>
       </w:r>
     </w:p>
     <w:p>
@@ -4405,13 +4497,114 @@
         <w:t xml:space="preserve"> </w:t>
       </w:r>
       <w:r>
-        <w:t xml:space="preserve">maximum and power to the card's TDP. All workloads follow a single fitted law per card, P(θ) = P₀ + a·θ^β (pooled</w:t>
-      </w:r>
-      <w:r>
-        <w:t xml:space="preserve"> </w:t>
-      </w:r>
-      <w:r>
-        <w:t xml:space="preserve">per-card R² of 0.92, 0.88 and higher per-sweep), showing the exponent travels with the card rather than the model. This</w:t>
+        <w:t xml:space="preserve">maximum and power to the card's TDP. All workloads follow a single fitted law per card,</w:t>
+      </w:r>
+      <w:r>
+        <w:t xml:space="preserve"> </w:t>
+      </w:r>
+      <w:r>
+        <w:rPr>
+          <w:i/>
+          <w:iCs/>
+        </w:rPr>
+        <w:t xml:space="preserve">P</w:t>
+      </w:r>
+      <w:r>
+        <w:t xml:space="preserve">(</w:t>
+      </w:r>
+      <w:r>
+        <w:rPr>
+          <w:i/>
+          <w:iCs/>
+        </w:rPr>
+        <w:t xml:space="preserve">θ</w:t>
+      </w:r>
+      <w:r>
+        <w:t xml:space="preserve">) =</w:t>
+      </w:r>
+      <w:r>
+        <w:t xml:space="preserve"> </w:t>
+      </w:r>
+      <w:r>
+        <w:rPr>
+          <w:i/>
+          <w:iCs/>
+        </w:rPr>
+        <w:t xml:space="preserve">P</w:t>
+      </w:r>
+      <w:r>
+        <w:rPr>
+          <w:vertAlign w:val="subscript"/>
+        </w:rPr>
+        <w:t xml:space="preserve">0</w:t>
+      </w:r>
+      <w:r>
+        <w:t xml:space="preserve"> </w:t>
+      </w:r>
+      <w:r>
+        <w:t xml:space="preserve">+</w:t>
+      </w:r>
+      <w:r>
+        <w:t xml:space="preserve"> </w:t>
+      </w:r>
+      <w:r>
+        <w:rPr>
+          <w:i/>
+          <w:iCs/>
+        </w:rPr>
+        <w:t xml:space="preserve">a</w:t>
+      </w:r>
+      <w:r>
+        <w:t xml:space="preserve">·</w:t>
+      </w:r>
+      <w:r>
+        <w:rPr>
+          <w:i/>
+          <w:iCs/>
+        </w:rPr>
+        <w:t xml:space="preserve">θ</w:t>
+      </w:r>
+      <w:r>
+        <w:rPr>
+          <w:i/>
+          <w:iCs/>
+          <w:vertAlign w:val="superscript"/>
+        </w:rPr>
+        <w:t xml:space="preserve">β</w:t>
+      </w:r>
+      <w:r>
+        <w:t xml:space="preserve"> </w:t>
+      </w:r>
+      <w:r>
+        <w:t xml:space="preserve">(pooled</w:t>
+      </w:r>
+      <w:r>
+        <w:t xml:space="preserve"> </w:t>
+      </w:r>
+      <w:r>
+        <w:t xml:space="preserve">per-card</w:t>
+      </w:r>
+      <w:r>
+        <w:t xml:space="preserve"> </w:t>
+      </w:r>
+      <w:r>
+        <w:rPr>
+          <w:i/>
+          <w:iCs/>
+        </w:rPr>
+        <w:t xml:space="preserve">R</w:t>
+      </w:r>
+      <w:r>
+        <w:rPr>
+          <w:vertAlign w:val="superscript"/>
+        </w:rPr>
+        <w:t xml:space="preserve">2</w:t>
+      </w:r>
+      <w:r>
+        <w:t xml:space="preserve"> </w:t>
+      </w:r>
+      <w:r>
+        <w:t xml:space="preserve">of 0.92, 0.88 and higher per-sweep), showing the exponent travels with the card rather than the model. This</w:t>
       </w:r>
       <w:r>
         <w:t xml:space="preserve"> </w:t>

</xml_diff>

<commit_message>
Sync live site: re-focused Fit with [24][25] cites, Fable review fixes, tighter spacing (core 10pp)
Co-Authored-By: Claude Opus 4.8 <noreply@anthropic.com>
</commit_message>
<xml_diff>
--- a/JouleFlex-proposal-2026-09-06.docx
+++ b/JouleFlex-proposal-2026-09-06.docx
@@ -249,7 +249,7 @@
         <w:jc w:val="both"/>
       </w:pPr>
       <w:r>
-        <w:t xml:space="preserve">In July 2026 Israel's Electricity Authority froze new data-center connection requests after the queue reached 27,000 megawatts. Under electricity limits, data centers switch GPUs (AI processors) off or cap their power, deciding in watts (the momentary draw), not joules (the energy consumed). An over-capped GPU computes slower and pays its fixed power floor longer, so energy per unit of useful work rises even as the meter shows fewer watts: less AI per kilowatt-hour. A similar challenge exists in aviation, where it is solved: fuel flow rises far faster than speed, yet slow flight burns fuel longer, so airlines cruise at the speed minimizing fuel per kilometer.</w:t>
+        <w:t xml:space="preserve">In July 2026 Israel's Electricity Authority froze new data-center connection requests after the queue reached 27,000 megawatts. Under electricity limits, data centers switch GPUs (AI processors) off or cap their power, deciding in watts (the momentary draw), not joules (the energy consumed). An over-capped GPU computes slower and pays its fixed power floor longer, so energy per unit of useful work rises even as the meter shows fewer watts: less AI per kilowatt-hour. Aviation solved the same problem: fuel flow rises far faster than speed, yet slow flight burns fuel longer, so airlines cruise at the speed minimizing fuel per kilometer.</w:t>
       </w:r>
     </w:p>
     <w:p>
@@ -258,7 +258,7 @@
         <w:jc w:val="both"/>
       </w:pPr>
       <w:r>
-        <w:t xml:space="preserve">The PI's study [1] measured the time-power tradeoff for AI workloads (5,500 measurements, 20 models, four GPUs). Energy per task is U-shaped in the power cap. On the large GPUs its minimum, the Joule Point (JP), sits at 43 to 46 percent of rated power; holding a card there cut energy per task 29 to 31 percent while running 1.2 times slower. Even under a strict deadline, capping saved 28 percent of energy while keeping 95 percent of workload value. A fleet simulation on the measured curves (only scheduling simulated) served equal work with 18 to 45 percent less energy.</w:t>
+        <w:t xml:space="preserve">The PI's study [1] measured the time-power tradeoff for AI workloads (5,500 measurements, 20 models, four GPUs). Energy per task is U-shaped in the power cap. On the large GPUs its minimum, the Joule Point (JP), sits at 43 to 46 percent of rated power; holding a card there cut energy per task 29 to 31 percent while running 1.2 times slower. Even under a strict deadline, capping saved 28 percent of energy while keeping 95 percent of workload value. A fleet simulation on the measured curves served equal work with 18 to 45 percent less energy: about 50 percent more AI work per megawatt.</w:t>
       </w:r>
     </w:p>
     <w:p>
@@ -273,7 +273,7 @@
         <w:t xml:space="preserve"> </w:t>
       </w:r>
       <w:r>
-        <w:t xml:space="preserve">Each is a modeling problem. This project delivers the decision-support toolkit answering all three, released with an open measurement dataset. Run near its JP, a fleet frees dispatchable power headroom for Israel’s flexible-connection scheme.</w:t>
+        <w:t xml:space="preserve">Each is a modeling problem. This project delivers the decision-support toolkit answering all three, released with an open measurement dataset. Run near its JP, a fleet frees curtailable connection capacity for Israel’s flexible-connection scheme.</w:t>
       </w:r>
     </w:p>
     <w:bookmarkEnd w:id="32"/>
@@ -755,7 +755,7 @@
         <w:t xml:space="preserve">Joule Point (JP)</w:t>
       </w:r>
       <w:r>
-        <w:t xml:space="preserve">, before rising again: the cap at which a card does the most AI work per joule. The PI's study [1] measured the JP across 20 models and 4 GPUs (three swept finely); it sits well below the thermal-design limit, is near-constant per card, and delivers 29–31 percent less energy per task at about 1.2 times the runtime. Production data centers still run cards at maximum power, and Israel's grid is being sized for that maximum. Capturing the JP, and the load flexibility it exposes, is what this project turns into deployable tools.</w:t>
+        <w:t xml:space="preserve">, before rising again: the cap at which a card does the most AI work per joule. The PI's study [1] measured the JP across 20 models and 4 GPUs (three swept finely); it sits well below the thermal design power (TDP), is near-constant per card, and delivers 29–31 percent less energy per task at about 1.2 times the runtime. Production data centers still run cards at maximum power, and Israel's grid is being sized for that maximum. Capturing the JP, and the load flexibility it exposes, is what this project turns into deployable tools.</w:t>
       </w:r>
     </w:p>
     <w:p>
@@ -862,19 +862,7 @@
         <w:jc w:val="both"/>
       </w:pPr>
       <w:r>
-        <w:t xml:space="preserve">Can AI data centers operate as controllable electrical loads, each GPU near its energy-optimal cap and the facility</w:t>
-      </w:r>
-      <w:r>
-        <w:t xml:space="preserve"> </w:t>
-      </w:r>
-      <w:r>
-        <w:t xml:space="preserve">inside a changing power limit, so that energy per unit of AI work falls and the power capacity required to serve it shrinks, while admitted</w:t>
-      </w:r>
-      <w:r>
-        <w:t xml:space="preserve"> </w:t>
-      </w:r>
-      <w:r>
-        <w:t xml:space="preserve">work keeps its service promises, under Israeli grid constraints?</w:t>
+        <w:t xml:space="preserve">Can an AI data center run as a controllable electrical load under Israeli grid constraints: each GPU near its energy-optimal cap, the facility inside a changing power limit, less energy and less connected power per unit of AI work, and every admitted job still meeting its deadline?</w:t>
       </w:r>
     </w:p>
     <w:p>
@@ -906,7 +894,7 @@
         <w:t xml:space="preserve"> </w:t>
       </w:r>
       <w:r>
-        <w:t xml:space="preserve">Do the power law and JP (measured on 20 models, 4 GPUs; three swept finely) hold on H100/B200-class hardware, production serving software, and shared GPUs?</w:t>
+        <w:t xml:space="preserve">Do the power law and JP (measured on 20 models, 4 GPUs; three swept finely) hold on H100/L40S-class hardware (B200-class as access allows), production serving software, and shared GPUs?</w:t>
       </w:r>
     </w:p>
     <w:p>
@@ -1329,7 +1317,7 @@
         <w:t xml:space="preserve"> </w:t>
       </w:r>
       <w:r>
-        <w:t xml:space="preserve">operating point and loosens to R² 0.88–0.92 when pooled across batch sizes.</w:t>
+        <w:t xml:space="preserve">operating point and loosens to R² 0.88–0.92 when pooled across workloads.</w:t>
       </w:r>
       <w:r>
         <w:t xml:space="preserve"> </w:t>
@@ -1379,7 +1367,7 @@
         <w:t xml:space="preserve"> </w:t>
       </w:r>
       <w:r>
-        <w:t xml:space="preserve">draw at its default; methodology reviews [15] motivate our fixed protocol. Recent work power-caps GPU inference servers for energy savings [20] but reports a single recommended cap, not the optimum’s measured location across many models and GPUs, and one analysis finds capping inert for memory-bound decode [23], a regime ELF’s loaded-serving sweeps bound. Grid-interactive AI data centers are now demonstrated as grid assets [21], following a facility power target with priority-preserving curtailment; JouleFlex instead places jobs at the measured per-(card,job) energy optimum and quantifies the firm-plus-flexible capacity in MW, ramp and recovery.</w:t>
+        <w:t xml:space="preserve">draw at its default; methodology reviews [15] motivate our fixed protocol. Recent work power-caps GPU inference servers for energy savings [20] but reports a single recommended cap, not the optimum’s measured location across many models and GPUs, and one analysis finds capping inert for memory-bound decode [23], a regime ELF’s loaded-serving sweeps bound. AI data centers have been demonstrated as grid assets [21] by following a facility power target and cutting low-priority work first; JouleFlex instead runs each job at its measured energy optimum and states the firm and flexible capacity in MW, ramp time and recovery time.</w:t>
       </w:r>
     </w:p>
     <w:bookmarkEnd w:id="40"/>
@@ -1412,7 +1400,7 @@
         <w:t xml:space="preserve"> </w:t>
       </w:r>
       <w:r>
-        <w:t xml:space="preserve">It is established for single jobs at fixed settings on three inference GPUs; its persistence on H100 and, as access allows, B200-class hardware, production serving software and shared cards is unknown, and placing the JP on a new GPU still requires a full sweep [1].</w:t>
+        <w:t xml:space="preserve">It is established for single jobs at fixed settings on the three finely swept GPUs (A100, A10G, L4); its persistence on H100 and, as access allows, B200-class hardware, production serving software and shared cards is unknown, and placing the JP on a new GPU still requires a full sweep [1].</w:t>
       </w:r>
     </w:p>
     <w:p>
@@ -1701,7 +1689,7 @@
               <w:jc w:val="both"/>
             </w:pPr>
             <w:r>
-              <w:t xml:space="preserve">Re-run the study's measurement sweep on current GPUs (H100/L40S class) and production serving engines (vLLM [16], TensorRT-LLM), reading power at three tiers: GPU board (NVML), host CPU (RAPL), and server-input, the wall tier (BMC via IPMI/Redfish). The JP is where the slope of P(θ) is zero, so a constant meter bias cancels in its location: JP and per-card savings are calibration-robust, while absolute board-to-wall and megawatt figures carry that caveat.</w:t>
+              <w:t xml:space="preserve">Re-run the study's measurement sweep on current GPUs (H100/L40S class) and production serving engines (vLLM [16], TensorRT-LLM), reading power at three tiers: GPU board (NVML), host CPU (RAPL), and server-input, the wall tier (BMC via IPMI/Redfish). The JP is the energy minimum, where the tangent from the origin meets P(θ) (dE/dθ = 0); a meter gain error leaves its location unchanged while an additive offset shifts it, so JP location and per-card savings are gain-robust, while absolute board-to-wall and megawatt figures carry the offset caveat.</w:t>
             </w:r>
             <w:r>
               <w:t xml:space="preserve"> </w:t>
@@ -2049,7 +2037,7 @@
         <w:t xml:space="preserve"> </w:t>
       </w:r>
       <w:r>
-        <w:t xml:space="preserve">Inference power-capping saves energy at a chosen cap [20] and can be inert for memory-bound decode [23]; JouleFlex instead sets power to the computed energy optimum per (card, job) in the loaded regime where the cap binds; the measured cost of universal full-power operation is about a third of inference energy.</w:t>
+        <w:t xml:space="preserve">Inference power-capping saves energy at a chosen cap [20] and can be inert for memory-bound decode [23]; JouleFlex instead sets power to the computed energy optimum per (card, job) in the loaded regime where the cap binds; the measured cost of universal full-power operation is about 30 percent of inference energy.</w:t>
       </w:r>
     </w:p>
     <w:p>
@@ -2339,7 +2327,7 @@
               <w:jc w:val="both"/>
             </w:pPr>
             <w:r>
-              <w:t xml:space="preserve">Machine learning as the instrument for topics 8 and 6: the WP2 job and transfer models predict a card’s energy-optimal point from its features plus one short test; the WP3 controller solves joint allocation-and-capping over the learned curves.</w:t>
+              <w:t xml:space="preserve">Machine learning as the instrument for topics 8 and 6: the WP2 job model predicts a job’s energy-optimal cap from its features and the transfer model predicts a new card’s curve from its specifications plus one short test; the WP3 controller solves joint allocation-and-capping over the learned curves.</w:t>
             </w:r>
           </w:p>
         </w:tc>
@@ -2395,7 +2383,7 @@
               <w:jc w:val="both"/>
             </w:pPr>
             <w:r>
-              <w:t xml:space="preserve">Demand management: a facility holding a committed envelope and shedding on instruction is a demand-response resource; cap actuation settles in about 0.2 s at the card and the demonstration targets a 60-second facility ramp, the latency a system operator needs to weigh AI load as a fast-response resource on an isolated grid.</w:t>
+              <w:t xml:space="preserve">Demand management: a facility holding a committed envelope and shedding on instruction is a demand-response resource; cap actuation settles in about 0.2 s at the card and the demonstration targets a 60-second facility ramp, a response time within a demand-response window, letting a system operator on an isolated grid count AI load as reserve.</w:t>
             </w:r>
           </w:p>
         </w:tc>
@@ -2507,7 +2495,7 @@
         <w:t xml:space="preserve"> </w:t>
       </w:r>
       <w:r>
-        <w:t xml:space="preserve">settles in about 191 milliseconds. Under the per-instance-hour billing model analyzed in [1], the renter’s cost</w:t>
+        <w:t xml:space="preserve">settles in about 191 milliseconds, two orders of magnitude inside any demand-response ramp window. Under the per-instance-hour billing model analyzed in [1], the renter’s cost</w:t>
       </w:r>
       <w:r>
         <w:t xml:space="preserve"> </w:t>
@@ -2636,7 +2624,7 @@
         <w:t xml:space="preserve"> </w:t>
       </w:r>
       <w:r>
-        <w:t xml:space="preserve">On installed hardware, software control delivers 29 to 31 percent lower energy per task (measured) and 18 to 45 percent lower per served job (fleet simulation).</w:t>
+        <w:t xml:space="preserve">On installed hardware, with no new equipment, one software command delivers 29 to 31 percent lower energy per task (measured) and 18 to 45 percent lower per served job (fleet simulation).</w:t>
       </w:r>
     </w:p>
     <w:bookmarkEnd w:id="49"/>
@@ -2780,7 +2768,7 @@
               <w:jc w:val="both"/>
             </w:pPr>
             <w:r>
-              <w:t xml:space="preserve">Law fit R² ≥ 0.95 per sweep, below the measured 0.99 median [1], or deviation documented; JP located (or absence documented) per platform at board and node power</w:t>
+              <w:t xml:space="preserve">Law fit R² ≥ 0.95 per sweep (measured median 0.99 [1]); any platform where it fails is documented as a bounding result; JP located (or absence documented) per platform at board and node power</w:t>
             </w:r>
           </w:p>
         </w:tc>
@@ -2930,7 +2918,7 @@
               <w:jc w:val="both"/>
             </w:pPr>
             <w:r>
-              <w:t xml:space="preserve">Energy per served job and SLO compliance versus uncapped, static-cap and cap-only baselines; a pre-registered floor of at least 10 percent below cap-only at equal compliance (incremental gain over an already-capped fleet, not over full power); zero exceedance beyond the WP1 noise band in committed windows, transient violations (under 1 percent of epochs) reported</w:t>
+              <w:t xml:space="preserve">Energy per served job and SLO compliance versus uncapped, static-cap and cap-only baselines; a pre-registered floor of at least 10 percent below cap-only at equal compliance (incremental gain over an already-capped fleet, not over full power); zero exceedance beyond the WP1 noise band in committed windows, transient violations (under 1 percent of control intervals) reported</w:t>
             </w:r>
           </w:p>
         </w:tc>
@@ -2980,7 +2968,7 @@
               <w:jc w:val="both"/>
             </w:pPr>
             <w:r>
-              <w:t xml:space="preserve">Sheddable power as a fraction of the committed envelope (pre-registered floor: at least 15 percent within the ramp deadline at bounded SLO loss), measured on a BMC-metered server, projected to fleet scale in the twin; ramp within 60 seconds and recovery within 5 minutes, within a grid flexibility product's response window [19]; delivery-record compliance and service cost</w:t>
+              <w:t xml:space="preserve">Sheddable power as a fraction of the committed envelope (pre-registered floor: at least 15 percent within the ramp deadline at bounded SLO loss), measured on a BMC-metered server, projected to fleet scale in the twin; ramp within 60 seconds and recovery within 5 minutes, a response time compatible with the curtailment right proposed in the Authority's hearing [19]; delivery-record compliance and service cost</w:t>
             </w:r>
           </w:p>
         </w:tc>
@@ -2994,7 +2982,7 @@
               <w:jc w:val="both"/>
             </w:pPr>
             <w:r>
-              <w:t xml:space="preserve">M16–M21</w:t>
+              <w:t xml:space="preserve">M17–M21</w:t>
             </w:r>
           </w:p>
         </w:tc>
@@ -3625,7 +3613,7 @@
               <w:jc w:val="both"/>
             </w:pPr>
             <w:r>
-              <w:t xml:space="preserve">Out-of-band PSU telemetry (BMC/IPMI/Redfish) blocked on a rented server</w:t>
+              <w:t xml:space="preserve">Server-input power readout (BMC via IPMI/Redfish) blocked on a rented server</w:t>
             </w:r>
           </w:p>
         </w:tc>
@@ -3704,7 +3692,7 @@
         <w:t xml:space="preserve"> </w:t>
       </w:r>
       <w:r>
-        <w:t xml:space="preserve">The PI produced the measured foundation this project extends: study [1] built the ELF harness, ran ~5,500 instrumented measurements over 20 AI models and 4 GPU types, fitted the power law at median R² 0.99, located the JP and quantified the 29–31 percent energy cut; the dataset is public and the harness, models and simulator are running code that WP1–WP3 grow rather than create. The remaining packages draw on the PI's record of turning measurement into value: three decades of capacity and cost engineering (system-sizing that saved a large operator ~$10M) and patents in computationally efficient computing (CalexNet).</w:t>
+        <w:t xml:space="preserve">The project builds on the PI's own research: study [1] produced the ELF dataset, the power law and the Joule Point, and its harness, models and simulator are working code that WP1–WP3 extend. The PI's background fits the wider plan on both sides: an academic thread in energy-efficient AI, spanning energy-efficient remote-sensing measurement [24] and the recent CalexNet study of efficient inference in deep models [25]; and an industry thread in cost-aware AI systems and capacity-and-cost engineering, including system-sizing at Amdocs that contributed about $10M in savings. That mix of measurement-driven machine-learning research and cost-and-systems engineering is the expertise the work plan calls for.</w:t>
       </w:r>
     </w:p>
     <w:p>
@@ -3799,7 +3787,7 @@
       </w:r>
     </w:p>
     <w:bookmarkEnd w:id="56"/>
-    <w:bookmarkStart w:id="59" w:name="bibliography"/>
+    <w:bookmarkStart w:id="61" w:name="bibliography"/>
     <w:p>
       <w:pPr>
         <w:pStyle w:val="Heading2"/>
@@ -4527,8 +4515,94 @@
         <w:t xml:space="preserve">arXiv:2605.11999. https://arxiv.org/abs/2605.11999</w:t>
       </w:r>
     </w:p>
-    <w:bookmarkEnd w:id="59"/>
-    <w:bookmarkStart w:id="69" w:name="X5d5bc83c2eef3c669b01ea2354df53c4eb22d2f"/>
+    <w:p>
+      <w:pPr>
+        <w:pStyle w:val="Compact"/>
+        <w:numPr>
+          <w:ilvl w:val="0"/>
+          <w:numId w:val="1004"/>
+        </w:numPr>
+        <w:jc w:val="both"/>
+      </w:pPr>
+      <w:r>
+        <w:t xml:space="preserve">Apartsin, A., Cooper, L. N., and Intrator, N. (2014).</w:t>
+      </w:r>
+      <w:r>
+        <w:t xml:space="preserve"> </w:t>
+      </w:r>
+      <w:r>
+        <w:rPr>
+          <w:i/>
+          <w:iCs/>
+        </w:rPr>
+        <w:t xml:space="preserve">Energy-Efficient Time-of-Flight Estimation in the Presence of Outliers.</w:t>
+      </w:r>
+      <w:r>
+        <w:t xml:space="preserve"> </w:t>
+      </w:r>
+      <w:r>
+        <w:t xml:space="preserve">IEEE Journal of Selected Topics in Applied Earth Observations and Remote Sensing 7(4). DOI:</w:t>
+      </w:r>
+      <w:r>
+        <w:t xml:space="preserve"> </w:t>
+      </w:r>
+      <w:hyperlink r:id="rId59">
+        <w:r>
+          <w:rPr>
+            <w:rStyle w:val="Hyperlink"/>
+          </w:rPr>
+          <w:t xml:space="preserve">10.1109/JSTARS.2013.2295324</w:t>
+        </w:r>
+      </w:hyperlink>
+      <w:r>
+        <w:t xml:space="preserve">.</w:t>
+      </w:r>
+    </w:p>
+    <w:p>
+      <w:pPr>
+        <w:pStyle w:val="Compact"/>
+        <w:numPr>
+          <w:ilvl w:val="0"/>
+          <w:numId w:val="1004"/>
+        </w:numPr>
+        <w:jc w:val="both"/>
+      </w:pPr>
+      <w:r>
+        <w:t xml:space="preserve">Aperstein, Y. and Apartsin, A. (2026).</w:t>
+      </w:r>
+      <w:r>
+        <w:t xml:space="preserve"> </w:t>
+      </w:r>
+      <w:r>
+        <w:rPr>
+          <w:i/>
+          <w:iCs/>
+        </w:rPr>
+        <w:t xml:space="preserve">CalexNet: Soft Cascade-Aligned Training and Calibration for Lightweight Early-Exit Branches.</w:t>
+      </w:r>
+      <w:r>
+        <w:t xml:space="preserve"> </w:t>
+      </w:r>
+      <w:r>
+        <w:t xml:space="preserve">Electronics 15. DOI:</w:t>
+      </w:r>
+      <w:r>
+        <w:t xml:space="preserve"> </w:t>
+      </w:r>
+      <w:hyperlink r:id="rId60">
+        <w:r>
+          <w:rPr>
+            <w:rStyle w:val="Hyperlink"/>
+          </w:rPr>
+          <w:t xml:space="preserve">10.3390/electronics15102149</w:t>
+        </w:r>
+      </w:hyperlink>
+      <w:r>
+        <w:t xml:space="preserve">.</w:t>
+      </w:r>
+    </w:p>
+    <w:bookmarkEnd w:id="61"/>
+    <w:bookmarkStart w:id="71" w:name="X5d5bc83c2eef3c669b01ea2354df53c4eb22d2f"/>
     <w:p>
       <w:pPr>
         <w:pStyle w:val="Heading2"/>
@@ -4580,18 +4654,18 @@
           <wp:inline>
             <wp:extent cx="5727700" cy="1819068"/>
             <wp:effectExtent b="0" l="0" r="0" t="0"/>
-            <wp:docPr descr="The response law P(theta)=P0+a*theta^beta is a card property" title="" id="61" name="Picture"/>
+            <wp:docPr descr="The response law P(theta)=P0+a*theta^beta is a card property" title="" id="63" name="Picture"/>
             <a:graphic>
               <a:graphicData uri="http://schemas.openxmlformats.org/drawingml/2006/picture">
                 <pic:pic>
                   <pic:nvPicPr>
-                    <pic:cNvPr descr="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" id="62" name="Picture"/>
+                    <pic:cNvPr descr="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" id="64" name="Picture"/>
                     <pic:cNvPicPr>
                       <a:picLocks noChangeArrowheads="1" noChangeAspect="1"/>
                     </pic:cNvPicPr>
                   </pic:nvPicPr>
                   <pic:blipFill>
-                    <a:blip r:embed="rId60"/>
+                    <a:blip r:embed="rId62"/>
                     <a:stretch>
                       <a:fillRect/>
                     </a:stretch>
@@ -4768,18 +4842,18 @@
           <wp:inline>
             <wp:extent cx="5727700" cy="3953299"/>
             <wp:effectExtent b="0" l="0" r="0" t="0"/>
-            <wp:docPr descr="Energy per inference is U-shaped in the power cap; the minimum is the JP" title="" id="64" name="Picture"/>
+            <wp:docPr descr="Energy per inference is U-shaped in the power cap; the minimum is the JP" title="" id="66" name="Picture"/>
             <a:graphic>
               <a:graphicData uri="http://schemas.openxmlformats.org/drawingml/2006/picture">
                 <pic:pic>
                   <pic:nvPicPr>
-                    <pic:cNvPr descr="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" id="65" name="Picture"/>
+                    <pic:cNvPr descr="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" id="67" name="Picture"/>
                     <pic:cNvPicPr>
                       <a:picLocks noChangeArrowheads="1" noChangeAspect="1"/>
                     </pic:cNvPicPr>
                   </pic:nvPicPr>
                   <pic:blipFill>
-                    <a:blip r:embed="rId63"/>
+                    <a:blip r:embed="rId65"/>
                     <a:stretch>
                       <a:fillRect/>
                     </a:stretch>
@@ -4855,18 +4929,18 @@
           <wp:inline>
             <wp:extent cx="5727700" cy="3733460"/>
             <wp:effectExtent b="0" l="0" r="0" t="0"/>
-            <wp:docPr descr="Behind a fixed power feed, inferences per megawatt peak at the JP" title="" id="67" name="Picture"/>
+            <wp:docPr descr="Behind a fixed power feed, inferences per megawatt peak at the JP" title="" id="69" name="Picture"/>
             <a:graphic>
               <a:graphicData uri="http://schemas.openxmlformats.org/drawingml/2006/picture">
                 <pic:pic>
                   <pic:nvPicPr>
-                    <pic:cNvPr descr="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" id="68" name="Picture"/>
+                    <pic:cNvPr descr="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" id="70" name="Picture"/>
                     <pic:cNvPicPr>
                       <a:picLocks noChangeArrowheads="1" noChangeAspect="1"/>
                     </pic:cNvPicPr>
                   </pic:nvPicPr>
                   <pic:blipFill>
-                    <a:blip r:embed="rId66"/>
+                    <a:blip r:embed="rId68"/>
                     <a:stretch>
                       <a:fillRect/>
                     </a:stretch>
@@ -4926,8 +5000,8 @@
         <w:t xml:space="preserve">JP, near 5,500 installed cards, about 50 percent above the uncapped configuration. This is the capacity lever the Israel demonstration (WP4) operationalizes: under a rationed connection, efficiency becomes throughput. The same measured curves, allocated exactly across a fleet, dominate uncapped operation at every power budget from 100 down to 40 percent of total TDP; the preliminary measured-curve fleet simulation result appears in section 2.5.5.8.</w:t>
       </w:r>
     </w:p>
-    <w:bookmarkEnd w:id="69"/>
-    <w:bookmarkStart w:id="70" w:name="Xb70b95b8b38ded80618834689cadeac3dd55d32"/>
+    <w:bookmarkEnd w:id="71"/>
+    <w:bookmarkStart w:id="72" w:name="Xb70b95b8b38ded80618834689cadeac3dd55d32"/>
     <w:p>
       <w:pPr>
         <w:pStyle w:val="Heading2"/>
@@ -5246,8 +5320,8 @@
         <w:t xml:space="preserve">into something the regulator can contract with.</w:t>
       </w:r>
     </w:p>
-    <w:bookmarkEnd w:id="70"/>
-    <w:bookmarkStart w:id="71" w:name="X566e39577c3c04a5610748b5f031344b5e43f57"/>
+    <w:bookmarkEnd w:id="72"/>
+    <w:bookmarkStart w:id="73" w:name="X566e39577c3c04a5610748b5f031344b5e43f57"/>
     <w:p>
       <w:pPr>
         <w:pStyle w:val="Heading2"/>
@@ -5321,8 +5395,8 @@
         <w:t xml:space="preserve">Every milestone below carries a deliverable that is quantitative or at least judgeable, as §3.3 requires.</w:t>
       </w:r>
     </w:p>
-    <w:bookmarkEnd w:id="71"/>
-    <w:bookmarkStart w:id="72" w:name="schedule"/>
+    <w:bookmarkEnd w:id="73"/>
+    <w:bookmarkStart w:id="74" w:name="schedule"/>
     <w:p>
       <w:pPr>
         <w:pStyle w:val="Heading2"/>
@@ -7021,8 +7095,8 @@
         </w:tc>
       </w:tr>
     </w:tbl>
-    <w:bookmarkEnd w:id="72"/>
-    <w:bookmarkStart w:id="73" w:name="milestones-with-judgeable-outputs"/>
+    <w:bookmarkEnd w:id="74"/>
+    <w:bookmarkStart w:id="75" w:name="milestones-with-judgeable-outputs"/>
     <w:p>
       <w:pPr>
         <w:pStyle w:val="Heading2"/>
@@ -7507,8 +7581,8 @@
         <w:t xml:space="preserve">criteria, not as guaranteed confirmations.</w:t>
       </w:r>
     </w:p>
-    <w:bookmarkEnd w:id="73"/>
-    <w:bookmarkStart w:id="74" w:name="הערה-להזנה-במערכת-המקוונת"/>
+    <w:bookmarkEnd w:id="75"/>
+    <w:bookmarkStart w:id="76" w:name="הערה-להזנה-במערכת-המקוונת"/>
     <w:p>
       <w:pPr>
         <w:pStyle w:val="Heading2"/>
@@ -7550,8 +7624,8 @@
         <w:t xml:space="preserve">אבן דרך, ותפוקה למסירה, כמותית או לפחות בת שיפוט. הטבלאות שלמעלה נערכו בפורמט שניתן להעתיק ישירות לשדות המערכת.</w:t>
       </w:r>
     </w:p>
-    <w:bookmarkEnd w:id="74"/>
-    <w:bookmarkStart w:id="75" w:name="נספח-ג-מפרט-תקציבי-בעברית-לפי-נספח-טז"/>
+    <w:bookmarkEnd w:id="76"/>
+    <w:bookmarkStart w:id="77" w:name="נספח-ג-מפרט-תקציבי-בעברית-לפי-נספח-טז"/>
     <w:p>
       <w:pPr>
         <w:pStyle w:val="Heading2"/>
@@ -7630,8 +7704,8 @@
         <w:t xml:space="preserve">הנתונים למילוי הקובץ, לא תחליף לו.</w:t>
       </w:r>
     </w:p>
-    <w:bookmarkEnd w:id="75"/>
-    <w:bookmarkStart w:id="76" w:name="סיכום"/>
+    <w:bookmarkEnd w:id="77"/>
+    <w:bookmarkStart w:id="78" w:name="סיכום"/>
     <w:p>
       <w:pPr>
         <w:pStyle w:val="Heading2"/>
@@ -8131,8 +8205,8 @@
         </w:tc>
       </w:tr>
     </w:tbl>
-    <w:bookmarkEnd w:id="76"/>
-    <w:bookmarkStart w:id="77" w:name="בדיקת-עמידה-במגבלות-הקול-הקורא"/>
+    <w:bookmarkEnd w:id="78"/>
+    <w:bookmarkStart w:id="79" w:name="בדיקת-עמידה-במגבלות-הקול-הקורא"/>
     <w:p>
       <w:pPr>
         <w:pStyle w:val="Heading2"/>
@@ -8947,8 +9021,8 @@
         </w:tc>
       </w:tr>
     </w:tbl>
-    <w:bookmarkEnd w:id="77"/>
-    <w:bookmarkStart w:id="84" w:name="פירוט-לפי-סעיפים"/>
+    <w:bookmarkEnd w:id="79"/>
+    <w:bookmarkStart w:id="86" w:name="פירוט-לפי-סעיפים"/>
     <w:p>
       <w:pPr>
         <w:pStyle w:val="Heading2"/>
@@ -8965,7 +9039,7 @@
         <w:t xml:space="preserve">פירוט לפי סעיפים</w:t>
       </w:r>
     </w:p>
-    <w:bookmarkStart w:id="78" w:name="כוח-אדם"/>
+    <w:bookmarkStart w:id="80" w:name="כוח-אדם"/>
     <w:p>
       <w:pPr>
         <w:pStyle w:val="Heading3"/>
@@ -9219,8 +9293,8 @@
         <w:t xml:space="preserve">לתקרת ה-60%. בהיקף הנוכחי נותר מרחב של כ-2,810 ₪ בשנה בלבד עד תקרת התקציב השנתי.</w:t>
       </w:r>
     </w:p>
-    <w:bookmarkEnd w:id="78"/>
-    <w:bookmarkStart w:id="79" w:name="חומרים-אזילים-וציוד-מתכלה"/>
+    <w:bookmarkEnd w:id="80"/>
+    <w:bookmarkStart w:id="81" w:name="חומרים-אזילים-וציוד-מתכלה"/>
     <w:p>
       <w:pPr>
         <w:pStyle w:val="Heading3"/>
@@ -9321,8 +9395,8 @@
         </w:tc>
       </w:tr>
     </w:tbl>
-    <w:bookmarkEnd w:id="79"/>
-    <w:bookmarkStart w:id="80" w:name="ציוד"/>
+    <w:bookmarkEnd w:id="81"/>
+    <w:bookmarkStart w:id="82" w:name="ציוד"/>
     <w:p>
       <w:pPr>
         <w:pStyle w:val="Heading3"/>
@@ -9362,8 +9436,8 @@
         <w:t xml:space="preserve">המשרד אינו מכיר בציוד שנרכש לפני תחילת המחקר (§4.2), והתמורה עבור ציוד מחשוב היא עד 33% מערכו לכל שנת מחקר (§4.5). לכן גיוון החומרה מושג באמצעות שירותי מחשוב ענן ושרתים שכורים הנרשמים כקבלני משנה, והפרויקט אינו רוכש ציוד כלל.</w:t>
       </w:r>
     </w:p>
-    <w:bookmarkEnd w:id="80"/>
-    <w:bookmarkStart w:id="81" w:name="שונות"/>
+    <w:bookmarkEnd w:id="82"/>
+    <w:bookmarkStart w:id="83" w:name="שונות"/>
     <w:p>
       <w:pPr>
         <w:pStyle w:val="Heading3"/>
@@ -9521,8 +9595,8 @@
         </w:tc>
       </w:tr>
     </w:tbl>
-    <w:bookmarkEnd w:id="81"/>
-    <w:bookmarkStart w:id="82" w:name="קבלני-משנה-ועבודות-חוץ"/>
+    <w:bookmarkEnd w:id="83"/>
+    <w:bookmarkStart w:id="84" w:name="קבלני-משנה-ועבודות-חוץ"/>
     <w:p>
       <w:pPr>
         <w:pStyle w:val="Heading3"/>
@@ -10904,8 +10978,8 @@
         <w:t xml:space="preserve">הוא לב המחקר עצמו.</w:t>
       </w:r>
     </w:p>
-    <w:bookmarkEnd w:id="82"/>
-    <w:bookmarkStart w:id="83" w:name="תקורה"/>
+    <w:bookmarkEnd w:id="84"/>
+    <w:bookmarkStart w:id="85" w:name="תקורה"/>
     <w:p>
       <w:pPr>
         <w:pStyle w:val="Heading3"/>
@@ -10981,9 +11055,9 @@
         <w:t xml:space="preserve">המוסדית בפועל ואין צורך בהתאמה.</w:t>
       </w:r>
     </w:p>
-    <w:bookmarkEnd w:id="83"/>
-    <w:bookmarkEnd w:id="84"/>
-    <w:bookmarkStart w:id="85" w:name="הצהרות-נדרשות"/>
+    <w:bookmarkEnd w:id="85"/>
+    <w:bookmarkEnd w:id="86"/>
+    <w:bookmarkStart w:id="87" w:name="הצהרות-נדרשות"/>
     <w:p>
       <w:pPr>
         <w:pStyle w:val="Heading2"/>
@@ -11051,7 +11125,7 @@
         <w:t xml:space="preserve">עלות הכנת ההצעה חלה על המבקש בלבד (§1.5.3).</w:t>
       </w:r>
     </w:p>
-    <w:bookmarkEnd w:id="85"/>
+    <w:bookmarkEnd w:id="87"/>
     <w:sectPr>
       <w:pgSz w:h="16838" w:w="11906"/>
       <w:pgMar w:bottom="1440" w:left="1440" w:right="1440" w:top="1440"/>

</xml_diff>

<commit_message>
Sync live site: revised Hebrew abstract (call-aligned terminology, 300 words)
Co-Authored-By: Claude Opus 4.8 <noreply@anthropic.com>
</commit_message>
<xml_diff>
--- a/JouleFlex-proposal-2026-09-06.docx
+++ b/JouleFlex-proposal-2026-09-06.docx
@@ -301,7 +301,7 @@
         <w:rPr>
           <w:rtl/>
         </w:rPr>
-        <w:t xml:space="preserve">ביולי 2026 הקפיאה רשות החשמל בקשות חיבור חדשות של מרכזי נתונים לאחר שהתור הגיע ל-27,000 מגה-ואט. כאשר אספקת החשמל מוגבלת, מרכזי נתונים מכבים מעבדי GPU (מעבדי בינה מלאכותית) או קובעים להם תקרת הספק; ההחלטות מתקבלות בוואטים, ההספק הרגעי, ולא בג'ולים, האנרגיה הנצרכת. מעבד GPU תחת תקרת הספק מחשב לאט יותר וצורך את הספק הבסיס הקבוע שלו זמן ממושך יותר; לכן האנרגיה ליחידת חישוב מועיל עלולה לעלות אף שהמונה מציג פחות ואטים: פחות בינה מלאכותית לכל קילוואט-שעה. אתגר דומה קיים בתעופה, ושם הוא נפתר: קצב צריכת הדלק עולה מהר בהרבה מן המהירות, אך טיסה איטית שורפת דלק זמן רב יותר; לכן חברות התעופה משייטות במהירות הממזערת את צריכת הדלק לקילומטר.</w:t>
+        <w:t xml:space="preserve">ביולי 2026 הקפיאה רשות החשמל בקשות חיבור חדשות של חוות שרתים (מרכזי נתונים) לרשת החשמל, לאחר שהתור הגיע ל-27,000 מגה-ואט. כאשר אספקת החשמל מוגבלת, חוות שרתים מכבות מעבדי GPU או קובעות להם תקרת הספק, ומחליטות בוואטים (ההספק הרגעי) ולא בג'ולים (האנרגיה הנצרכת). מעבד GPU שתקרת ההספק שלו נמוכה מדי מחשב לאט יותר וצורך את הספק הסרק שלו לאורך זמן, ולכן האנרגיה ליחידת חישוב מועיל עולה אף שקריאת ההספק יורדת: פחות בינה מלאכותית לכל קילוואט-שעה. התעופה פתרה אתגר דומה: צריכת הדלק עולה מהר מן המהירות, אך טיסה איטית שורפת דלק זמן רב יותר, ולכן משייטים במהירות הממזערת דלק לקילומטר.</w:t>
       </w:r>
     </w:p>
     <w:p>
@@ -314,7 +314,7 @@
         <w:rPr>
           <w:rtl/>
         </w:rPr>
-        <w:t xml:space="preserve">מחקר שערך לאחרונה החוקר הראשי [1] מדד את יחסי הגומלין בין זמן להספק בעומסי בינה מלאכותית (5,500 מדידות, 20 מודלים, ארבעה מעבדי GPU). האנרגיה למשימה מתארת עקומת U כתלות בתקרת ההספק. בכרטיסים הגדולים נקודת המינימום שלה, נקודת הג'ול (Joule Point; JP), מצויה ב-43 עד 46 אחוזים מההספק הנקוב; החזקת כרטיס בנקודה זו הפחיתה את האנרגיה למשימה ב-29 עד 31 אחוזים בעוד זמן הריצה התארך פי 1.2. אף תחת מועד קשיח, הגבלת ההספק חסכה 28 אחוזים מהאנרגיה תוך שמירת 95 אחוזים מערך העבודה. סימולציית צי על העקומות שנמדדו (רק התזמון מדומה) סיפקה כמות עבודה שווה בצריכת אנרגיה נמוכה ב-18 עד 45 אחוזים.</w:t>
+        <w:t xml:space="preserve">מחקר שערך החוקר הראשי [1] מדד את הפשרה בין זמן להספק בעומסי עבודה של בינה מלאכותית (5,500 מדידות, 20 מודלים, ארבעה מעבדי GPU). האנרגיה למשימה מתארת עקומת U כתלות בתקרת ההספק. בדגמי ה-GPU הגדולים נקודת המינימום, נקודת הג'ול (Joule Point; JP), מצויה ב-43 עד 46 אחוזים מההספק הנקוב; הפעלת מעבד GPU בנקודה זו הפחיתה את האנרגיה למשימה ב-29 עד 31 אחוזים בעוד הריצה התארכה פי 1.2. אף תחת מגבלת זמן קשיחה, הגבלת ההספק חסכה 28 אחוזים מהאנרגיה תוך שמירת 95 אחוזים מערך העבודה. סימולציה של צי מעבדים על העקומות שנמדדו סיפקה עבודה שווה בצריכת אנרגיה נמוכה ב-18 עד 45 אחוזים: כ-50 אחוזים יותר עבודת בינה מלאכותית לכל מגה-ואט.</w:t>
       </w:r>
     </w:p>
     <w:p>
@@ -327,7 +327,7 @@
         <w:rPr>
           <w:rtl/>
         </w:rPr>
-        <w:t xml:space="preserve">תובנות אלה משנות את האופן שבו מתוכננים, מנוהלים ומתומחרים מרכזי נתונים לבינה מלאכותית, ומעלות החלטות שאף כלי קיים אינו תומך בהן: כיצד לתכנן צי מוכן-לחיבור-גמיש שכרטיסיו פועלים סמוך ל-JP; כיצד למדוד ולחזות את ה-JP עבור עבודות וכרטיסים חדשים; וכיצד לתמחר את השירות באופן המתמרץ לקוחות להתייעל, במקום החיוב השעתי המתגמל את נקודת ההפעלה הגרועה ביותר אנרגטית. כל אחת מהן היא בעיית מידול. הפרויקט יספק את ערכת התמיכה בהחלטות העונה על שלושתן, שתשוחרר עם מסד מדידות פתוח. צי הפועל סמוך ל-JP משחרר עתודת הספק זמינה לניצול עבור הסדר החיבור הגמיש של ישראל.</w:t>
+        <w:t xml:space="preserve">תובנות אלה משנות את תכנון, ניהול ותמחור חוות השרתים לבינה מלאכותית, ומעלות החלטות שאין להן כלי תומך: כיצד לתכנן צי המותאם להסדר חיבור גמיש שמעבדי ה-GPU שלו פועלים סמוך ל-JP; כיצד למדוד ולחזות את ה-JP עבור משימות ומעבדי GPU חדשים; וכיצד לתמחר את השירות כך שיתמרץ לקוחות להתייעלות באנרגיה, במקום חיוב שעתי המתגמל את נקודת ההפעלה הבזבזנית ביותר. כל אחת מהן היא בעיית מידול. הפרויקט יספק ערכת כלים תומכת החלטות העונה על שלושתן, שתשוחרר עם מאגר מדידות פתוח. צי הפועל סמוך ל-JP משחרר קיבולת חיבור הניתנת להפחתה עבור הסדר החיבור הגמיש של רשות החשמל.</w:t>
       </w:r>
     </w:p>
     <w:bookmarkEnd w:id="33"/>

</xml_diff>